<commit_message>
Upload the final report's part 1. Introduction
</commit_message>
<xml_diff>
--- a/Project Final Report/Assignment_Phase_2-Thanh_Tran-24247169.docx
+++ b/Project Final Report/Assignment_Phase_2-Thanh_Tran-24247169.docx
@@ -1,6 +1,6 @@
 
 <file path=word/document.xml><?xml version="1.0" encoding="utf-8"?>
-<w:document xmlns:wpc="http://schemas.microsoft.com/office/word/2010/wordprocessingCanvas" xmlns:cx="http://schemas.microsoft.com/office/drawing/2014/chartex" xmlns:cx1="http://schemas.microsoft.com/office/drawing/2015/9/8/chartex" xmlns:cx2="http://schemas.microsoft.com/office/drawing/2015/10/21/chartex" xmlns:cx3="http://schemas.microsoft.com/office/drawing/2016/5/9/chartex" xmlns:cx4="http://schemas.microsoft.com/office/drawing/2016/5/10/chartex" xmlns:cx5="http://schemas.microsoft.com/office/drawing/2016/5/11/chartex" xmlns:cx6="http://schemas.microsoft.com/office/drawing/2016/5/12/chartex" xmlns:cx7="http://schemas.microsoft.com/office/drawing/2016/5/13/chartex" xmlns:cx8="http://schemas.microsoft.com/office/drawing/2016/5/14/chartex" xmlns:mc="http://schemas.openxmlformats.org/markup-compatibility/2006" xmlns:aink="http://schemas.microsoft.com/office/drawing/2016/ink" xmlns:am3d="http://schemas.microsoft.com/office/drawing/2017/model3d" xmlns:o="urn:schemas-microsoft-com:office:office" xmlns:oel="http://schemas.microsoft.com/office/2019/extlst" xmlns:r="http://schemas.openxmlformats.org/officeDocument/2006/relationships" xmlns:m="http://schemas.openxmlformats.org/officeDocument/2006/math" xmlns:v="urn:schemas-microsoft-com:vml" xmlns:wp14="http://schemas.microsoft.com/office/word/2010/wordprocessingDrawing" xmlns:wp="http://schemas.openxmlformats.org/drawingml/2006/wordprocessingDrawing" xmlns:w10="urn:schemas-microsoft-com:office:word" xmlns:w="http://schemas.openxmlformats.org/wordprocessingml/2006/main" xmlns:w14="http://schemas.microsoft.com/office/word/2010/wordml" xmlns:w15="http://schemas.microsoft.com/office/word/2012/wordml" xmlns:w16cex="http://schemas.microsoft.com/office/word/2018/wordml/cex" xmlns:w16cid="http://schemas.microsoft.com/office/word/2016/wordml/cid" xmlns:w16="http://schemas.microsoft.com/office/word/2018/wordml" xmlns:w16sdtdh="http://schemas.microsoft.com/office/word/2020/wordml/sdtdatahash" xmlns:w16se="http://schemas.microsoft.com/office/word/2015/wordml/symex" xmlns:wpg="http://schemas.microsoft.com/office/word/2010/wordprocessingGroup" xmlns:wpi="http://schemas.microsoft.com/office/word/2010/wordprocessingInk" xmlns:wne="http://schemas.microsoft.com/office/word/2006/wordml" xmlns:wps="http://schemas.microsoft.com/office/word/2010/wordprocessingShape" mc:Ignorable="w14 w15 w16se w16cid w16 w16cex w16sdtdh wp14">
+<w:document xmlns:wpc="http://schemas.microsoft.com/office/word/2010/wordprocessingCanvas" xmlns:cx="http://schemas.microsoft.com/office/drawing/2014/chartex" xmlns:cx1="http://schemas.microsoft.com/office/drawing/2015/9/8/chartex" xmlns:cx2="http://schemas.microsoft.com/office/drawing/2015/10/21/chartex" xmlns:cx3="http://schemas.microsoft.com/office/drawing/2016/5/9/chartex" xmlns:cx4="http://schemas.microsoft.com/office/drawing/2016/5/10/chartex" xmlns:cx5="http://schemas.microsoft.com/office/drawing/2016/5/11/chartex" xmlns:cx6="http://schemas.microsoft.com/office/drawing/2016/5/12/chartex" xmlns:cx7="http://schemas.microsoft.com/office/drawing/2016/5/13/chartex" xmlns:cx8="http://schemas.microsoft.com/office/drawing/2016/5/14/chartex" xmlns:mc="http://schemas.openxmlformats.org/markup-compatibility/2006" xmlns:aink="http://schemas.microsoft.com/office/drawing/2016/ink" xmlns:am3d="http://schemas.microsoft.com/office/drawing/2017/model3d" xmlns:o="urn:schemas-microsoft-com:office:office" xmlns:oel="http://schemas.microsoft.com/office/2019/extlst" xmlns:r="http://schemas.openxmlformats.org/officeDocument/2006/relationships" xmlns:m="http://schemas.openxmlformats.org/officeDocument/2006/math" xmlns:v="urn:schemas-microsoft-com:vml" xmlns:wp14="http://schemas.microsoft.com/office/word/2010/wordprocessingDrawing" xmlns:wp="http://schemas.openxmlformats.org/drawingml/2006/wordprocessingDrawing" xmlns:w10="urn:schemas-microsoft-com:office:word" xmlns:w="http://schemas.openxmlformats.org/wordprocessingml/2006/main" xmlns:w14="http://schemas.microsoft.com/office/word/2010/wordml" xmlns:w15="http://schemas.microsoft.com/office/word/2012/wordml" xmlns:w16cex="http://schemas.microsoft.com/office/word/2018/wordml/cex" xmlns:w16cid="http://schemas.microsoft.com/office/word/2016/wordml/cid" xmlns:w16="http://schemas.microsoft.com/office/word/2018/wordml" xmlns:w16du="http://schemas.microsoft.com/office/word/2023/wordml/word16du" xmlns:w16sdtdh="http://schemas.microsoft.com/office/word/2020/wordml/sdtdatahash" xmlns:w16sdtfl="http://schemas.microsoft.com/office/word/2024/wordml/sdtformatlock" xmlns:w16se="http://schemas.microsoft.com/office/word/2015/wordml/symex" xmlns:wpg="http://schemas.microsoft.com/office/word/2010/wordprocessingGroup" xmlns:wpi="http://schemas.microsoft.com/office/word/2010/wordprocessingInk" xmlns:wne="http://schemas.microsoft.com/office/word/2006/wordml" xmlns:wps="http://schemas.microsoft.com/office/word/2010/wordprocessingShape" mc:Ignorable="w14 w15 w16se w16cid w16 w16cex w16sdtdh w16sdtfl w16du wp14">
   <w:body>
     <w:p>
       <w:pPr>
@@ -1070,7 +1070,6 @@
       <w:pPr>
         <w:spacing w:line="360" w:lineRule="auto"/>
         <w:ind w:left="284"/>
-        <w:contextualSpacing/>
         <w:jc w:val="both"/>
         <w:rPr>
           <w:rFonts w:ascii="Arial" w:hAnsi="Arial" w:cs="Arial"/>
@@ -1080,8 +1079,209 @@
         <w:rPr>
           <w:rFonts w:ascii="Arial" w:hAnsi="Arial" w:cs="Arial"/>
         </w:rPr>
-        <w:t>.</w:t>
+        <w:t>This report presents phase 2 of the Course Enrolment System for Auckland University of Technology (AUT), which extends and refines the system developed in phase 1. The project focuses on improving the system design through advanced UML modelling, design pattern application, and object-oriented refinement.</w:t>
       </w:r>
+    </w:p>
+    <w:p>
+      <w:pPr>
+        <w:spacing w:line="360" w:lineRule="auto"/>
+        <w:ind w:left="284"/>
+        <w:jc w:val="both"/>
+        <w:rPr>
+          <w:rFonts w:ascii="Arial" w:hAnsi="Arial" w:cs="Arial"/>
+        </w:rPr>
+      </w:pPr>
+      <w:r>
+        <w:rPr>
+          <w:rFonts w:ascii="Arial" w:hAnsi="Arial" w:cs="Arial"/>
+        </w:rPr>
+        <w:t xml:space="preserve">In phase 1, the system was analysed and designed based on the problems identified in AUT’s existing </w:t>
+      </w:r>
+      <w:r>
+        <w:rPr>
+          <w:rFonts w:ascii="Arial" w:hAnsi="Arial" w:cs="Arial"/>
+        </w:rPr>
+        <w:t>system</w:t>
+      </w:r>
+      <w:r>
+        <w:rPr>
+          <w:rFonts w:ascii="Arial" w:hAnsi="Arial" w:cs="Arial"/>
+        </w:rPr>
+        <w:t xml:space="preserve">. Organisational and system analysis were conducted to identify stakeholders, departments, business processes, system scope, boundaries, and assumptions. Requirements engineering techniques such as problem statement analysis, document analysis, workflow observation, and stakeholder interviews were then used to define the functional and non-functional requirements of the </w:t>
+      </w:r>
+      <w:r>
+        <w:rPr>
+          <w:rFonts w:ascii="Arial" w:hAnsi="Arial" w:cs="Arial"/>
+        </w:rPr>
+        <w:t>s</w:t>
+      </w:r>
+      <w:r>
+        <w:rPr>
+          <w:rFonts w:ascii="Arial" w:hAnsi="Arial" w:cs="Arial"/>
+        </w:rPr>
+        <w:t>ystem.</w:t>
+      </w:r>
+    </w:p>
+    <w:p>
+      <w:pPr>
+        <w:spacing w:line="360" w:lineRule="auto"/>
+        <w:ind w:left="284"/>
+        <w:jc w:val="both"/>
+        <w:rPr>
+          <w:rFonts w:ascii="Arial" w:hAnsi="Arial" w:cs="Arial"/>
+        </w:rPr>
+      </w:pPr>
+      <w:r>
+        <w:rPr>
+          <w:rFonts w:ascii="Arial" w:hAnsi="Arial" w:cs="Arial"/>
+        </w:rPr>
+        <w:t>After the requirements analysis, UML requirements modelling was performed using use case diagrams, use case descriptions, and actor–use case relationships to represent system functionality and stakeholder interactions. A</w:t>
+      </w:r>
+      <w:r>
+        <w:rPr>
+          <w:rFonts w:ascii="Arial" w:hAnsi="Arial" w:cs="Arial"/>
+        </w:rPr>
+        <w:t xml:space="preserve"> </w:t>
+      </w:r>
+      <w:r>
+        <w:rPr>
+          <w:rFonts w:ascii="Arial" w:hAnsi="Arial" w:cs="Arial"/>
+        </w:rPr>
+        <w:t>class diagram was then developed to model the system structure, including users, enrolment requests, courses, timetables, services, and external system interfaces. The design was also mapped into C# classes to support object-oriented implementation.</w:t>
+      </w:r>
+    </w:p>
+    <w:p>
+      <w:pPr>
+        <w:spacing w:line="360" w:lineRule="auto"/>
+        <w:ind w:left="284"/>
+        <w:jc w:val="both"/>
+        <w:rPr>
+          <w:rFonts w:ascii="Arial" w:hAnsi="Arial" w:cs="Arial"/>
+        </w:rPr>
+      </w:pPr>
+      <w:r>
+        <w:rPr>
+          <w:rFonts w:ascii="Arial" w:hAnsi="Arial" w:cs="Arial"/>
+        </w:rPr>
+        <w:t>Phase 1 also included a partial C# implementation of core classes such as User, Student,</w:t>
+      </w:r>
+      <w:r>
+        <w:rPr>
+          <w:rFonts w:ascii="Arial" w:hAnsi="Arial" w:cs="Arial"/>
+        </w:rPr>
+        <w:t xml:space="preserve"> Staff,</w:t>
+      </w:r>
+      <w:r>
+        <w:rPr>
+          <w:rFonts w:ascii="Arial" w:hAnsi="Arial" w:cs="Arial"/>
+        </w:rPr>
+        <w:t xml:space="preserve"> </w:t>
+      </w:r>
+      <w:proofErr w:type="spellStart"/>
+      <w:r>
+        <w:rPr>
+          <w:rFonts w:ascii="Arial" w:hAnsi="Arial" w:cs="Arial"/>
+        </w:rPr>
+        <w:t>RegistryStaff</w:t>
+      </w:r>
+      <w:proofErr w:type="spellEnd"/>
+      <w:r>
+        <w:rPr>
+          <w:rFonts w:ascii="Arial" w:hAnsi="Arial" w:cs="Arial"/>
+        </w:rPr>
+        <w:t xml:space="preserve">, Course, and </w:t>
+      </w:r>
+      <w:proofErr w:type="spellStart"/>
+      <w:r>
+        <w:rPr>
+          <w:rFonts w:ascii="Arial" w:hAnsi="Arial" w:cs="Arial"/>
+        </w:rPr>
+        <w:t>EnrolmentRequest</w:t>
+      </w:r>
+      <w:proofErr w:type="spellEnd"/>
+      <w:r>
+        <w:rPr>
+          <w:rFonts w:ascii="Arial" w:hAnsi="Arial" w:cs="Arial"/>
+        </w:rPr>
+        <w:t xml:space="preserve"> to demonstrate enrolment functions including course selection, enrolment submission, approval processing, and enrolment monitoring. Several design weaknesses were also identified, including dependency on external systems, risks of tight coupling, and possible performance issues during peak enrolment periods.</w:t>
+      </w:r>
+    </w:p>
+    <w:p>
+      <w:pPr>
+        <w:spacing w:line="360" w:lineRule="auto"/>
+        <w:ind w:left="284"/>
+        <w:jc w:val="both"/>
+        <w:rPr>
+          <w:rFonts w:ascii="Arial" w:hAnsi="Arial" w:cs="Arial"/>
+        </w:rPr>
+      </w:pPr>
+      <w:r>
+        <w:rPr>
+          <w:rFonts w:ascii="Arial" w:hAnsi="Arial" w:cs="Arial"/>
+        </w:rPr>
+        <w:t xml:space="preserve">Building on this foundation, phase 2 focuses on refining the system design to improve abstraction, cohesion, modularity, maintainability, and extensibility using additional UML models and </w:t>
+      </w:r>
+      <w:proofErr w:type="spellStart"/>
+      <w:r>
+        <w:rPr>
+          <w:rFonts w:ascii="Arial" w:hAnsi="Arial" w:cs="Arial"/>
+        </w:rPr>
+        <w:t>GoF</w:t>
+      </w:r>
+      <w:proofErr w:type="spellEnd"/>
+      <w:r>
+        <w:rPr>
+          <w:rFonts w:ascii="Arial" w:hAnsi="Arial" w:cs="Arial"/>
+        </w:rPr>
+        <w:t xml:space="preserve"> design patterns. The refined design is then implemented in C#</w:t>
+      </w:r>
+      <w:r>
+        <w:rPr>
+          <w:rFonts w:ascii="Arial" w:hAnsi="Arial" w:cs="Arial"/>
+        </w:rPr>
+        <w:t xml:space="preserve">. </w:t>
+      </w:r>
+      <w:r>
+        <w:rPr>
+          <w:rFonts w:ascii="Arial" w:hAnsi="Arial" w:cs="Arial"/>
+        </w:rPr>
+        <w:t>The project also continues to apply version control practices using GitHub throughout the development process</w:t>
+      </w:r>
+      <w:r>
+        <w:rPr>
+          <w:rFonts w:ascii="Arial" w:hAnsi="Arial" w:cs="Arial"/>
+        </w:rPr>
+        <w:t>. GitHub link:</w:t>
+      </w:r>
+      <w:r>
+        <w:rPr>
+          <w:rFonts w:ascii="Arial" w:hAnsi="Arial" w:cs="Arial"/>
+        </w:rPr>
+        <w:t xml:space="preserve"> </w:t>
+      </w:r>
+      <w:hyperlink r:id="rId9" w:history="1">
+        <w:r>
+          <w:rPr>
+            <w:rStyle w:val="Hyperlink"/>
+            <w:rFonts w:ascii="Arial" w:hAnsi="Arial" w:cs="Arial"/>
+          </w:rPr>
+          <w:t>https://github.com/Thanh526/Thanh-Tran---24247169---Project-Report</w:t>
+        </w:r>
+        <w:r>
+          <w:rPr>
+            <w:rStyle w:val="Hyperlink"/>
+            <w:rFonts w:ascii="Arial" w:hAnsi="Arial" w:cs="Arial"/>
+          </w:rPr>
+          <w:t>-</w:t>
+        </w:r>
+        <w:r>
+          <w:rPr>
+            <w:rStyle w:val="Hyperlink"/>
+            <w:rFonts w:ascii="Arial" w:hAnsi="Arial" w:cs="Arial"/>
+          </w:rPr>
+          <w:t>and-Presentation</w:t>
+        </w:r>
+      </w:hyperlink>
       <w:r>
         <w:rPr>
           <w:rFonts w:ascii="Arial" w:hAnsi="Arial" w:cs="Arial"/>
@@ -1119,6 +1319,7 @@
           <w:sz w:val="32"/>
           <w:szCs w:val="32"/>
         </w:rPr>
+        <w:lastRenderedPageBreak/>
         <w:t xml:space="preserve">Refined </w:t>
       </w:r>
       <w:r>
@@ -1242,6 +1443,7 @@
           <w:sz w:val="32"/>
           <w:szCs w:val="32"/>
         </w:rPr>
+        <w:lastRenderedPageBreak/>
         <w:t>Design Pattern Application</w:t>
       </w:r>
       <w:bookmarkEnd w:id="3"/>
@@ -1302,6 +1504,7 @@
           <w:sz w:val="32"/>
           <w:szCs w:val="32"/>
         </w:rPr>
+        <w:lastRenderedPageBreak/>
         <w:t>Comparative Design Analysis</w:t>
       </w:r>
       <w:bookmarkEnd w:id="4"/>
@@ -1361,6 +1564,7 @@
           <w:sz w:val="32"/>
           <w:szCs w:val="32"/>
         </w:rPr>
+        <w:lastRenderedPageBreak/>
         <w:t>Conclusion</w:t>
       </w:r>
       <w:bookmarkEnd w:id="5"/>
@@ -1480,7 +1684,7 @@
       </w:pPr>
     </w:p>
     <w:sectPr>
-      <w:footerReference w:type="default" r:id="rId9"/>
+      <w:footerReference w:type="default" r:id="rId10"/>
       <w:type w:val="continuous"/>
       <w:pgSz w:w="12240" w:h="15840"/>
       <w:pgMar w:top="1440" w:right="1440" w:bottom="1440" w:left="1440" w:header="708" w:footer="708" w:gutter="0"/>
@@ -1493,7 +1697,7 @@
 </file>
 
 <file path=word/endnotes.xml><?xml version="1.0" encoding="utf-8"?>
-<w:endnotes xmlns:wpc="http://schemas.microsoft.com/office/word/2010/wordprocessingCanvas" xmlns:cx="http://schemas.microsoft.com/office/drawing/2014/chartex" xmlns:cx1="http://schemas.microsoft.com/office/drawing/2015/9/8/chartex" xmlns:cx2="http://schemas.microsoft.com/office/drawing/2015/10/21/chartex" xmlns:cx3="http://schemas.microsoft.com/office/drawing/2016/5/9/chartex" xmlns:cx4="http://schemas.microsoft.com/office/drawing/2016/5/10/chartex" xmlns:cx5="http://schemas.microsoft.com/office/drawing/2016/5/11/chartex" xmlns:cx6="http://schemas.microsoft.com/office/drawing/2016/5/12/chartex" xmlns:cx7="http://schemas.microsoft.com/office/drawing/2016/5/13/chartex" xmlns:cx8="http://schemas.microsoft.com/office/drawing/2016/5/14/chartex" xmlns:mc="http://schemas.openxmlformats.org/markup-compatibility/2006" xmlns:aink="http://schemas.microsoft.com/office/drawing/2016/ink" xmlns:am3d="http://schemas.microsoft.com/office/drawing/2017/model3d" xmlns:o="urn:schemas-microsoft-com:office:office" xmlns:oel="http://schemas.microsoft.com/office/2019/extlst" xmlns:r="http://schemas.openxmlformats.org/officeDocument/2006/relationships" xmlns:m="http://schemas.openxmlformats.org/officeDocument/2006/math" xmlns:v="urn:schemas-microsoft-com:vml" xmlns:wp14="http://schemas.microsoft.com/office/word/2010/wordprocessingDrawing" xmlns:wp="http://schemas.openxmlformats.org/drawingml/2006/wordprocessingDrawing" xmlns:w10="urn:schemas-microsoft-com:office:word" xmlns:w="http://schemas.openxmlformats.org/wordprocessingml/2006/main" xmlns:w14="http://schemas.microsoft.com/office/word/2010/wordml" xmlns:w15="http://schemas.microsoft.com/office/word/2012/wordml" xmlns:w16cex="http://schemas.microsoft.com/office/word/2018/wordml/cex" xmlns:w16cid="http://schemas.microsoft.com/office/word/2016/wordml/cid" xmlns:w16="http://schemas.microsoft.com/office/word/2018/wordml" xmlns:w16sdtdh="http://schemas.microsoft.com/office/word/2020/wordml/sdtdatahash" xmlns:w16se="http://schemas.microsoft.com/office/word/2015/wordml/symex" xmlns:wpg="http://schemas.microsoft.com/office/word/2010/wordprocessingGroup" xmlns:wpi="http://schemas.microsoft.com/office/word/2010/wordprocessingInk" xmlns:wne="http://schemas.microsoft.com/office/word/2006/wordml" xmlns:wps="http://schemas.microsoft.com/office/word/2010/wordprocessingShape" mc:Ignorable="w14 w15 w16se w16cid w16 w16cex w16sdtdh wp14">
+<w:endnotes xmlns:wpc="http://schemas.microsoft.com/office/word/2010/wordprocessingCanvas" xmlns:cx="http://schemas.microsoft.com/office/drawing/2014/chartex" xmlns:cx1="http://schemas.microsoft.com/office/drawing/2015/9/8/chartex" xmlns:cx2="http://schemas.microsoft.com/office/drawing/2015/10/21/chartex" xmlns:cx3="http://schemas.microsoft.com/office/drawing/2016/5/9/chartex" xmlns:cx4="http://schemas.microsoft.com/office/drawing/2016/5/10/chartex" xmlns:cx5="http://schemas.microsoft.com/office/drawing/2016/5/11/chartex" xmlns:cx6="http://schemas.microsoft.com/office/drawing/2016/5/12/chartex" xmlns:cx7="http://schemas.microsoft.com/office/drawing/2016/5/13/chartex" xmlns:cx8="http://schemas.microsoft.com/office/drawing/2016/5/14/chartex" xmlns:mc="http://schemas.openxmlformats.org/markup-compatibility/2006" xmlns:aink="http://schemas.microsoft.com/office/drawing/2016/ink" xmlns:am3d="http://schemas.microsoft.com/office/drawing/2017/model3d" xmlns:o="urn:schemas-microsoft-com:office:office" xmlns:oel="http://schemas.microsoft.com/office/2019/extlst" xmlns:r="http://schemas.openxmlformats.org/officeDocument/2006/relationships" xmlns:m="http://schemas.openxmlformats.org/officeDocument/2006/math" xmlns:v="urn:schemas-microsoft-com:vml" xmlns:wp14="http://schemas.microsoft.com/office/word/2010/wordprocessingDrawing" xmlns:wp="http://schemas.openxmlformats.org/drawingml/2006/wordprocessingDrawing" xmlns:w10="urn:schemas-microsoft-com:office:word" xmlns:w="http://schemas.openxmlformats.org/wordprocessingml/2006/main" xmlns:w14="http://schemas.microsoft.com/office/word/2010/wordml" xmlns:w15="http://schemas.microsoft.com/office/word/2012/wordml" xmlns:w16cex="http://schemas.microsoft.com/office/word/2018/wordml/cex" xmlns:w16cid="http://schemas.microsoft.com/office/word/2016/wordml/cid" xmlns:w16="http://schemas.microsoft.com/office/word/2018/wordml" xmlns:w16du="http://schemas.microsoft.com/office/word/2023/wordml/word16du" xmlns:w16sdtdh="http://schemas.microsoft.com/office/word/2020/wordml/sdtdatahash" xmlns:w16sdtfl="http://schemas.microsoft.com/office/word/2024/wordml/sdtformatlock" xmlns:w16se="http://schemas.microsoft.com/office/word/2015/wordml/symex" xmlns:wpg="http://schemas.microsoft.com/office/word/2010/wordprocessingGroup" xmlns:wpi="http://schemas.microsoft.com/office/word/2010/wordprocessingInk" xmlns:wne="http://schemas.microsoft.com/office/word/2006/wordml" xmlns:wps="http://schemas.microsoft.com/office/word/2010/wordprocessingShape" mc:Ignorable="w14 w15 w16se w16cid w16 w16cex w16sdtdh w16sdtfl w16du wp14">
   <w:endnote w:type="separator" w:id="-1">
     <w:p>
       <w:pPr>
@@ -1518,7 +1722,7 @@
 </file>
 
 <file path=word/footer1.xml><?xml version="1.0" encoding="utf-8"?>
-<w:ftr xmlns:wpc="http://schemas.microsoft.com/office/word/2010/wordprocessingCanvas" xmlns:cx="http://schemas.microsoft.com/office/drawing/2014/chartex" xmlns:cx1="http://schemas.microsoft.com/office/drawing/2015/9/8/chartex" xmlns:cx2="http://schemas.microsoft.com/office/drawing/2015/10/21/chartex" xmlns:cx3="http://schemas.microsoft.com/office/drawing/2016/5/9/chartex" xmlns:cx4="http://schemas.microsoft.com/office/drawing/2016/5/10/chartex" xmlns:cx5="http://schemas.microsoft.com/office/drawing/2016/5/11/chartex" xmlns:cx6="http://schemas.microsoft.com/office/drawing/2016/5/12/chartex" xmlns:cx7="http://schemas.microsoft.com/office/drawing/2016/5/13/chartex" xmlns:cx8="http://schemas.microsoft.com/office/drawing/2016/5/14/chartex" xmlns:mc="http://schemas.openxmlformats.org/markup-compatibility/2006" xmlns:aink="http://schemas.microsoft.com/office/drawing/2016/ink" xmlns:am3d="http://schemas.microsoft.com/office/drawing/2017/model3d" xmlns:o="urn:schemas-microsoft-com:office:office" xmlns:oel="http://schemas.microsoft.com/office/2019/extlst" xmlns:r="http://schemas.openxmlformats.org/officeDocument/2006/relationships" xmlns:m="http://schemas.openxmlformats.org/officeDocument/2006/math" xmlns:v="urn:schemas-microsoft-com:vml" xmlns:wp14="http://schemas.microsoft.com/office/word/2010/wordprocessingDrawing" xmlns:wp="http://schemas.openxmlformats.org/drawingml/2006/wordprocessingDrawing" xmlns:w10="urn:schemas-microsoft-com:office:word" xmlns:w="http://schemas.openxmlformats.org/wordprocessingml/2006/main" xmlns:w14="http://schemas.microsoft.com/office/word/2010/wordml" xmlns:w15="http://schemas.microsoft.com/office/word/2012/wordml" xmlns:w16cex="http://schemas.microsoft.com/office/word/2018/wordml/cex" xmlns:w16cid="http://schemas.microsoft.com/office/word/2016/wordml/cid" xmlns:w16="http://schemas.microsoft.com/office/word/2018/wordml" xmlns:w16sdtdh="http://schemas.microsoft.com/office/word/2020/wordml/sdtdatahash" xmlns:w16se="http://schemas.microsoft.com/office/word/2015/wordml/symex" xmlns:wpg="http://schemas.microsoft.com/office/word/2010/wordprocessingGroup" xmlns:wpi="http://schemas.microsoft.com/office/word/2010/wordprocessingInk" xmlns:wne="http://schemas.microsoft.com/office/word/2006/wordml" xmlns:wps="http://schemas.microsoft.com/office/word/2010/wordprocessingShape" mc:Ignorable="w14 w15 w16se w16cid w16 w16cex w16sdtdh wp14">
+<w:ftr xmlns:wpc="http://schemas.microsoft.com/office/word/2010/wordprocessingCanvas" xmlns:cx="http://schemas.microsoft.com/office/drawing/2014/chartex" xmlns:cx1="http://schemas.microsoft.com/office/drawing/2015/9/8/chartex" xmlns:cx2="http://schemas.microsoft.com/office/drawing/2015/10/21/chartex" xmlns:cx3="http://schemas.microsoft.com/office/drawing/2016/5/9/chartex" xmlns:cx4="http://schemas.microsoft.com/office/drawing/2016/5/10/chartex" xmlns:cx5="http://schemas.microsoft.com/office/drawing/2016/5/11/chartex" xmlns:cx6="http://schemas.microsoft.com/office/drawing/2016/5/12/chartex" xmlns:cx7="http://schemas.microsoft.com/office/drawing/2016/5/13/chartex" xmlns:cx8="http://schemas.microsoft.com/office/drawing/2016/5/14/chartex" xmlns:mc="http://schemas.openxmlformats.org/markup-compatibility/2006" xmlns:aink="http://schemas.microsoft.com/office/drawing/2016/ink" xmlns:am3d="http://schemas.microsoft.com/office/drawing/2017/model3d" xmlns:o="urn:schemas-microsoft-com:office:office" xmlns:oel="http://schemas.microsoft.com/office/2019/extlst" xmlns:r="http://schemas.openxmlformats.org/officeDocument/2006/relationships" xmlns:m="http://schemas.openxmlformats.org/officeDocument/2006/math" xmlns:v="urn:schemas-microsoft-com:vml" xmlns:wp14="http://schemas.microsoft.com/office/word/2010/wordprocessingDrawing" xmlns:wp="http://schemas.openxmlformats.org/drawingml/2006/wordprocessingDrawing" xmlns:w10="urn:schemas-microsoft-com:office:word" xmlns:w="http://schemas.openxmlformats.org/wordprocessingml/2006/main" xmlns:w14="http://schemas.microsoft.com/office/word/2010/wordml" xmlns:w15="http://schemas.microsoft.com/office/word/2012/wordml" xmlns:w16cex="http://schemas.microsoft.com/office/word/2018/wordml/cex" xmlns:w16cid="http://schemas.microsoft.com/office/word/2016/wordml/cid" xmlns:w16="http://schemas.microsoft.com/office/word/2018/wordml" xmlns:w16du="http://schemas.microsoft.com/office/word/2023/wordml/word16du" xmlns:w16sdtdh="http://schemas.microsoft.com/office/word/2020/wordml/sdtdatahash" xmlns:w16sdtfl="http://schemas.microsoft.com/office/word/2024/wordml/sdtformatlock" xmlns:w16se="http://schemas.microsoft.com/office/word/2015/wordml/symex" xmlns:wpg="http://schemas.microsoft.com/office/word/2010/wordprocessingGroup" xmlns:wpi="http://schemas.microsoft.com/office/word/2010/wordprocessingInk" xmlns:wne="http://schemas.microsoft.com/office/word/2006/wordml" xmlns:wps="http://schemas.microsoft.com/office/word/2010/wordprocessingShape" mc:Ignorable="w14 w15 w16se w16cid w16 w16cex w16sdtdh w16sdtfl w16du wp14">
   <w:sdt>
     <w:sdtPr>
       <w:id w:val="-1232380231"/>
@@ -1527,7 +1731,6 @@
         <w:docPartUnique/>
       </w:docPartObj>
     </w:sdtPr>
-    <w:sdtEndPr/>
     <w:sdtContent>
       <w:sdt>
         <w:sdtPr>
@@ -1537,7 +1740,6 @@
             <w:docPartUnique/>
           </w:docPartObj>
         </w:sdtPr>
-        <w:sdtEndPr/>
         <w:sdtContent>
           <w:p>
             <w:pPr>
@@ -1607,7 +1809,7 @@
 </file>
 
 <file path=word/footnotes.xml><?xml version="1.0" encoding="utf-8"?>
-<w:footnotes xmlns:wpc="http://schemas.microsoft.com/office/word/2010/wordprocessingCanvas" xmlns:cx="http://schemas.microsoft.com/office/drawing/2014/chartex" xmlns:cx1="http://schemas.microsoft.com/office/drawing/2015/9/8/chartex" xmlns:cx2="http://schemas.microsoft.com/office/drawing/2015/10/21/chartex" xmlns:cx3="http://schemas.microsoft.com/office/drawing/2016/5/9/chartex" xmlns:cx4="http://schemas.microsoft.com/office/drawing/2016/5/10/chartex" xmlns:cx5="http://schemas.microsoft.com/office/drawing/2016/5/11/chartex" xmlns:cx6="http://schemas.microsoft.com/office/drawing/2016/5/12/chartex" xmlns:cx7="http://schemas.microsoft.com/office/drawing/2016/5/13/chartex" xmlns:cx8="http://schemas.microsoft.com/office/drawing/2016/5/14/chartex" xmlns:mc="http://schemas.openxmlformats.org/markup-compatibility/2006" xmlns:aink="http://schemas.microsoft.com/office/drawing/2016/ink" xmlns:am3d="http://schemas.microsoft.com/office/drawing/2017/model3d" xmlns:o="urn:schemas-microsoft-com:office:office" xmlns:oel="http://schemas.microsoft.com/office/2019/extlst" xmlns:r="http://schemas.openxmlformats.org/officeDocument/2006/relationships" xmlns:m="http://schemas.openxmlformats.org/officeDocument/2006/math" xmlns:v="urn:schemas-microsoft-com:vml" xmlns:wp14="http://schemas.microsoft.com/office/word/2010/wordprocessingDrawing" xmlns:wp="http://schemas.openxmlformats.org/drawingml/2006/wordprocessingDrawing" xmlns:w10="urn:schemas-microsoft-com:office:word" xmlns:w="http://schemas.openxmlformats.org/wordprocessingml/2006/main" xmlns:w14="http://schemas.microsoft.com/office/word/2010/wordml" xmlns:w15="http://schemas.microsoft.com/office/word/2012/wordml" xmlns:w16cex="http://schemas.microsoft.com/office/word/2018/wordml/cex" xmlns:w16cid="http://schemas.microsoft.com/office/word/2016/wordml/cid" xmlns:w16="http://schemas.microsoft.com/office/word/2018/wordml" xmlns:w16sdtdh="http://schemas.microsoft.com/office/word/2020/wordml/sdtdatahash" xmlns:w16se="http://schemas.microsoft.com/office/word/2015/wordml/symex" xmlns:wpg="http://schemas.microsoft.com/office/word/2010/wordprocessingGroup" xmlns:wpi="http://schemas.microsoft.com/office/word/2010/wordprocessingInk" xmlns:wne="http://schemas.microsoft.com/office/word/2006/wordml" xmlns:wps="http://schemas.microsoft.com/office/word/2010/wordprocessingShape" mc:Ignorable="w14 w15 w16se w16cid w16 w16cex w16sdtdh wp14">
+<w:footnotes xmlns:wpc="http://schemas.microsoft.com/office/word/2010/wordprocessingCanvas" xmlns:cx="http://schemas.microsoft.com/office/drawing/2014/chartex" xmlns:cx1="http://schemas.microsoft.com/office/drawing/2015/9/8/chartex" xmlns:cx2="http://schemas.microsoft.com/office/drawing/2015/10/21/chartex" xmlns:cx3="http://schemas.microsoft.com/office/drawing/2016/5/9/chartex" xmlns:cx4="http://schemas.microsoft.com/office/drawing/2016/5/10/chartex" xmlns:cx5="http://schemas.microsoft.com/office/drawing/2016/5/11/chartex" xmlns:cx6="http://schemas.microsoft.com/office/drawing/2016/5/12/chartex" xmlns:cx7="http://schemas.microsoft.com/office/drawing/2016/5/13/chartex" xmlns:cx8="http://schemas.microsoft.com/office/drawing/2016/5/14/chartex" xmlns:mc="http://schemas.openxmlformats.org/markup-compatibility/2006" xmlns:aink="http://schemas.microsoft.com/office/drawing/2016/ink" xmlns:am3d="http://schemas.microsoft.com/office/drawing/2017/model3d" xmlns:o="urn:schemas-microsoft-com:office:office" xmlns:oel="http://schemas.microsoft.com/office/2019/extlst" xmlns:r="http://schemas.openxmlformats.org/officeDocument/2006/relationships" xmlns:m="http://schemas.openxmlformats.org/officeDocument/2006/math" xmlns:v="urn:schemas-microsoft-com:vml" xmlns:wp14="http://schemas.microsoft.com/office/word/2010/wordprocessingDrawing" xmlns:wp="http://schemas.openxmlformats.org/drawingml/2006/wordprocessingDrawing" xmlns:w10="urn:schemas-microsoft-com:office:word" xmlns:w="http://schemas.openxmlformats.org/wordprocessingml/2006/main" xmlns:w14="http://schemas.microsoft.com/office/word/2010/wordml" xmlns:w15="http://schemas.microsoft.com/office/word/2012/wordml" xmlns:w16cex="http://schemas.microsoft.com/office/word/2018/wordml/cex" xmlns:w16cid="http://schemas.microsoft.com/office/word/2016/wordml/cid" xmlns:w16="http://schemas.microsoft.com/office/word/2018/wordml" xmlns:w16du="http://schemas.microsoft.com/office/word/2023/wordml/word16du" xmlns:w16sdtdh="http://schemas.microsoft.com/office/word/2020/wordml/sdtdatahash" xmlns:w16sdtfl="http://schemas.microsoft.com/office/word/2024/wordml/sdtformatlock" xmlns:w16se="http://schemas.microsoft.com/office/word/2015/wordml/symex" xmlns:wpg="http://schemas.microsoft.com/office/word/2010/wordprocessingGroup" xmlns:wpi="http://schemas.microsoft.com/office/word/2010/wordprocessingInk" xmlns:wne="http://schemas.microsoft.com/office/word/2006/wordml" xmlns:wps="http://schemas.microsoft.com/office/word/2010/wordprocessingShape" mc:Ignorable="w14 w15 w16se w16cid w16 w16cex w16sdtdh w16sdtfl w16du wp14">
   <w:footnote w:type="separator" w:id="-1">
     <w:p>
       <w:pPr>
@@ -1632,7 +1834,7 @@
 </file>
 
 <file path=word/numbering.xml><?xml version="1.0" encoding="utf-8"?>
-<w:numbering xmlns:wpc="http://schemas.microsoft.com/office/word/2010/wordprocessingCanvas" xmlns:cx="http://schemas.microsoft.com/office/drawing/2014/chartex" xmlns:cx1="http://schemas.microsoft.com/office/drawing/2015/9/8/chartex" xmlns:cx2="http://schemas.microsoft.com/office/drawing/2015/10/21/chartex" xmlns:cx3="http://schemas.microsoft.com/office/drawing/2016/5/9/chartex" xmlns:cx4="http://schemas.microsoft.com/office/drawing/2016/5/10/chartex" xmlns:cx5="http://schemas.microsoft.com/office/drawing/2016/5/11/chartex" xmlns:cx6="http://schemas.microsoft.com/office/drawing/2016/5/12/chartex" xmlns:cx7="http://schemas.microsoft.com/office/drawing/2016/5/13/chartex" xmlns:cx8="http://schemas.microsoft.com/office/drawing/2016/5/14/chartex" xmlns:mc="http://schemas.openxmlformats.org/markup-compatibility/2006" xmlns:aink="http://schemas.microsoft.com/office/drawing/2016/ink" xmlns:am3d="http://schemas.microsoft.com/office/drawing/2017/model3d" xmlns:o="urn:schemas-microsoft-com:office:office" xmlns:oel="http://schemas.microsoft.com/office/2019/extlst" xmlns:r="http://schemas.openxmlformats.org/officeDocument/2006/relationships" xmlns:m="http://schemas.openxmlformats.org/officeDocument/2006/math" xmlns:v="urn:schemas-microsoft-com:vml" xmlns:wp14="http://schemas.microsoft.com/office/word/2010/wordprocessingDrawing" xmlns:wp="http://schemas.openxmlformats.org/drawingml/2006/wordprocessingDrawing" xmlns:w10="urn:schemas-microsoft-com:office:word" xmlns:w="http://schemas.openxmlformats.org/wordprocessingml/2006/main" xmlns:w14="http://schemas.microsoft.com/office/word/2010/wordml" xmlns:w15="http://schemas.microsoft.com/office/word/2012/wordml" xmlns:w16cex="http://schemas.microsoft.com/office/word/2018/wordml/cex" xmlns:w16cid="http://schemas.microsoft.com/office/word/2016/wordml/cid" xmlns:w16="http://schemas.microsoft.com/office/word/2018/wordml" xmlns:w16sdtdh="http://schemas.microsoft.com/office/word/2020/wordml/sdtdatahash" xmlns:w16se="http://schemas.microsoft.com/office/word/2015/wordml/symex" xmlns:wpg="http://schemas.microsoft.com/office/word/2010/wordprocessingGroup" xmlns:wpi="http://schemas.microsoft.com/office/word/2010/wordprocessingInk" xmlns:wne="http://schemas.microsoft.com/office/word/2006/wordml" xmlns:wps="http://schemas.microsoft.com/office/word/2010/wordprocessingShape" mc:Ignorable="w14 w15 w16se w16cid w16 w16cex w16sdtdh wp14">
+<w:numbering xmlns:wpc="http://schemas.microsoft.com/office/word/2010/wordprocessingCanvas" xmlns:cx="http://schemas.microsoft.com/office/drawing/2014/chartex" xmlns:cx1="http://schemas.microsoft.com/office/drawing/2015/9/8/chartex" xmlns:cx2="http://schemas.microsoft.com/office/drawing/2015/10/21/chartex" xmlns:cx3="http://schemas.microsoft.com/office/drawing/2016/5/9/chartex" xmlns:cx4="http://schemas.microsoft.com/office/drawing/2016/5/10/chartex" xmlns:cx5="http://schemas.microsoft.com/office/drawing/2016/5/11/chartex" xmlns:cx6="http://schemas.microsoft.com/office/drawing/2016/5/12/chartex" xmlns:cx7="http://schemas.microsoft.com/office/drawing/2016/5/13/chartex" xmlns:cx8="http://schemas.microsoft.com/office/drawing/2016/5/14/chartex" xmlns:mc="http://schemas.openxmlformats.org/markup-compatibility/2006" xmlns:aink="http://schemas.microsoft.com/office/drawing/2016/ink" xmlns:am3d="http://schemas.microsoft.com/office/drawing/2017/model3d" xmlns:o="urn:schemas-microsoft-com:office:office" xmlns:oel="http://schemas.microsoft.com/office/2019/extlst" xmlns:r="http://schemas.openxmlformats.org/officeDocument/2006/relationships" xmlns:m="http://schemas.openxmlformats.org/officeDocument/2006/math" xmlns:v="urn:schemas-microsoft-com:vml" xmlns:wp14="http://schemas.microsoft.com/office/word/2010/wordprocessingDrawing" xmlns:wp="http://schemas.openxmlformats.org/drawingml/2006/wordprocessingDrawing" xmlns:w10="urn:schemas-microsoft-com:office:word" xmlns:w="http://schemas.openxmlformats.org/wordprocessingml/2006/main" xmlns:w14="http://schemas.microsoft.com/office/word/2010/wordml" xmlns:w15="http://schemas.microsoft.com/office/word/2012/wordml" xmlns:w16cex="http://schemas.microsoft.com/office/word/2018/wordml/cex" xmlns:w16cid="http://schemas.microsoft.com/office/word/2016/wordml/cid" xmlns:w16="http://schemas.microsoft.com/office/word/2018/wordml" xmlns:w16du="http://schemas.microsoft.com/office/word/2023/wordml/word16du" xmlns:w16sdtdh="http://schemas.microsoft.com/office/word/2020/wordml/sdtdatahash" xmlns:w16sdtfl="http://schemas.microsoft.com/office/word/2024/wordml/sdtformatlock" xmlns:w16se="http://schemas.microsoft.com/office/word/2015/wordml/symex" xmlns:wpg="http://schemas.microsoft.com/office/word/2010/wordprocessingGroup" xmlns:wpi="http://schemas.microsoft.com/office/word/2010/wordprocessingInk" xmlns:wne="http://schemas.microsoft.com/office/word/2006/wordml" xmlns:wps="http://schemas.microsoft.com/office/word/2010/wordprocessingShape" mc:Ignorable="w14 w15 w16se w16cid w16 w16cex w16sdtdh w16sdtfl w16du wp14">
   <w:abstractNum w:abstractNumId="0" w15:restartNumberingAfterBreak="0">
     <w:nsid w:val="00A147AC"/>
     <w:multiLevelType w:val="hybridMultilevel"/>
@@ -6198,7 +6400,7 @@
 </file>
 
 <file path=word/styles.xml><?xml version="1.0" encoding="utf-8"?>
-<w:styles xmlns:mc="http://schemas.openxmlformats.org/markup-compatibility/2006" xmlns:r="http://schemas.openxmlformats.org/officeDocument/2006/relationships" xmlns:w="http://schemas.openxmlformats.org/wordprocessingml/2006/main" xmlns:w14="http://schemas.microsoft.com/office/word/2010/wordml" xmlns:w15="http://schemas.microsoft.com/office/word/2012/wordml" xmlns:w16cex="http://schemas.microsoft.com/office/word/2018/wordml/cex" xmlns:w16cid="http://schemas.microsoft.com/office/word/2016/wordml/cid" xmlns:w16="http://schemas.microsoft.com/office/word/2018/wordml" xmlns:w16sdtdh="http://schemas.microsoft.com/office/word/2020/wordml/sdtdatahash" xmlns:w16se="http://schemas.microsoft.com/office/word/2015/wordml/symex" mc:Ignorable="w14 w15 w16se w16cid w16 w16cex w16sdtdh">
+<w:styles xmlns:mc="http://schemas.openxmlformats.org/markup-compatibility/2006" xmlns:r="http://schemas.openxmlformats.org/officeDocument/2006/relationships" xmlns:w="http://schemas.openxmlformats.org/wordprocessingml/2006/main" xmlns:w14="http://schemas.microsoft.com/office/word/2010/wordml" xmlns:w15="http://schemas.microsoft.com/office/word/2012/wordml" xmlns:w16cex="http://schemas.microsoft.com/office/word/2018/wordml/cex" xmlns:w16cid="http://schemas.microsoft.com/office/word/2016/wordml/cid" xmlns:w16="http://schemas.microsoft.com/office/word/2018/wordml" xmlns:w16du="http://schemas.microsoft.com/office/word/2023/wordml/word16du" xmlns:w16sdtdh="http://schemas.microsoft.com/office/word/2020/wordml/sdtdatahash" xmlns:w16sdtfl="http://schemas.microsoft.com/office/word/2024/wordml/sdtformatlock" xmlns:w16se="http://schemas.microsoft.com/office/word/2015/wordml/symex" mc:Ignorable="w14 w15 w16se w16cid w16 w16cex w16sdtdh w16sdtfl w16du">
   <w:docDefaults>
     <w:rPrDefault>
       <w:rPr>

</xml_diff>

<commit_message>
Upload the final report's sequence diagram part
</commit_message>
<xml_diff>
--- a/Project Final Report/Assignment_Phase_2-Thanh_Tran-24247169.docx
+++ b/Project Final Report/Assignment_Phase_2-Thanh_Tran-24247169.docx
@@ -1095,31 +1095,7 @@
         <w:rPr>
           <w:rFonts w:ascii="Arial" w:hAnsi="Arial" w:cs="Arial"/>
         </w:rPr>
-        <w:t xml:space="preserve">In phase 1, the system was analysed and designed based on the problems identified in AUT’s existing </w:t>
-      </w:r>
-      <w:r>
-        <w:rPr>
-          <w:rFonts w:ascii="Arial" w:hAnsi="Arial" w:cs="Arial"/>
-        </w:rPr>
-        <w:t>system</w:t>
-      </w:r>
-      <w:r>
-        <w:rPr>
-          <w:rFonts w:ascii="Arial" w:hAnsi="Arial" w:cs="Arial"/>
-        </w:rPr>
-        <w:t xml:space="preserve">. Organisational and system analysis were conducted to identify stakeholders, departments, business processes, system scope, boundaries, and assumptions. Requirements engineering techniques such as problem statement analysis, document analysis, workflow observation, and stakeholder interviews were then used to define the functional and non-functional requirements of the </w:t>
-      </w:r>
-      <w:r>
-        <w:rPr>
-          <w:rFonts w:ascii="Arial" w:hAnsi="Arial" w:cs="Arial"/>
-        </w:rPr>
-        <w:t>s</w:t>
-      </w:r>
-      <w:r>
-        <w:rPr>
-          <w:rFonts w:ascii="Arial" w:hAnsi="Arial" w:cs="Arial"/>
-        </w:rPr>
-        <w:t>ystem.</w:t>
+        <w:t>In phase 1, the system was analysed and designed based on the problems identified in AUT’s existing system. Organisational and system analysis were conducted to identify stakeholders, departments, business processes, system scope, boundaries, and assumptions. Requirements engineering techniques such as problem statement analysis, document analysis, workflow observation, and stakeholder interviews were then used to define the functional and non-functional requirements of the system.</w:t>
       </w:r>
     </w:p>
     <w:p>
@@ -1135,19 +1111,7 @@
         <w:rPr>
           <w:rFonts w:ascii="Arial" w:hAnsi="Arial" w:cs="Arial"/>
         </w:rPr>
-        <w:t>After the requirements analysis, UML requirements modelling was performed using use case diagrams, use case descriptions, and actor–use case relationships to represent system functionality and stakeholder interactions. A</w:t>
-      </w:r>
-      <w:r>
-        <w:rPr>
-          <w:rFonts w:ascii="Arial" w:hAnsi="Arial" w:cs="Arial"/>
-        </w:rPr>
-        <w:t xml:space="preserve"> </w:t>
-      </w:r>
-      <w:r>
-        <w:rPr>
-          <w:rFonts w:ascii="Arial" w:hAnsi="Arial" w:cs="Arial"/>
-        </w:rPr>
-        <w:t>class diagram was then developed to model the system structure, including users, enrolment requests, courses, timetables, services, and external system interfaces. The design was also mapped into C# classes to support object-oriented implementation.</w:t>
+        <w:t>After the requirements analysis, UML requirements modelling was performed using use case diagrams, use case descriptions, and actor–use case relationships to represent system functionality and stakeholder interactions. A class diagram was then developed to model the system structure, including users, enrolment requests, courses, timetables, services, and external system interfaces. The design was also mapped into C# classes to support object-oriented implementation.</w:t>
       </w:r>
     </w:p>
     <w:p>
@@ -1163,19 +1127,7 @@
         <w:rPr>
           <w:rFonts w:ascii="Arial" w:hAnsi="Arial" w:cs="Arial"/>
         </w:rPr>
-        <w:t>Phase 1 also included a partial C# implementation of core classes such as User, Student,</w:t>
-      </w:r>
-      <w:r>
-        <w:rPr>
-          <w:rFonts w:ascii="Arial" w:hAnsi="Arial" w:cs="Arial"/>
-        </w:rPr>
-        <w:t xml:space="preserve"> Staff,</w:t>
-      </w:r>
-      <w:r>
-        <w:rPr>
-          <w:rFonts w:ascii="Arial" w:hAnsi="Arial" w:cs="Arial"/>
-        </w:rPr>
-        <w:t xml:space="preserve"> </w:t>
+        <w:t xml:space="preserve">Phase 1 also included a partial C# implementation of core classes such as User, Student, Staff, </w:t>
       </w:r>
       <w:proofErr w:type="spellStart"/>
       <w:r>
@@ -1265,21 +1217,7 @@
             <w:rStyle w:val="Hyperlink"/>
             <w:rFonts w:ascii="Arial" w:hAnsi="Arial" w:cs="Arial"/>
           </w:rPr>
-          <w:t>https://github.com/Thanh526/Thanh-Tran---24247169---Project-Report</w:t>
-        </w:r>
-        <w:r>
-          <w:rPr>
-            <w:rStyle w:val="Hyperlink"/>
-            <w:rFonts w:ascii="Arial" w:hAnsi="Arial" w:cs="Arial"/>
-          </w:rPr>
-          <w:t>-</w:t>
-        </w:r>
-        <w:r>
-          <w:rPr>
-            <w:rStyle w:val="Hyperlink"/>
-            <w:rFonts w:ascii="Arial" w:hAnsi="Arial" w:cs="Arial"/>
-          </w:rPr>
-          <w:t>and-Presentation</w:t>
+          <w:t>https://github.com/Thanh526/Thanh-Tran---24247169---Project-Report-and-Presentation</w:t>
         </w:r>
       </w:hyperlink>
       <w:r>
@@ -1320,81 +1258,78 @@
           <w:szCs w:val="32"/>
         </w:rPr>
         <w:lastRenderedPageBreak/>
-        <w:t xml:space="preserve">Refined </w:t>
-      </w:r>
-      <w:r>
-        <w:rPr>
-          <w:rFonts w:ascii="Arial" w:hAnsi="Arial" w:cs="Arial"/>
-          <w:b/>
-          <w:bCs/>
-          <w:color w:val="EE0000"/>
-          <w:sz w:val="32"/>
-          <w:szCs w:val="32"/>
-        </w:rPr>
-        <w:t>s</w:t>
-      </w:r>
-      <w:r>
-        <w:rPr>
-          <w:rFonts w:ascii="Arial" w:hAnsi="Arial" w:cs="Arial"/>
-          <w:b/>
-          <w:bCs/>
-          <w:color w:val="EE0000"/>
-          <w:sz w:val="32"/>
-          <w:szCs w:val="32"/>
-        </w:rPr>
-        <w:t xml:space="preserve">tatic and </w:t>
-      </w:r>
-      <w:r>
-        <w:rPr>
-          <w:rFonts w:ascii="Arial" w:hAnsi="Arial" w:cs="Arial"/>
-          <w:b/>
-          <w:bCs/>
-          <w:color w:val="EE0000"/>
-          <w:sz w:val="32"/>
-          <w:szCs w:val="32"/>
-        </w:rPr>
-        <w:t>d</w:t>
-      </w:r>
-      <w:r>
-        <w:rPr>
-          <w:rFonts w:ascii="Arial" w:hAnsi="Arial" w:cs="Arial"/>
-          <w:b/>
-          <w:bCs/>
-          <w:color w:val="EE0000"/>
-          <w:sz w:val="32"/>
-          <w:szCs w:val="32"/>
-        </w:rPr>
-        <w:t xml:space="preserve">ynamic </w:t>
-      </w:r>
-      <w:r>
-        <w:rPr>
-          <w:rFonts w:ascii="Arial" w:hAnsi="Arial" w:cs="Arial"/>
-          <w:b/>
-          <w:bCs/>
-          <w:color w:val="EE0000"/>
-          <w:sz w:val="32"/>
-          <w:szCs w:val="32"/>
-        </w:rPr>
-        <w:t>m</w:t>
-      </w:r>
-      <w:r>
-        <w:rPr>
-          <w:rFonts w:ascii="Arial" w:hAnsi="Arial" w:cs="Arial"/>
-          <w:b/>
-          <w:bCs/>
-          <w:color w:val="EE0000"/>
-          <w:sz w:val="32"/>
-          <w:szCs w:val="32"/>
-        </w:rPr>
-        <w:t>odelling</w:t>
+        <w:t>Refined static and dynamic modelling</w:t>
       </w:r>
       <w:bookmarkEnd w:id="2"/>
     </w:p>
     <w:p>
       <w:pPr>
+        <w:pStyle w:val="Heading2"/>
+        <w:spacing w:before="0" w:line="360" w:lineRule="auto"/>
+        <w:ind w:left="284"/>
+        <w:jc w:val="both"/>
+        <w:rPr>
+          <w:rFonts w:ascii="Arial" w:hAnsi="Arial" w:cs="Arial"/>
+          <w:b/>
+          <w:bCs/>
+          <w:color w:val="EE0000"/>
+          <w:sz w:val="28"/>
+          <w:szCs w:val="28"/>
+        </w:rPr>
+      </w:pPr>
+      <w:bookmarkStart w:id="3" w:name="_Toc227531409"/>
+      <w:r>
+        <w:rPr>
+          <w:rFonts w:ascii="Arial" w:hAnsi="Arial" w:cs="Arial"/>
+          <w:b/>
+          <w:bCs/>
+          <w:color w:val="EE0000"/>
+          <w:sz w:val="28"/>
+          <w:szCs w:val="28"/>
+        </w:rPr>
+        <w:t>2</w:t>
+      </w:r>
+      <w:r>
+        <w:rPr>
+          <w:rFonts w:ascii="Arial" w:hAnsi="Arial" w:cs="Arial"/>
+          <w:b/>
+          <w:bCs/>
+          <w:color w:val="EE0000"/>
+          <w:sz w:val="28"/>
+          <w:szCs w:val="28"/>
+        </w:rPr>
+        <w:t xml:space="preserve">.1. </w:t>
+      </w:r>
+      <w:bookmarkEnd w:id="3"/>
+      <w:r>
+        <w:rPr>
+          <w:rFonts w:ascii="Arial" w:hAnsi="Arial" w:cs="Arial"/>
+          <w:b/>
+          <w:bCs/>
+          <w:color w:val="EE0000"/>
+          <w:sz w:val="28"/>
+          <w:szCs w:val="28"/>
+        </w:rPr>
+        <w:t xml:space="preserve">Sequence </w:t>
+      </w:r>
+      <w:proofErr w:type="spellStart"/>
+      <w:r>
+        <w:rPr>
+          <w:rFonts w:ascii="Arial" w:hAnsi="Arial" w:cs="Arial"/>
+          <w:b/>
+          <w:bCs/>
+          <w:color w:val="EE0000"/>
+          <w:sz w:val="28"/>
+          <w:szCs w:val="28"/>
+        </w:rPr>
+        <w:t>digram</w:t>
+      </w:r>
+      <w:proofErr w:type="spellEnd"/>
+    </w:p>
+    <w:p>
+      <w:pPr>
         <w:spacing w:line="360" w:lineRule="auto"/>
-        <w:ind w:left="284"/>
-        <w:contextualSpacing/>
+        <w:ind w:left="567"/>
         <w:jc w:val="both"/>
         <w:rPr>
           <w:rFonts w:ascii="Arial" w:hAnsi="Arial" w:cs="Arial"/>
@@ -1404,7 +1339,204 @@
         <w:rPr>
           <w:rFonts w:ascii="Arial" w:hAnsi="Arial" w:cs="Arial"/>
         </w:rPr>
+        <w:t>To represent the dynamic behaviour of the Course Enrolment System, sequence diagrams were developed. They illustrate how different system components interact to complete key business processes. Sequence diagrams provide a clearer representation of object interactions, message flow, system responsibilities, and communication between internal classes and external systems.</w:t>
+      </w:r>
+    </w:p>
+    <w:p>
+      <w:pPr>
+        <w:spacing w:line="360" w:lineRule="auto"/>
+        <w:ind w:left="567"/>
+        <w:jc w:val="both"/>
+        <w:rPr>
+          <w:rFonts w:ascii="Arial" w:hAnsi="Arial" w:cs="Arial"/>
+        </w:rPr>
+      </w:pPr>
+      <w:r>
+        <w:rPr>
+          <w:rFonts w:ascii="Arial" w:hAnsi="Arial" w:cs="Arial"/>
+        </w:rPr>
+        <w:t>Three key system scenarios were selected for modelling, including student login, course selection and enrolment submission, and enrolment review and approval by registry staff. These processes were chosen because they represent the main workflow of the Course Enrolment System and involve interactions between multiple users, system classes, services, and external systems.</w:t>
+      </w:r>
+    </w:p>
+    <w:p>
+      <w:pPr>
+        <w:spacing w:line="360" w:lineRule="auto"/>
+        <w:ind w:left="567"/>
+        <w:jc w:val="both"/>
+        <w:rPr>
+          <w:rFonts w:ascii="Arial" w:hAnsi="Arial" w:cs="Arial"/>
+        </w:rPr>
+      </w:pPr>
+      <w:r>
+        <w:rPr>
+          <w:rFonts w:ascii="Arial" w:hAnsi="Arial" w:cs="Arial"/>
+        </w:rPr>
+        <w:t xml:space="preserve">The first sequence diagram represents the student login process. It demonstrates how the student interacts with the User class to perform login authentication, where credential verification is completed internally before activity logging is recorded by </w:t>
+      </w:r>
+      <w:proofErr w:type="spellStart"/>
+      <w:r>
+        <w:rPr>
+          <w:rFonts w:ascii="Arial" w:hAnsi="Arial" w:cs="Arial"/>
+        </w:rPr>
+        <w:t>AuditService</w:t>
+      </w:r>
+      <w:proofErr w:type="spellEnd"/>
+      <w:r>
+        <w:rPr>
+          <w:rFonts w:ascii="Arial" w:hAnsi="Arial" w:cs="Arial"/>
+        </w:rPr>
+        <w:t>. After a successful login, the student can search, view, and select available courses.</w:t>
+      </w:r>
+    </w:p>
+    <w:p>
+      <w:pPr>
+        <w:spacing w:line="360" w:lineRule="auto"/>
+        <w:ind w:left="567"/>
+        <w:jc w:val="both"/>
+        <w:rPr>
+          <w:rFonts w:ascii="Arial" w:hAnsi="Arial" w:cs="Arial"/>
+        </w:rPr>
+      </w:pPr>
+      <w:r>
+        <w:rPr>
+          <w:rFonts w:ascii="Arial" w:hAnsi="Arial" w:cs="Arial"/>
+        </w:rPr>
+        <w:t>The second sequence diagram represents the course selection and enrolment submission process. It demonstrates how a student searches and views available courses before selecting a course based on availability. Once the student has selected the required courses</w:t>
+      </w:r>
+      <w:r>
+        <w:rPr>
+          <w:rFonts w:ascii="Arial" w:hAnsi="Arial" w:cs="Arial"/>
+        </w:rPr>
+        <w:t xml:space="preserve"> and submitted request</w:t>
+      </w:r>
+      <w:r>
+        <w:rPr>
+          <w:rFonts w:ascii="Arial" w:hAnsi="Arial" w:cs="Arial"/>
+        </w:rPr>
+        <w:t xml:space="preserve">, an </w:t>
+      </w:r>
+      <w:proofErr w:type="spellStart"/>
+      <w:r>
+        <w:rPr>
+          <w:rFonts w:ascii="Arial" w:hAnsi="Arial" w:cs="Arial"/>
+        </w:rPr>
+        <w:t>EnrolmentRequest</w:t>
+      </w:r>
+      <w:proofErr w:type="spellEnd"/>
+      <w:r>
+        <w:rPr>
+          <w:rFonts w:ascii="Arial" w:hAnsi="Arial" w:cs="Arial"/>
+        </w:rPr>
+        <w:t xml:space="preserve"> is created and submitted to the system. The enrolment request status is updated, and the activity is recorded by </w:t>
+      </w:r>
+      <w:proofErr w:type="spellStart"/>
+      <w:r>
+        <w:rPr>
+          <w:rFonts w:ascii="Arial" w:hAnsi="Arial" w:cs="Arial"/>
+        </w:rPr>
+        <w:t>AuditService</w:t>
+      </w:r>
+      <w:proofErr w:type="spellEnd"/>
+      <w:r>
+        <w:rPr>
+          <w:rFonts w:ascii="Arial" w:hAnsi="Arial" w:cs="Arial"/>
+        </w:rPr>
+        <w:t xml:space="preserve"> to support system tracking and accountability.</w:t>
+      </w:r>
+    </w:p>
+    <w:p>
+      <w:pPr>
+        <w:spacing w:line="360" w:lineRule="auto"/>
+        <w:ind w:left="567"/>
+        <w:jc w:val="both"/>
+        <w:rPr>
+          <w:rFonts w:ascii="Arial" w:hAnsi="Arial" w:cs="Arial"/>
+        </w:rPr>
+      </w:pPr>
+      <w:r>
+        <w:rPr>
+          <w:rFonts w:ascii="Arial" w:hAnsi="Arial" w:cs="Arial"/>
+        </w:rPr>
+        <w:t xml:space="preserve">The third sequence diagram represents the enrolment review and approval process performed by registry staff. It illustrates how </w:t>
+      </w:r>
+      <w:proofErr w:type="spellStart"/>
+      <w:r>
+        <w:rPr>
+          <w:rFonts w:ascii="Arial" w:hAnsi="Arial" w:cs="Arial"/>
+        </w:rPr>
+        <w:t>RegistryStaff</w:t>
+      </w:r>
+      <w:proofErr w:type="spellEnd"/>
+      <w:r>
+        <w:rPr>
+          <w:rFonts w:ascii="Arial" w:hAnsi="Arial" w:cs="Arial"/>
+        </w:rPr>
+        <w:t xml:space="preserve"> interacts with </w:t>
+      </w:r>
+      <w:proofErr w:type="spellStart"/>
+      <w:r>
+        <w:rPr>
+          <w:rFonts w:ascii="Arial" w:hAnsi="Arial" w:cs="Arial"/>
+        </w:rPr>
+        <w:t>IStudentInfoSystem</w:t>
+      </w:r>
+      <w:proofErr w:type="spellEnd"/>
+      <w:r>
+        <w:rPr>
+          <w:rFonts w:ascii="Arial" w:hAnsi="Arial" w:cs="Arial"/>
+        </w:rPr>
+        <w:t xml:space="preserve"> and </w:t>
+      </w:r>
+      <w:proofErr w:type="spellStart"/>
+      <w:r>
+        <w:rPr>
+          <w:rFonts w:ascii="Arial" w:hAnsi="Arial" w:cs="Arial"/>
+        </w:rPr>
+        <w:t>IFinanceSystem</w:t>
+      </w:r>
+      <w:proofErr w:type="spellEnd"/>
+      <w:r>
+        <w:rPr>
+          <w:rFonts w:ascii="Arial" w:hAnsi="Arial" w:cs="Arial"/>
+        </w:rPr>
+        <w:t xml:space="preserve"> to verify academic eligibility, payment status, and insurance requirements before making an approval decision. Based on </w:t>
+      </w:r>
+      <w:r>
+        <w:rPr>
+          <w:rFonts w:ascii="Arial" w:hAnsi="Arial" w:cs="Arial"/>
+        </w:rPr>
+        <w:lastRenderedPageBreak/>
+        <w:t xml:space="preserve">the verification result, the enrolment request can either be approved or rejected, and the decision is recorded through </w:t>
+      </w:r>
+      <w:proofErr w:type="spellStart"/>
+      <w:r>
+        <w:rPr>
+          <w:rFonts w:ascii="Arial" w:hAnsi="Arial" w:cs="Arial"/>
+        </w:rPr>
+        <w:t>AuditService</w:t>
+      </w:r>
+      <w:proofErr w:type="spellEnd"/>
+      <w:r>
+        <w:rPr>
+          <w:rFonts w:ascii="Arial" w:hAnsi="Arial" w:cs="Arial"/>
+        </w:rPr>
         <w:t>.</w:t>
+      </w:r>
+    </w:p>
+    <w:p>
+      <w:pPr>
+        <w:spacing w:line="360" w:lineRule="auto"/>
+        <w:ind w:left="567"/>
+        <w:jc w:val="both"/>
+        <w:rPr>
+          <w:rFonts w:ascii="Arial" w:hAnsi="Arial" w:cs="Arial"/>
+        </w:rPr>
+      </w:pPr>
+      <w:r>
+        <w:rPr>
+          <w:rFonts w:ascii="Arial" w:hAnsi="Arial" w:cs="Arial"/>
+        </w:rPr>
+        <w:t>These sequence diagrams provide a clearer understanding of the system workflow by showing message ordering, interaction flow, and responsibilities between classes and external systems. They also improve consistency between the UML models and the C# implementation of the Course Enrolment System.</w:t>
       </w:r>
       <w:r>
         <w:rPr>
@@ -1433,7 +1565,7 @@
           <w:szCs w:val="32"/>
         </w:rPr>
       </w:pPr>
-      <w:bookmarkStart w:id="3" w:name="_Toc229061203"/>
+      <w:bookmarkStart w:id="4" w:name="_Toc229061203"/>
       <w:r>
         <w:rPr>
           <w:rFonts w:ascii="Arial" w:hAnsi="Arial" w:cs="Arial"/>
@@ -1446,7 +1578,7 @@
         <w:lastRenderedPageBreak/>
         <w:t>Design Pattern Application</w:t>
       </w:r>
-      <w:bookmarkEnd w:id="3"/>
+      <w:bookmarkEnd w:id="4"/>
     </w:p>
     <w:p>
       <w:pPr>
@@ -1494,7 +1626,7 @@
           <w:szCs w:val="32"/>
         </w:rPr>
       </w:pPr>
-      <w:bookmarkStart w:id="4" w:name="_Toc229061204"/>
+      <w:bookmarkStart w:id="5" w:name="_Toc229061204"/>
       <w:r>
         <w:rPr>
           <w:rFonts w:ascii="Arial" w:hAnsi="Arial" w:cs="Arial"/>
@@ -1507,7 +1639,7 @@
         <w:lastRenderedPageBreak/>
         <w:t>Comparative Design Analysis</w:t>
       </w:r>
-      <w:bookmarkEnd w:id="4"/>
+      <w:bookmarkEnd w:id="5"/>
     </w:p>
     <w:p>
       <w:pPr>
@@ -1554,7 +1686,7 @@
           <w:szCs w:val="32"/>
         </w:rPr>
       </w:pPr>
-      <w:bookmarkStart w:id="5" w:name="_Toc229061205"/>
+      <w:bookmarkStart w:id="6" w:name="_Toc229061205"/>
       <w:r>
         <w:rPr>
           <w:rFonts w:ascii="Arial" w:hAnsi="Arial" w:cs="Arial"/>
@@ -1567,7 +1699,7 @@
         <w:lastRenderedPageBreak/>
         <w:t>Conclusion</w:t>
       </w:r>
-      <w:bookmarkEnd w:id="5"/>
+      <w:bookmarkEnd w:id="6"/>
     </w:p>
     <w:p>
       <w:pPr>
@@ -1633,7 +1765,7 @@
           <w:szCs w:val="32"/>
         </w:rPr>
       </w:pPr>
-      <w:bookmarkStart w:id="6" w:name="_Toc229061206"/>
+      <w:bookmarkStart w:id="7" w:name="_Toc229061206"/>
       <w:r>
         <w:rPr>
           <w:rFonts w:ascii="Arial" w:hAnsi="Arial" w:cs="Arial"/>
@@ -1646,7 +1778,7 @@
         <w:lastRenderedPageBreak/>
         <w:t>References</w:t>
       </w:r>
-      <w:bookmarkEnd w:id="6"/>
+      <w:bookmarkEnd w:id="7"/>
     </w:p>
     <w:p>
       <w:pPr>

</xml_diff>

<commit_message>
Upload the final report's activity diagram part
</commit_message>
<xml_diff>
--- a/Project Final Report/Assignment_Phase_2-Thanh_Tran-24247169.docx
+++ b/Project Final Report/Assignment_Phase_2-Thanh_Tran-24247169.docx
@@ -1127,35 +1127,7 @@
         <w:rPr>
           <w:rFonts w:ascii="Arial" w:hAnsi="Arial" w:cs="Arial"/>
         </w:rPr>
-        <w:t xml:space="preserve">Phase 1 also included a partial C# implementation of core classes such as User, Student, Staff, </w:t>
-      </w:r>
-      <w:proofErr w:type="spellStart"/>
-      <w:r>
-        <w:rPr>
-          <w:rFonts w:ascii="Arial" w:hAnsi="Arial" w:cs="Arial"/>
-        </w:rPr>
-        <w:t>RegistryStaff</w:t>
-      </w:r>
-      <w:proofErr w:type="spellEnd"/>
-      <w:r>
-        <w:rPr>
-          <w:rFonts w:ascii="Arial" w:hAnsi="Arial" w:cs="Arial"/>
-        </w:rPr>
-        <w:t xml:space="preserve">, Course, and </w:t>
-      </w:r>
-      <w:proofErr w:type="spellStart"/>
-      <w:r>
-        <w:rPr>
-          <w:rFonts w:ascii="Arial" w:hAnsi="Arial" w:cs="Arial"/>
-        </w:rPr>
-        <w:t>EnrolmentRequest</w:t>
-      </w:r>
-      <w:proofErr w:type="spellEnd"/>
-      <w:r>
-        <w:rPr>
-          <w:rFonts w:ascii="Arial" w:hAnsi="Arial" w:cs="Arial"/>
-        </w:rPr>
-        <w:t xml:space="preserve"> to demonstrate enrolment functions including course selection, enrolment submission, approval processing, and enrolment monitoring. Several design weaknesses were also identified, including dependency on external systems, risks of tight coupling, and possible performance issues during peak enrolment periods.</w:t>
+        <w:t>Phase 1 also included a partial C# implementation of core classes such as User, Student, Staff, RegistryStaff, Course, and EnrolmentRequest to demonstrate enrolment functions including course selection, enrolment submission, approval processing, and enrolment monitoring. Several design weaknesses were also identified, including dependency on external systems, risks of tight coupling, and possible performance issues during peak enrolment periods.</w:t>
       </w:r>
     </w:p>
     <w:p>
@@ -1171,21 +1143,7 @@
         <w:rPr>
           <w:rFonts w:ascii="Arial" w:hAnsi="Arial" w:cs="Arial"/>
         </w:rPr>
-        <w:t xml:space="preserve">Building on this foundation, phase 2 focuses on refining the system design to improve abstraction, cohesion, modularity, maintainability, and extensibility using additional UML models and </w:t>
-      </w:r>
-      <w:proofErr w:type="spellStart"/>
-      <w:r>
-        <w:rPr>
-          <w:rFonts w:ascii="Arial" w:hAnsi="Arial" w:cs="Arial"/>
-        </w:rPr>
-        <w:t>GoF</w:t>
-      </w:r>
-      <w:proofErr w:type="spellEnd"/>
-      <w:r>
-        <w:rPr>
-          <w:rFonts w:ascii="Arial" w:hAnsi="Arial" w:cs="Arial"/>
-        </w:rPr>
-        <w:t xml:space="preserve"> design patterns. The refined design is then implemented in C#</w:t>
+        <w:t>Building on this foundation, phase 2 focuses on refining the system design to improve abstraction, cohesion, modularity, maintainability, and extensibility using additional UML models and GoF design patterns. The refined design is then implemented in C#</w:t>
       </w:r>
       <w:r>
         <w:rPr>
@@ -1287,8 +1245,9 @@
           <w:sz w:val="28"/>
           <w:szCs w:val="28"/>
         </w:rPr>
-        <w:t>2</w:t>
+        <w:t xml:space="preserve">2.1. </w:t>
       </w:r>
+      <w:bookmarkEnd w:id="3"/>
       <w:r>
         <w:rPr>
           <w:rFonts w:ascii="Arial" w:hAnsi="Arial" w:cs="Arial"/>
@@ -1298,10 +1257,130 @@
           <w:sz w:val="28"/>
           <w:szCs w:val="28"/>
         </w:rPr>
-        <w:t xml:space="preserve">.1. </w:t>
+        <w:t>Sequence digram</w:t>
       </w:r>
-      <w:bookmarkEnd w:id="3"/>
+    </w:p>
+    <w:p>
+      <w:pPr>
+        <w:spacing w:line="360" w:lineRule="auto"/>
+        <w:ind w:left="567"/>
+        <w:jc w:val="both"/>
+        <w:rPr>
+          <w:rFonts w:ascii="Arial" w:hAnsi="Arial" w:cs="Arial"/>
+        </w:rPr>
+      </w:pPr>
       <w:r>
+        <w:rPr>
+          <w:rFonts w:ascii="Arial" w:hAnsi="Arial" w:cs="Arial"/>
+        </w:rPr>
+        <w:t>To represent the dynamic behaviour of the Course Enrolment System, sequence diagrams were developed. They illustrate how different system components interact to complete key business processes. Sequence diagrams provide a clearer representation of object interactions, message flow, system responsibilities, and communication between internal classes and external systems.</w:t>
+      </w:r>
+    </w:p>
+    <w:p>
+      <w:pPr>
+        <w:spacing w:line="360" w:lineRule="auto"/>
+        <w:ind w:left="567"/>
+        <w:jc w:val="both"/>
+        <w:rPr>
+          <w:rFonts w:ascii="Arial" w:hAnsi="Arial" w:cs="Arial"/>
+        </w:rPr>
+      </w:pPr>
+      <w:r>
+        <w:rPr>
+          <w:rFonts w:ascii="Arial" w:hAnsi="Arial" w:cs="Arial"/>
+        </w:rPr>
+        <w:t>Three key system scenarios were selected for modelling, including student login, course selection and enrolment submission, and enrolment review and approval by registry staff. These processes were chosen because they represent the main workflow of the Course Enrolment System and involve interactions between multiple users, system classes, services, and external systems.</w:t>
+      </w:r>
+    </w:p>
+    <w:p>
+      <w:pPr>
+        <w:spacing w:line="360" w:lineRule="auto"/>
+        <w:ind w:left="567"/>
+        <w:jc w:val="both"/>
+        <w:rPr>
+          <w:rFonts w:ascii="Arial" w:hAnsi="Arial" w:cs="Arial"/>
+        </w:rPr>
+      </w:pPr>
+      <w:r>
+        <w:rPr>
+          <w:rFonts w:ascii="Arial" w:hAnsi="Arial" w:cs="Arial"/>
+        </w:rPr>
+        <w:t>The first sequence diagram represents the student login process. It demonstrates how the student interacts with the User class to perform login authentication, where credential verification is completed internally before activity logging is recorded by AuditService. After a successful login, the student can search, view, and select available courses.</w:t>
+      </w:r>
+    </w:p>
+    <w:p>
+      <w:pPr>
+        <w:spacing w:line="360" w:lineRule="auto"/>
+        <w:ind w:left="567"/>
+        <w:jc w:val="both"/>
+        <w:rPr>
+          <w:rFonts w:ascii="Arial" w:hAnsi="Arial" w:cs="Arial"/>
+        </w:rPr>
+      </w:pPr>
+      <w:r>
+        <w:rPr>
+          <w:rFonts w:ascii="Arial" w:hAnsi="Arial" w:cs="Arial"/>
+        </w:rPr>
+        <w:t>The second sequence diagram represents the course selection and enrolment submission process. It demonstrates how a student searches and views available courses before selecting a course based on availability. Once the student has selected the required courses</w:t>
+      </w:r>
+      <w:r>
+        <w:rPr>
+          <w:rFonts w:ascii="Arial" w:hAnsi="Arial" w:cs="Arial"/>
+        </w:rPr>
+        <w:t xml:space="preserve"> and submitted request</w:t>
+      </w:r>
+      <w:r>
+        <w:rPr>
+          <w:rFonts w:ascii="Arial" w:hAnsi="Arial" w:cs="Arial"/>
+        </w:rPr>
+        <w:t>, an EnrolmentRequest is created and submitted to the system. The enrolment request status is updated, and the activity is recorded by AuditService to support system tracking and accountability.</w:t>
+      </w:r>
+    </w:p>
+    <w:p>
+      <w:pPr>
+        <w:spacing w:line="360" w:lineRule="auto"/>
+        <w:ind w:left="567"/>
+        <w:jc w:val="both"/>
+        <w:rPr>
+          <w:rFonts w:ascii="Arial" w:hAnsi="Arial" w:cs="Arial"/>
+        </w:rPr>
+      </w:pPr>
+      <w:r>
+        <w:rPr>
+          <w:rFonts w:ascii="Arial" w:hAnsi="Arial" w:cs="Arial"/>
+        </w:rPr>
+        <w:t xml:space="preserve">The third sequence diagram represents the enrolment review and approval process performed by registry staff. It illustrates how RegistryStaff interacts with IStudentInfoSystem and IFinanceSystem to verify academic eligibility, payment status, and insurance requirements before making an approval decision. Based on </w:t>
+      </w:r>
+      <w:r>
+        <w:rPr>
+          <w:rFonts w:ascii="Arial" w:hAnsi="Arial" w:cs="Arial"/>
+        </w:rPr>
+        <w:lastRenderedPageBreak/>
+        <w:t>the verification result, the enrolment request can either be approved or rejected, and the decision is recorded through AuditService.</w:t>
+      </w:r>
+    </w:p>
+    <w:p>
+      <w:pPr>
+        <w:spacing w:line="360" w:lineRule="auto"/>
+        <w:ind w:left="567"/>
+        <w:jc w:val="both"/>
+        <w:rPr>
+          <w:rFonts w:ascii="Arial" w:hAnsi="Arial" w:cs="Arial"/>
+        </w:rPr>
+      </w:pPr>
+      <w:r>
+        <w:rPr>
+          <w:rFonts w:ascii="Arial" w:hAnsi="Arial" w:cs="Arial"/>
+        </w:rPr>
+        <w:t>These sequence diagrams provide a clearer understanding of the system workflow by showing message ordering, interaction flow, and responsibilities between classes and external systems. They also improve consistency between the UML models and the C# implementation of the Course Enrolment System.</w:t>
+      </w:r>
+    </w:p>
+    <w:p>
+      <w:pPr>
+        <w:pStyle w:val="Heading2"/>
+        <w:spacing w:before="0" w:line="360" w:lineRule="auto"/>
+        <w:ind w:left="284"/>
+        <w:jc w:val="both"/>
         <w:rPr>
           <w:rFonts w:ascii="Arial" w:hAnsi="Arial" w:cs="Arial"/>
           <w:b/>
@@ -1310,9 +1389,7 @@
           <w:sz w:val="28"/>
           <w:szCs w:val="28"/>
         </w:rPr>
-        <w:t xml:space="preserve">Sequence </w:t>
-      </w:r>
-      <w:proofErr w:type="spellStart"/>
+      </w:pPr>
       <w:r>
         <w:rPr>
           <w:rFonts w:ascii="Arial" w:hAnsi="Arial" w:cs="Arial"/>
@@ -1322,9 +1399,30 @@
           <w:sz w:val="28"/>
           <w:szCs w:val="28"/>
         </w:rPr>
-        <w:t>digram</w:t>
+        <w:t xml:space="preserve">2.1. </w:t>
       </w:r>
-      <w:proofErr w:type="spellEnd"/>
+      <w:r>
+        <w:rPr>
+          <w:rFonts w:ascii="Arial" w:hAnsi="Arial" w:cs="Arial"/>
+          <w:b/>
+          <w:bCs/>
+          <w:color w:val="EE0000"/>
+          <w:sz w:val="28"/>
+          <w:szCs w:val="28"/>
+        </w:rPr>
+        <w:t>Activity</w:t>
+      </w:r>
+      <w:r>
+        <w:rPr>
+          <w:rFonts w:ascii="Arial" w:hAnsi="Arial" w:cs="Arial"/>
+          <w:b/>
+          <w:bCs/>
+          <w:color w:val="EE0000"/>
+          <w:sz w:val="28"/>
+          <w:szCs w:val="28"/>
+        </w:rPr>
+        <w:t xml:space="preserve"> digram</w:t>
+      </w:r>
     </w:p>
     <w:p>
       <w:pPr>
@@ -1339,7 +1437,7 @@
         <w:rPr>
           <w:rFonts w:ascii="Arial" w:hAnsi="Arial" w:cs="Arial"/>
         </w:rPr>
-        <w:t>To represent the dynamic behaviour of the Course Enrolment System, sequence diagrams were developed. They illustrate how different system components interact to complete key business processes. Sequence diagrams provide a clearer representation of object interactions, message flow, system responsibilities, and communication between internal classes and external systems.</w:t>
+        <w:t>To further represent the dynamic behaviour of the Course Enrolment System, activity diagrams were developed to model the workflow of major system processes. Unlike sequence diagrams, which focus on object interactions and message flow, activity diagrams provide a clearer representation of process flow, decision making, and responsibility allocation between different system components and external systems. Swimlanes were used to improve readability and clearly separate responsibilities between users, internal system components, and supporting services.</w:t>
       </w:r>
     </w:p>
     <w:p>
@@ -1355,7 +1453,7 @@
         <w:rPr>
           <w:rFonts w:ascii="Arial" w:hAnsi="Arial" w:cs="Arial"/>
         </w:rPr>
-        <w:t>Three key system scenarios were selected for modelling, including student login, course selection and enrolment submission, and enrolment review and approval by registry staff. These processes were chosen because they represent the main workflow of the Course Enrolment System and involve interactions between multiple users, system classes, services, and external systems.</w:t>
+        <w:t>The first activity diagram represents the student course enrolment process. It models the workflow beginning from student login, course searching, viewing course information, selecting available courses, and submitting an enrolment request. Decision nodes were included to represent important business rules, such as login validation and course availability checking. If a course has reached full capacity, the student is required to select another course. After the enrolment request is submitted, the system creates an enrolment request with a pending status and records the activity through the AuditService. This diagram demonstrates how students interact with the system to complete the enrolment process while ensuring validation and tracking are performed.</w:t>
       </w:r>
     </w:p>
     <w:p>
@@ -1371,21 +1469,14 @@
         <w:rPr>
           <w:rFonts w:ascii="Arial" w:hAnsi="Arial" w:cs="Arial"/>
         </w:rPr>
-        <w:t xml:space="preserve">The first sequence diagram represents the student login process. It demonstrates how the student interacts with the User class to perform login authentication, where credential verification is completed internally before activity logging is recorded by </w:t>
+        <w:t xml:space="preserve">The second activity diagram represents the registry staff enrolment review and approval process. It illustrates how registry staff monitor enrolment requests, review student details, and perform eligibility checks through external systems such as IStudentInfoSystem and IFinanceSystem. Decision points are used to determine </w:t>
       </w:r>
-      <w:proofErr w:type="spellStart"/>
       <w:r>
         <w:rPr>
           <w:rFonts w:ascii="Arial" w:hAnsi="Arial" w:cs="Arial"/>
         </w:rPr>
-        <w:t>AuditService</w:t>
-      </w:r>
-      <w:proofErr w:type="spellEnd"/>
-      <w:r>
-        <w:rPr>
-          <w:rFonts w:ascii="Arial" w:hAnsi="Arial" w:cs="Arial"/>
-        </w:rPr>
-        <w:t>. After a successful login, the student can search, view, and select available courses.</w:t>
+        <w:lastRenderedPageBreak/>
+        <w:t>whether the student meets enrolment requirements, including academic eligibility, payment status, and insurance verification. Based on the outcome, the enrolment request is either approved or rejected, and the final action is recorded through the AuditService. This diagram helps demonstrate how the system supports staff decision-making while coordinating interactions between multiple system components and external services.</w:t>
       </w:r>
     </w:p>
     <w:p>
@@ -1401,142 +1492,7 @@
         <w:rPr>
           <w:rFonts w:ascii="Arial" w:hAnsi="Arial" w:cs="Arial"/>
         </w:rPr>
-        <w:t>The second sequence diagram represents the course selection and enrolment submission process. It demonstrates how a student searches and views available courses before selecting a course based on availability. Once the student has selected the required courses</w:t>
-      </w:r>
-      <w:r>
-        <w:rPr>
-          <w:rFonts w:ascii="Arial" w:hAnsi="Arial" w:cs="Arial"/>
-        </w:rPr>
-        <w:t xml:space="preserve"> and submitted request</w:t>
-      </w:r>
-      <w:r>
-        <w:rPr>
-          <w:rFonts w:ascii="Arial" w:hAnsi="Arial" w:cs="Arial"/>
-        </w:rPr>
-        <w:t xml:space="preserve">, an </w:t>
-      </w:r>
-      <w:proofErr w:type="spellStart"/>
-      <w:r>
-        <w:rPr>
-          <w:rFonts w:ascii="Arial" w:hAnsi="Arial" w:cs="Arial"/>
-        </w:rPr>
-        <w:t>EnrolmentRequest</w:t>
-      </w:r>
-      <w:proofErr w:type="spellEnd"/>
-      <w:r>
-        <w:rPr>
-          <w:rFonts w:ascii="Arial" w:hAnsi="Arial" w:cs="Arial"/>
-        </w:rPr>
-        <w:t xml:space="preserve"> is created and submitted to the system. The enrolment request status is updated, and the activity is recorded by </w:t>
-      </w:r>
-      <w:proofErr w:type="spellStart"/>
-      <w:r>
-        <w:rPr>
-          <w:rFonts w:ascii="Arial" w:hAnsi="Arial" w:cs="Arial"/>
-        </w:rPr>
-        <w:t>AuditService</w:t>
-      </w:r>
-      <w:proofErr w:type="spellEnd"/>
-      <w:r>
-        <w:rPr>
-          <w:rFonts w:ascii="Arial" w:hAnsi="Arial" w:cs="Arial"/>
-        </w:rPr>
-        <w:t xml:space="preserve"> to support system tracking and accountability.</w:t>
-      </w:r>
-    </w:p>
-    <w:p>
-      <w:pPr>
-        <w:spacing w:line="360" w:lineRule="auto"/>
-        <w:ind w:left="567"/>
-        <w:jc w:val="both"/>
-        <w:rPr>
-          <w:rFonts w:ascii="Arial" w:hAnsi="Arial" w:cs="Arial"/>
-        </w:rPr>
-      </w:pPr>
-      <w:r>
-        <w:rPr>
-          <w:rFonts w:ascii="Arial" w:hAnsi="Arial" w:cs="Arial"/>
-        </w:rPr>
-        <w:t xml:space="preserve">The third sequence diagram represents the enrolment review and approval process performed by registry staff. It illustrates how </w:t>
-      </w:r>
-      <w:proofErr w:type="spellStart"/>
-      <w:r>
-        <w:rPr>
-          <w:rFonts w:ascii="Arial" w:hAnsi="Arial" w:cs="Arial"/>
-        </w:rPr>
-        <w:t>RegistryStaff</w:t>
-      </w:r>
-      <w:proofErr w:type="spellEnd"/>
-      <w:r>
-        <w:rPr>
-          <w:rFonts w:ascii="Arial" w:hAnsi="Arial" w:cs="Arial"/>
-        </w:rPr>
-        <w:t xml:space="preserve"> interacts with </w:t>
-      </w:r>
-      <w:proofErr w:type="spellStart"/>
-      <w:r>
-        <w:rPr>
-          <w:rFonts w:ascii="Arial" w:hAnsi="Arial" w:cs="Arial"/>
-        </w:rPr>
-        <w:t>IStudentInfoSystem</w:t>
-      </w:r>
-      <w:proofErr w:type="spellEnd"/>
-      <w:r>
-        <w:rPr>
-          <w:rFonts w:ascii="Arial" w:hAnsi="Arial" w:cs="Arial"/>
-        </w:rPr>
-        <w:t xml:space="preserve"> and </w:t>
-      </w:r>
-      <w:proofErr w:type="spellStart"/>
-      <w:r>
-        <w:rPr>
-          <w:rFonts w:ascii="Arial" w:hAnsi="Arial" w:cs="Arial"/>
-        </w:rPr>
-        <w:t>IFinanceSystem</w:t>
-      </w:r>
-      <w:proofErr w:type="spellEnd"/>
-      <w:r>
-        <w:rPr>
-          <w:rFonts w:ascii="Arial" w:hAnsi="Arial" w:cs="Arial"/>
-        </w:rPr>
-        <w:t xml:space="preserve"> to verify academic eligibility, payment status, and insurance requirements before making an approval decision. Based on </w:t>
-      </w:r>
-      <w:r>
-        <w:rPr>
-          <w:rFonts w:ascii="Arial" w:hAnsi="Arial" w:cs="Arial"/>
-        </w:rPr>
-        <w:lastRenderedPageBreak/>
-        <w:t xml:space="preserve">the verification result, the enrolment request can either be approved or rejected, and the decision is recorded through </w:t>
-      </w:r>
-      <w:proofErr w:type="spellStart"/>
-      <w:r>
-        <w:rPr>
-          <w:rFonts w:ascii="Arial" w:hAnsi="Arial" w:cs="Arial"/>
-        </w:rPr>
-        <w:t>AuditService</w:t>
-      </w:r>
-      <w:proofErr w:type="spellEnd"/>
-      <w:r>
-        <w:rPr>
-          <w:rFonts w:ascii="Arial" w:hAnsi="Arial" w:cs="Arial"/>
-        </w:rPr>
-        <w:t>.</w:t>
-      </w:r>
-    </w:p>
-    <w:p>
-      <w:pPr>
-        <w:spacing w:line="360" w:lineRule="auto"/>
-        <w:ind w:left="567"/>
-        <w:jc w:val="both"/>
-        <w:rPr>
-          <w:rFonts w:ascii="Arial" w:hAnsi="Arial" w:cs="Arial"/>
-        </w:rPr>
-      </w:pPr>
-      <w:r>
-        <w:rPr>
-          <w:rFonts w:ascii="Arial" w:hAnsi="Arial" w:cs="Arial"/>
-        </w:rPr>
-        <w:t>These sequence diagrams provide a clearer understanding of the system workflow by showing message ordering, interaction flow, and responsibilities between classes and external systems. They also improve consistency between the UML models and the C# implementation of the Course Enrolment System.</w:t>
+        <w:t>Overall, the activity diagrams provide a clearer understanding of the operational workflow of the Course Enrolment System and complement the sequence diagrams by focusing on business process flow and system behaviour from a process perspective.</w:t>
       </w:r>
       <w:r>
         <w:rPr>
@@ -7137,6 +7093,7 @@
   <w:style w:type="character" w:default="1" w:styleId="DefaultParagraphFont">
     <w:name w:val="Default Paragraph Font"/>
     <w:uiPriority w:val="1"/>
+    <w:semiHidden/>
     <w:unhideWhenUsed/>
   </w:style>
   <w:style w:type="table" w:default="1" w:styleId="TableNormal">

</xml_diff>

<commit_message>
Upload the final report's Refined static and dynamic modelling part
</commit_message>
<xml_diff>
--- a/Project Final Report/Assignment_Phase_2-Thanh_Tran-24247169.docx
+++ b/Project Final Report/Assignment_Phase_2-Thanh_Tran-24247169.docx
@@ -460,6 +460,7 @@
               <w:tab w:val="right" w:leader="dot" w:pos="9350"/>
             </w:tabs>
             <w:rPr>
+              <w:rFonts w:ascii="Arial" w:hAnsi="Arial" w:cs="Arial"/>
               <w:noProof/>
               <w:lang w:eastAsia="en-NZ"/>
             </w:rPr>
@@ -495,6 +496,7 @@
             </w:r>
             <w:r>
               <w:rPr>
+                <w:rFonts w:ascii="Arial" w:hAnsi="Arial" w:cs="Arial"/>
                 <w:noProof/>
                 <w:lang w:eastAsia="en-NZ"/>
               </w:rPr>
@@ -512,6 +514,7 @@
             </w:r>
             <w:r>
               <w:rPr>
+                <w:rFonts w:ascii="Arial" w:hAnsi="Arial" w:cs="Arial"/>
                 <w:noProof/>
                 <w:webHidden/>
               </w:rPr>
@@ -519,6 +522,7 @@
             </w:r>
             <w:r>
               <w:rPr>
+                <w:rFonts w:ascii="Arial" w:hAnsi="Arial" w:cs="Arial"/>
                 <w:noProof/>
                 <w:webHidden/>
               </w:rPr>
@@ -526,6 +530,7 @@
             </w:r>
             <w:r>
               <w:rPr>
+                <w:rFonts w:ascii="Arial" w:hAnsi="Arial" w:cs="Arial"/>
                 <w:noProof/>
                 <w:webHidden/>
               </w:rPr>
@@ -533,12 +538,14 @@
             </w:r>
             <w:r>
               <w:rPr>
+                <w:rFonts w:ascii="Arial" w:hAnsi="Arial" w:cs="Arial"/>
                 <w:noProof/>
                 <w:webHidden/>
               </w:rPr>
             </w:r>
             <w:r>
               <w:rPr>
+                <w:rFonts w:ascii="Arial" w:hAnsi="Arial" w:cs="Arial"/>
                 <w:noProof/>
                 <w:webHidden/>
               </w:rPr>
@@ -546,6 +553,7 @@
             </w:r>
             <w:r>
               <w:rPr>
+                <w:rFonts w:ascii="Arial" w:hAnsi="Arial" w:cs="Arial"/>
                 <w:noProof/>
                 <w:webHidden/>
               </w:rPr>
@@ -553,6 +561,7 @@
             </w:r>
             <w:r>
               <w:rPr>
+                <w:rFonts w:ascii="Arial" w:hAnsi="Arial" w:cs="Arial"/>
                 <w:noProof/>
                 <w:webHidden/>
               </w:rPr>
@@ -568,6 +577,7 @@
               <w:tab w:val="right" w:leader="dot" w:pos="9350"/>
             </w:tabs>
             <w:rPr>
+              <w:rFonts w:ascii="Arial" w:hAnsi="Arial" w:cs="Arial"/>
               <w:noProof/>
               <w:lang w:eastAsia="en-NZ"/>
             </w:rPr>
@@ -585,6 +595,7 @@
             </w:r>
             <w:r>
               <w:rPr>
+                <w:rFonts w:ascii="Arial" w:hAnsi="Arial" w:cs="Arial"/>
                 <w:noProof/>
                 <w:lang w:eastAsia="en-NZ"/>
               </w:rPr>
@@ -602,6 +613,7 @@
             </w:r>
             <w:r>
               <w:rPr>
+                <w:rFonts w:ascii="Arial" w:hAnsi="Arial" w:cs="Arial"/>
                 <w:noProof/>
                 <w:webHidden/>
               </w:rPr>
@@ -609,6 +621,7 @@
             </w:r>
             <w:r>
               <w:rPr>
+                <w:rFonts w:ascii="Arial" w:hAnsi="Arial" w:cs="Arial"/>
                 <w:noProof/>
                 <w:webHidden/>
               </w:rPr>
@@ -616,6 +629,7 @@
             </w:r>
             <w:r>
               <w:rPr>
+                <w:rFonts w:ascii="Arial" w:hAnsi="Arial" w:cs="Arial"/>
                 <w:noProof/>
                 <w:webHidden/>
               </w:rPr>
@@ -623,12 +637,14 @@
             </w:r>
             <w:r>
               <w:rPr>
+                <w:rFonts w:ascii="Arial" w:hAnsi="Arial" w:cs="Arial"/>
                 <w:noProof/>
                 <w:webHidden/>
               </w:rPr>
             </w:r>
             <w:r>
               <w:rPr>
+                <w:rFonts w:ascii="Arial" w:hAnsi="Arial" w:cs="Arial"/>
                 <w:noProof/>
                 <w:webHidden/>
               </w:rPr>
@@ -636,6 +652,7 @@
             </w:r>
             <w:r>
               <w:rPr>
+                <w:rFonts w:ascii="Arial" w:hAnsi="Arial" w:cs="Arial"/>
                 <w:noProof/>
                 <w:webHidden/>
               </w:rPr>
@@ -643,6 +660,7 @@
             </w:r>
             <w:r>
               <w:rPr>
+                <w:rFonts w:ascii="Arial" w:hAnsi="Arial" w:cs="Arial"/>
                 <w:noProof/>
                 <w:webHidden/>
               </w:rPr>
@@ -658,6 +676,7 @@
               <w:tab w:val="right" w:leader="dot" w:pos="9350"/>
             </w:tabs>
             <w:rPr>
+              <w:rFonts w:ascii="Arial" w:hAnsi="Arial" w:cs="Arial"/>
               <w:noProof/>
               <w:lang w:eastAsia="en-NZ"/>
             </w:rPr>
@@ -675,6 +694,7 @@
             </w:r>
             <w:r>
               <w:rPr>
+                <w:rFonts w:ascii="Arial" w:hAnsi="Arial" w:cs="Arial"/>
                 <w:noProof/>
                 <w:lang w:eastAsia="en-NZ"/>
               </w:rPr>
@@ -692,6 +712,7 @@
             </w:r>
             <w:r>
               <w:rPr>
+                <w:rFonts w:ascii="Arial" w:hAnsi="Arial" w:cs="Arial"/>
                 <w:noProof/>
                 <w:webHidden/>
               </w:rPr>
@@ -699,6 +720,7 @@
             </w:r>
             <w:r>
               <w:rPr>
+                <w:rFonts w:ascii="Arial" w:hAnsi="Arial" w:cs="Arial"/>
                 <w:noProof/>
                 <w:webHidden/>
               </w:rPr>
@@ -706,6 +728,7 @@
             </w:r>
             <w:r>
               <w:rPr>
+                <w:rFonts w:ascii="Arial" w:hAnsi="Arial" w:cs="Arial"/>
                 <w:noProof/>
                 <w:webHidden/>
               </w:rPr>
@@ -713,12 +736,14 @@
             </w:r>
             <w:r>
               <w:rPr>
+                <w:rFonts w:ascii="Arial" w:hAnsi="Arial" w:cs="Arial"/>
                 <w:noProof/>
                 <w:webHidden/>
               </w:rPr>
             </w:r>
             <w:r>
               <w:rPr>
+                <w:rFonts w:ascii="Arial" w:hAnsi="Arial" w:cs="Arial"/>
                 <w:noProof/>
                 <w:webHidden/>
               </w:rPr>
@@ -726,6 +751,7 @@
             </w:r>
             <w:r>
               <w:rPr>
+                <w:rFonts w:ascii="Arial" w:hAnsi="Arial" w:cs="Arial"/>
                 <w:noProof/>
                 <w:webHidden/>
               </w:rPr>
@@ -733,6 +759,7 @@
             </w:r>
             <w:r>
               <w:rPr>
+                <w:rFonts w:ascii="Arial" w:hAnsi="Arial" w:cs="Arial"/>
                 <w:noProof/>
                 <w:webHidden/>
               </w:rPr>
@@ -748,6 +775,7 @@
               <w:tab w:val="right" w:leader="dot" w:pos="9350"/>
             </w:tabs>
             <w:rPr>
+              <w:rFonts w:ascii="Arial" w:hAnsi="Arial" w:cs="Arial"/>
               <w:noProof/>
               <w:lang w:eastAsia="en-NZ"/>
             </w:rPr>
@@ -765,6 +793,7 @@
             </w:r>
             <w:r>
               <w:rPr>
+                <w:rFonts w:ascii="Arial" w:hAnsi="Arial" w:cs="Arial"/>
                 <w:noProof/>
                 <w:lang w:eastAsia="en-NZ"/>
               </w:rPr>
@@ -782,6 +811,7 @@
             </w:r>
             <w:r>
               <w:rPr>
+                <w:rFonts w:ascii="Arial" w:hAnsi="Arial" w:cs="Arial"/>
                 <w:noProof/>
                 <w:webHidden/>
               </w:rPr>
@@ -789,6 +819,7 @@
             </w:r>
             <w:r>
               <w:rPr>
+                <w:rFonts w:ascii="Arial" w:hAnsi="Arial" w:cs="Arial"/>
                 <w:noProof/>
                 <w:webHidden/>
               </w:rPr>
@@ -796,6 +827,7 @@
             </w:r>
             <w:r>
               <w:rPr>
+                <w:rFonts w:ascii="Arial" w:hAnsi="Arial" w:cs="Arial"/>
                 <w:noProof/>
                 <w:webHidden/>
               </w:rPr>
@@ -803,12 +835,14 @@
             </w:r>
             <w:r>
               <w:rPr>
+                <w:rFonts w:ascii="Arial" w:hAnsi="Arial" w:cs="Arial"/>
                 <w:noProof/>
                 <w:webHidden/>
               </w:rPr>
             </w:r>
             <w:r>
               <w:rPr>
+                <w:rFonts w:ascii="Arial" w:hAnsi="Arial" w:cs="Arial"/>
                 <w:noProof/>
                 <w:webHidden/>
               </w:rPr>
@@ -816,6 +850,7 @@
             </w:r>
             <w:r>
               <w:rPr>
+                <w:rFonts w:ascii="Arial" w:hAnsi="Arial" w:cs="Arial"/>
                 <w:noProof/>
                 <w:webHidden/>
               </w:rPr>
@@ -823,6 +858,7 @@
             </w:r>
             <w:r>
               <w:rPr>
+                <w:rFonts w:ascii="Arial" w:hAnsi="Arial" w:cs="Arial"/>
                 <w:noProof/>
                 <w:webHidden/>
               </w:rPr>
@@ -838,6 +874,7 @@
               <w:tab w:val="right" w:leader="dot" w:pos="9350"/>
             </w:tabs>
             <w:rPr>
+              <w:rFonts w:ascii="Arial" w:hAnsi="Arial" w:cs="Arial"/>
               <w:noProof/>
               <w:lang w:eastAsia="en-NZ"/>
             </w:rPr>
@@ -855,6 +892,7 @@
             </w:r>
             <w:r>
               <w:rPr>
+                <w:rFonts w:ascii="Arial" w:hAnsi="Arial" w:cs="Arial"/>
                 <w:noProof/>
                 <w:lang w:eastAsia="en-NZ"/>
               </w:rPr>
@@ -872,6 +910,7 @@
             </w:r>
             <w:r>
               <w:rPr>
+                <w:rFonts w:ascii="Arial" w:hAnsi="Arial" w:cs="Arial"/>
                 <w:noProof/>
                 <w:webHidden/>
               </w:rPr>
@@ -879,6 +918,7 @@
             </w:r>
             <w:r>
               <w:rPr>
+                <w:rFonts w:ascii="Arial" w:hAnsi="Arial" w:cs="Arial"/>
                 <w:noProof/>
                 <w:webHidden/>
               </w:rPr>
@@ -886,6 +926,7 @@
             </w:r>
             <w:r>
               <w:rPr>
+                <w:rFonts w:ascii="Arial" w:hAnsi="Arial" w:cs="Arial"/>
                 <w:noProof/>
                 <w:webHidden/>
               </w:rPr>
@@ -893,12 +934,14 @@
             </w:r>
             <w:r>
               <w:rPr>
+                <w:rFonts w:ascii="Arial" w:hAnsi="Arial" w:cs="Arial"/>
                 <w:noProof/>
                 <w:webHidden/>
               </w:rPr>
             </w:r>
             <w:r>
               <w:rPr>
+                <w:rFonts w:ascii="Arial" w:hAnsi="Arial" w:cs="Arial"/>
                 <w:noProof/>
                 <w:webHidden/>
               </w:rPr>
@@ -906,6 +949,7 @@
             </w:r>
             <w:r>
               <w:rPr>
+                <w:rFonts w:ascii="Arial" w:hAnsi="Arial" w:cs="Arial"/>
                 <w:noProof/>
                 <w:webHidden/>
               </w:rPr>
@@ -913,6 +957,7 @@
             </w:r>
             <w:r>
               <w:rPr>
+                <w:rFonts w:ascii="Arial" w:hAnsi="Arial" w:cs="Arial"/>
                 <w:noProof/>
                 <w:webHidden/>
               </w:rPr>
@@ -927,6 +972,7 @@
               <w:tab w:val="right" w:leader="dot" w:pos="9350"/>
             </w:tabs>
             <w:rPr>
+              <w:rFonts w:ascii="Arial" w:hAnsi="Arial" w:cs="Arial"/>
               <w:noProof/>
               <w:lang w:eastAsia="en-NZ"/>
             </w:rPr>
@@ -944,6 +990,7 @@
             </w:r>
             <w:r>
               <w:rPr>
+                <w:rFonts w:ascii="Arial" w:hAnsi="Arial" w:cs="Arial"/>
                 <w:noProof/>
                 <w:webHidden/>
               </w:rPr>
@@ -951,6 +998,7 @@
             </w:r>
             <w:r>
               <w:rPr>
+                <w:rFonts w:ascii="Arial" w:hAnsi="Arial" w:cs="Arial"/>
                 <w:noProof/>
                 <w:webHidden/>
               </w:rPr>
@@ -958,6 +1006,7 @@
             </w:r>
             <w:r>
               <w:rPr>
+                <w:rFonts w:ascii="Arial" w:hAnsi="Arial" w:cs="Arial"/>
                 <w:noProof/>
                 <w:webHidden/>
               </w:rPr>
@@ -965,12 +1014,14 @@
             </w:r>
             <w:r>
               <w:rPr>
+                <w:rFonts w:ascii="Arial" w:hAnsi="Arial" w:cs="Arial"/>
                 <w:noProof/>
                 <w:webHidden/>
               </w:rPr>
             </w:r>
             <w:r>
               <w:rPr>
+                <w:rFonts w:ascii="Arial" w:hAnsi="Arial" w:cs="Arial"/>
                 <w:noProof/>
                 <w:webHidden/>
               </w:rPr>
@@ -978,6 +1029,7 @@
             </w:r>
             <w:r>
               <w:rPr>
+                <w:rFonts w:ascii="Arial" w:hAnsi="Arial" w:cs="Arial"/>
                 <w:noProof/>
                 <w:webHidden/>
               </w:rPr>
@@ -985,6 +1037,7 @@
             </w:r>
             <w:r>
               <w:rPr>
+                <w:rFonts w:ascii="Arial" w:hAnsi="Arial" w:cs="Arial"/>
                 <w:noProof/>
                 <w:webHidden/>
               </w:rPr>
@@ -1127,7 +1180,35 @@
         <w:rPr>
           <w:rFonts w:ascii="Arial" w:hAnsi="Arial" w:cs="Arial"/>
         </w:rPr>
-        <w:t>Phase 1 also included a partial C# implementation of core classes such as User, Student, Staff, RegistryStaff, Course, and EnrolmentRequest to demonstrate enrolment functions including course selection, enrolment submission, approval processing, and enrolment monitoring. Several design weaknesses were also identified, including dependency on external systems, risks of tight coupling, and possible performance issues during peak enrolment periods.</w:t>
+        <w:t xml:space="preserve">Phase 1 also included a partial C# implementation of core classes such as User, Student, Staff, </w:t>
+      </w:r>
+      <w:proofErr w:type="spellStart"/>
+      <w:r>
+        <w:rPr>
+          <w:rFonts w:ascii="Arial" w:hAnsi="Arial" w:cs="Arial"/>
+        </w:rPr>
+        <w:t>RegistryStaff</w:t>
+      </w:r>
+      <w:proofErr w:type="spellEnd"/>
+      <w:r>
+        <w:rPr>
+          <w:rFonts w:ascii="Arial" w:hAnsi="Arial" w:cs="Arial"/>
+        </w:rPr>
+        <w:t xml:space="preserve">, Course, and </w:t>
+      </w:r>
+      <w:proofErr w:type="spellStart"/>
+      <w:r>
+        <w:rPr>
+          <w:rFonts w:ascii="Arial" w:hAnsi="Arial" w:cs="Arial"/>
+        </w:rPr>
+        <w:t>EnrolmentRequest</w:t>
+      </w:r>
+      <w:proofErr w:type="spellEnd"/>
+      <w:r>
+        <w:rPr>
+          <w:rFonts w:ascii="Arial" w:hAnsi="Arial" w:cs="Arial"/>
+        </w:rPr>
+        <w:t xml:space="preserve"> to demonstrate enrolment functions including course selection, enrolment submission, approval processing, and enrolment monitoring. Several design weaknesses were also identified, including dependency on external systems, risks of tight coupling, and possible performance issues during peak enrolment periods.</w:t>
       </w:r>
     </w:p>
     <w:p>
@@ -1143,7 +1224,21 @@
         <w:rPr>
           <w:rFonts w:ascii="Arial" w:hAnsi="Arial" w:cs="Arial"/>
         </w:rPr>
-        <w:t>Building on this foundation, phase 2 focuses on refining the system design to improve abstraction, cohesion, modularity, maintainability, and extensibility using additional UML models and GoF design patterns. The refined design is then implemented in C#</w:t>
+        <w:t xml:space="preserve">Building on this foundation, phase 2 focuses on refining the system design to improve abstraction, cohesion, modularity, maintainability, and extensibility using additional UML models and </w:t>
+      </w:r>
+      <w:proofErr w:type="spellStart"/>
+      <w:r>
+        <w:rPr>
+          <w:rFonts w:ascii="Arial" w:hAnsi="Arial" w:cs="Arial"/>
+        </w:rPr>
+        <w:t>GoF</w:t>
+      </w:r>
+      <w:proofErr w:type="spellEnd"/>
+      <w:r>
+        <w:rPr>
+          <w:rFonts w:ascii="Arial" w:hAnsi="Arial" w:cs="Arial"/>
+        </w:rPr>
+        <w:t xml:space="preserve"> design patterns. The refined design is then implemented in C#</w:t>
       </w:r>
       <w:r>
         <w:rPr>
@@ -1245,19 +1340,7 @@
           <w:sz w:val="28"/>
           <w:szCs w:val="28"/>
         </w:rPr>
-        <w:t xml:space="preserve">2.1. </w:t>
-      </w:r>
-      <w:bookmarkEnd w:id="3"/>
-      <w:r>
-        <w:rPr>
-          <w:rFonts w:ascii="Arial" w:hAnsi="Arial" w:cs="Arial"/>
-          <w:b/>
-          <w:bCs/>
-          <w:color w:val="EE0000"/>
-          <w:sz w:val="28"/>
-          <w:szCs w:val="28"/>
-        </w:rPr>
-        <w:t>Sequence digram</w:t>
+        <w:t>2.1. Refined UML Class Diagram</w:t>
       </w:r>
     </w:p>
     <w:p>
@@ -1273,7 +1356,224 @@
         <w:rPr>
           <w:rFonts w:ascii="Arial" w:hAnsi="Arial" w:cs="Arial"/>
         </w:rPr>
-        <w:t>To represent the dynamic behaviour of the Course Enrolment System, sequence diagrams were developed. They illustrate how different system components interact to complete key business processes. Sequence diagrams provide a clearer representation of object interactions, message flow, system responsibilities, and communication between internal classes and external systems.</w:t>
+        <w:t>The class diagram shown below (Figure 1) represents the initial Phase 1 design of the Course Enrolment System. Although it provides a reasonable overall structure of the system and identifies key entities, it is partially implementation-driven rather than conceptually clean. In addition, there are issues related to weak encapsulation in some classes, as well as unclear multiplicities and associations between certain domain objects. These limitations reduce the overall clarity, maintainability, and scalability of the design.</w:t>
+      </w:r>
+    </w:p>
+    <w:p>
+      <w:pPr>
+        <w:keepNext/>
+        <w:spacing w:after="0" w:line="360" w:lineRule="auto"/>
+        <w:ind w:left="-1418"/>
+        <w:jc w:val="both"/>
+        <w:rPr>
+          <w:rFonts w:ascii="Arial" w:hAnsi="Arial" w:cs="Arial"/>
+        </w:rPr>
+      </w:pPr>
+      <w:r>
+        <w:rPr>
+          <w:rFonts w:ascii="Arial" w:hAnsi="Arial" w:cs="Arial"/>
+          <w:noProof/>
+        </w:rPr>
+        <w:drawing>
+          <wp:inline distT="0" distB="0" distL="0" distR="0" wp14:anchorId="4590FA0C" wp14:editId="1DCF5D48">
+            <wp:extent cx="7708900" cy="4026818"/>
+            <wp:effectExtent l="19050" t="19050" r="25400" b="12065"/>
+            <wp:docPr id="563501286" name="Picture 5"/>
+            <wp:cNvGraphicFramePr>
+              <a:graphicFrameLocks xmlns:a="http://schemas.openxmlformats.org/drawingml/2006/main" noChangeAspect="1"/>
+            </wp:cNvGraphicFramePr>
+            <a:graphic xmlns:a="http://schemas.openxmlformats.org/drawingml/2006/main">
+              <a:graphicData uri="http://schemas.openxmlformats.org/drawingml/2006/picture">
+                <pic:pic xmlns:pic="http://schemas.openxmlformats.org/drawingml/2006/picture">
+                  <pic:nvPicPr>
+                    <pic:cNvPr id="0" name="Picture 5"/>
+                    <pic:cNvPicPr>
+                      <a:picLocks noChangeAspect="1" noChangeArrowheads="1"/>
+                    </pic:cNvPicPr>
+                  </pic:nvPicPr>
+                  <pic:blipFill>
+                    <a:blip r:embed="rId10">
+                      <a:extLst>
+                        <a:ext uri="{28A0092B-C50C-407E-A947-70E740481C1C}">
+                          <a14:useLocalDpi xmlns:a14="http://schemas.microsoft.com/office/drawing/2010/main" val="0"/>
+                        </a:ext>
+                      </a:extLst>
+                    </a:blip>
+                    <a:srcRect/>
+                    <a:stretch>
+                      <a:fillRect/>
+                    </a:stretch>
+                  </pic:blipFill>
+                  <pic:spPr bwMode="auto">
+                    <a:xfrm>
+                      <a:off x="0" y="0"/>
+                      <a:ext cx="7726875" cy="4036208"/>
+                    </a:xfrm>
+                    <a:prstGeom prst="rect">
+                      <a:avLst/>
+                    </a:prstGeom>
+                    <a:noFill/>
+                    <a:ln>
+                      <a:solidFill>
+                        <a:schemeClr val="bg1">
+                          <a:lumMod val="85000"/>
+                        </a:schemeClr>
+                      </a:solidFill>
+                    </a:ln>
+                  </pic:spPr>
+                </pic:pic>
+              </a:graphicData>
+            </a:graphic>
+          </wp:inline>
+        </w:drawing>
+      </w:r>
+    </w:p>
+    <w:p>
+      <w:pPr>
+        <w:pStyle w:val="Caption"/>
+        <w:ind w:left="567"/>
+        <w:jc w:val="both"/>
+        <w:rPr>
+          <w:rFonts w:ascii="Arial" w:hAnsi="Arial" w:cs="Arial"/>
+          <w:b/>
+          <w:bCs/>
+          <w:i w:val="0"/>
+          <w:iCs w:val="0"/>
+          <w:color w:val="215E99" w:themeColor="text2" w:themeTint="BF"/>
+          <w:sz w:val="24"/>
+          <w:szCs w:val="24"/>
+        </w:rPr>
+      </w:pPr>
+      <w:r>
+        <w:rPr>
+          <w:rFonts w:ascii="Arial" w:hAnsi="Arial" w:cs="Arial"/>
+          <w:b/>
+          <w:bCs/>
+          <w:i w:val="0"/>
+          <w:iCs w:val="0"/>
+          <w:color w:val="215E99" w:themeColor="text2" w:themeTint="BF"/>
+          <w:sz w:val="24"/>
+          <w:szCs w:val="24"/>
+        </w:rPr>
+        <w:t xml:space="preserve">Figure </w:t>
+      </w:r>
+      <w:r>
+        <w:rPr>
+          <w:rFonts w:ascii="Arial" w:hAnsi="Arial" w:cs="Arial"/>
+          <w:b/>
+          <w:bCs/>
+          <w:i w:val="0"/>
+          <w:iCs w:val="0"/>
+          <w:color w:val="215E99" w:themeColor="text2" w:themeTint="BF"/>
+          <w:sz w:val="24"/>
+          <w:szCs w:val="24"/>
+        </w:rPr>
+        <w:fldChar w:fldCharType="begin"/>
+      </w:r>
+      <w:r>
+        <w:rPr>
+          <w:rFonts w:ascii="Arial" w:hAnsi="Arial" w:cs="Arial"/>
+          <w:b/>
+          <w:bCs/>
+          <w:i w:val="0"/>
+          <w:iCs w:val="0"/>
+          <w:color w:val="215E99" w:themeColor="text2" w:themeTint="BF"/>
+          <w:sz w:val="24"/>
+          <w:szCs w:val="24"/>
+        </w:rPr>
+        <w:instrText xml:space="preserve"> SEQ Figure \* ARABIC </w:instrText>
+      </w:r>
+      <w:r>
+        <w:rPr>
+          <w:rFonts w:ascii="Arial" w:hAnsi="Arial" w:cs="Arial"/>
+          <w:b/>
+          <w:bCs/>
+          <w:i w:val="0"/>
+          <w:iCs w:val="0"/>
+          <w:color w:val="215E99" w:themeColor="text2" w:themeTint="BF"/>
+          <w:sz w:val="24"/>
+          <w:szCs w:val="24"/>
+        </w:rPr>
+        <w:fldChar w:fldCharType="separate"/>
+      </w:r>
+      <w:r>
+        <w:rPr>
+          <w:rFonts w:ascii="Arial" w:hAnsi="Arial" w:cs="Arial"/>
+          <w:b/>
+          <w:bCs/>
+          <w:i w:val="0"/>
+          <w:iCs w:val="0"/>
+          <w:noProof/>
+          <w:color w:val="215E99" w:themeColor="text2" w:themeTint="BF"/>
+          <w:sz w:val="24"/>
+          <w:szCs w:val="24"/>
+        </w:rPr>
+        <w:t>1</w:t>
+      </w:r>
+      <w:r>
+        <w:rPr>
+          <w:rFonts w:ascii="Arial" w:hAnsi="Arial" w:cs="Arial"/>
+          <w:b/>
+          <w:bCs/>
+          <w:i w:val="0"/>
+          <w:iCs w:val="0"/>
+          <w:color w:val="215E99" w:themeColor="text2" w:themeTint="BF"/>
+          <w:sz w:val="24"/>
+          <w:szCs w:val="24"/>
+        </w:rPr>
+        <w:fldChar w:fldCharType="end"/>
+      </w:r>
+      <w:r>
+        <w:rPr>
+          <w:rFonts w:ascii="Arial" w:hAnsi="Arial" w:cs="Arial"/>
+          <w:b/>
+          <w:bCs/>
+          <w:i w:val="0"/>
+          <w:iCs w:val="0"/>
+          <w:color w:val="215E99" w:themeColor="text2" w:themeTint="BF"/>
+          <w:sz w:val="24"/>
+          <w:szCs w:val="24"/>
+        </w:rPr>
+        <w:t xml:space="preserve">: Phase 1’s class diagram of </w:t>
+      </w:r>
+      <w:r>
+        <w:rPr>
+          <w:rFonts w:ascii="Arial" w:hAnsi="Arial" w:cs="Arial"/>
+          <w:b/>
+          <w:bCs/>
+          <w:i w:val="0"/>
+          <w:iCs w:val="0"/>
+          <w:color w:val="215E99" w:themeColor="text2" w:themeTint="BF"/>
+          <w:sz w:val="24"/>
+          <w:szCs w:val="24"/>
+        </w:rPr>
+        <w:t>Course</w:t>
+      </w:r>
+      <w:r>
+        <w:rPr>
+          <w:rFonts w:ascii="Arial" w:hAnsi="Arial" w:cs="Arial"/>
+          <w:b/>
+          <w:bCs/>
+          <w:i w:val="0"/>
+          <w:iCs w:val="0"/>
+          <w:color w:val="215E99" w:themeColor="text2" w:themeTint="BF"/>
+          <w:sz w:val="24"/>
+          <w:szCs w:val="24"/>
+        </w:rPr>
+        <w:t xml:space="preserve"> </w:t>
+      </w:r>
+      <w:r>
+        <w:rPr>
+          <w:rFonts w:ascii="Arial" w:hAnsi="Arial" w:cs="Arial"/>
+          <w:b/>
+          <w:bCs/>
+          <w:i w:val="0"/>
+          <w:iCs w:val="0"/>
+          <w:color w:val="215E99" w:themeColor="text2" w:themeTint="BF"/>
+          <w:sz w:val="24"/>
+          <w:szCs w:val="24"/>
+        </w:rPr>
+        <w:t>Enrolment System</w:t>
       </w:r>
     </w:p>
     <w:p>
@@ -1289,90 +1589,204 @@
         <w:rPr>
           <w:rFonts w:ascii="Arial" w:hAnsi="Arial" w:cs="Arial"/>
         </w:rPr>
-        <w:t>Three key system scenarios were selected for modelling, including student login, course selection and enrolment submission, and enrolment review and approval by registry staff. These processes were chosen because they represent the main workflow of the Course Enrolment System and involve interactions between multiple users, system classes, services, and external systems.</w:t>
+        <w:t xml:space="preserve">To address these issues, the class diagram has been refined by strengthening encapsulation and reducing implementation-level detail in the UML representation. Internal states such as course capacity, enrolment status, and identifier attributes are now set to private to improve encapsulation, enhance data integrity, and reduce </w:t>
+      </w:r>
+      <w:r>
+        <w:rPr>
+          <w:rFonts w:ascii="Arial" w:hAnsi="Arial" w:cs="Arial"/>
+        </w:rPr>
+        <w:lastRenderedPageBreak/>
+        <w:t xml:space="preserve">direct external access. In addition, some attributes and operations have been removed where they were considered too implementation-specific, </w:t>
+      </w:r>
+      <w:proofErr w:type="gramStart"/>
+      <w:r>
+        <w:rPr>
+          <w:rFonts w:ascii="Arial" w:hAnsi="Arial" w:cs="Arial"/>
+        </w:rPr>
+        <w:t>in order to</w:t>
+      </w:r>
+      <w:proofErr w:type="gramEnd"/>
+      <w:r>
+        <w:rPr>
+          <w:rFonts w:ascii="Arial" w:hAnsi="Arial" w:cs="Arial"/>
+        </w:rPr>
+        <w:t xml:space="preserve"> maintain a clearer conceptual focus in the model. Operations are also now represented using simplified names without detailed parameters where appropriate, further reducing unnecessary implementation-level detail. Furthermore, associations have been clarified through the introduction of meaningful relationship labels such as “has” and “belongs to”, improving the readability and semantic clarity of multiplicities within the model.</w:t>
       </w:r>
     </w:p>
     <w:p>
       <w:pPr>
-        <w:spacing w:line="360" w:lineRule="auto"/>
-        <w:ind w:left="567"/>
-        <w:jc w:val="both"/>
-        <w:rPr>
-          <w:rFonts w:ascii="Arial" w:hAnsi="Arial" w:cs="Arial"/>
-        </w:rPr>
-      </w:pPr>
-      <w:r>
-        <w:rPr>
-          <w:rFonts w:ascii="Arial" w:hAnsi="Arial" w:cs="Arial"/>
-        </w:rPr>
-        <w:t>The first sequence diagram represents the student login process. It demonstrates how the student interacts with the User class to perform login authentication, where credential verification is completed internally before activity logging is recorded by AuditService. After a successful login, the student can search, view, and select available courses.</w:t>
+        <w:keepNext/>
+        <w:spacing w:after="0"/>
+        <w:ind w:left="-1418"/>
+        <w:rPr>
+          <w:rFonts w:ascii="Arial" w:hAnsi="Arial" w:cs="Arial"/>
+        </w:rPr>
+      </w:pPr>
+      <w:r>
+        <w:rPr>
+          <w:rFonts w:ascii="Arial" w:hAnsi="Arial" w:cs="Arial"/>
+          <w:noProof/>
+        </w:rPr>
+        <w:drawing>
+          <wp:inline distT="0" distB="0" distL="0" distR="0" wp14:anchorId="3ECBDDF8" wp14:editId="6C3CBF87">
+            <wp:extent cx="7740650" cy="4143817"/>
+            <wp:effectExtent l="19050" t="19050" r="12700" b="28575"/>
+            <wp:docPr id="1562697201" name="Picture 1"/>
+            <wp:cNvGraphicFramePr>
+              <a:graphicFrameLocks xmlns:a="http://schemas.openxmlformats.org/drawingml/2006/main" noChangeAspect="1"/>
+            </wp:cNvGraphicFramePr>
+            <a:graphic xmlns:a="http://schemas.openxmlformats.org/drawingml/2006/main">
+              <a:graphicData uri="http://schemas.openxmlformats.org/drawingml/2006/picture">
+                <pic:pic xmlns:pic="http://schemas.openxmlformats.org/drawingml/2006/picture">
+                  <pic:nvPicPr>
+                    <pic:cNvPr id="0" name="Picture 1"/>
+                    <pic:cNvPicPr>
+                      <a:picLocks noChangeAspect="1" noChangeArrowheads="1"/>
+                    </pic:cNvPicPr>
+                  </pic:nvPicPr>
+                  <pic:blipFill>
+                    <a:blip r:embed="rId11">
+                      <a:extLst>
+                        <a:ext uri="{28A0092B-C50C-407E-A947-70E740481C1C}">
+                          <a14:useLocalDpi xmlns:a14="http://schemas.microsoft.com/office/drawing/2010/main" val="0"/>
+                        </a:ext>
+                      </a:extLst>
+                    </a:blip>
+                    <a:srcRect/>
+                    <a:stretch>
+                      <a:fillRect/>
+                    </a:stretch>
+                  </pic:blipFill>
+                  <pic:spPr bwMode="auto">
+                    <a:xfrm>
+                      <a:off x="0" y="0"/>
+                      <a:ext cx="7752896" cy="4150373"/>
+                    </a:xfrm>
+                    <a:prstGeom prst="rect">
+                      <a:avLst/>
+                    </a:prstGeom>
+                    <a:noFill/>
+                    <a:ln>
+                      <a:solidFill>
+                        <a:schemeClr val="bg1">
+                          <a:lumMod val="85000"/>
+                        </a:schemeClr>
+                      </a:solidFill>
+                    </a:ln>
+                  </pic:spPr>
+                </pic:pic>
+              </a:graphicData>
+            </a:graphic>
+          </wp:inline>
+        </w:drawing>
       </w:r>
     </w:p>
     <w:p>
       <w:pPr>
-        <w:spacing w:line="360" w:lineRule="auto"/>
+        <w:pStyle w:val="Caption"/>
         <w:ind w:left="567"/>
-        <w:jc w:val="both"/>
-        <w:rPr>
-          <w:rFonts w:ascii="Arial" w:hAnsi="Arial" w:cs="Arial"/>
-        </w:rPr>
-      </w:pPr>
-      <w:r>
-        <w:rPr>
-          <w:rFonts w:ascii="Arial" w:hAnsi="Arial" w:cs="Arial"/>
-        </w:rPr>
-        <w:t>The second sequence diagram represents the course selection and enrolment submission process. It demonstrates how a student searches and views available courses before selecting a course based on availability. Once the student has selected the required courses</w:t>
-      </w:r>
-      <w:r>
-        <w:rPr>
-          <w:rFonts w:ascii="Arial" w:hAnsi="Arial" w:cs="Arial"/>
-        </w:rPr>
-        <w:t xml:space="preserve"> and submitted request</w:t>
-      </w:r>
-      <w:r>
-        <w:rPr>
-          <w:rFonts w:ascii="Arial" w:hAnsi="Arial" w:cs="Arial"/>
-        </w:rPr>
-        <w:t>, an EnrolmentRequest is created and submitted to the system. The enrolment request status is updated, and the activity is recorded by AuditService to support system tracking and accountability.</w:t>
-      </w:r>
-    </w:p>
-    <w:p>
-      <w:pPr>
-        <w:spacing w:line="360" w:lineRule="auto"/>
-        <w:ind w:left="567"/>
-        <w:jc w:val="both"/>
-        <w:rPr>
-          <w:rFonts w:ascii="Arial" w:hAnsi="Arial" w:cs="Arial"/>
-        </w:rPr>
-      </w:pPr>
-      <w:r>
-        <w:rPr>
-          <w:rFonts w:ascii="Arial" w:hAnsi="Arial" w:cs="Arial"/>
-        </w:rPr>
-        <w:t xml:space="preserve">The third sequence diagram represents the enrolment review and approval process performed by registry staff. It illustrates how RegistryStaff interacts with IStudentInfoSystem and IFinanceSystem to verify academic eligibility, payment status, and insurance requirements before making an approval decision. Based on </w:t>
-      </w:r>
-      <w:r>
-        <w:rPr>
-          <w:rFonts w:ascii="Arial" w:hAnsi="Arial" w:cs="Arial"/>
-        </w:rPr>
-        <w:lastRenderedPageBreak/>
-        <w:t>the verification result, the enrolment request can either be approved or rejected, and the decision is recorded through AuditService.</w:t>
-      </w:r>
-    </w:p>
-    <w:p>
-      <w:pPr>
-        <w:spacing w:line="360" w:lineRule="auto"/>
-        <w:ind w:left="567"/>
-        <w:jc w:val="both"/>
-        <w:rPr>
-          <w:rFonts w:ascii="Arial" w:hAnsi="Arial" w:cs="Arial"/>
-        </w:rPr>
-      </w:pPr>
-      <w:r>
-        <w:rPr>
-          <w:rFonts w:ascii="Arial" w:hAnsi="Arial" w:cs="Arial"/>
-        </w:rPr>
-        <w:t>These sequence diagrams provide a clearer understanding of the system workflow by showing message ordering, interaction flow, and responsibilities between classes and external systems. They also improve consistency between the UML models and the C# implementation of the Course Enrolment System.</w:t>
+        <w:rPr>
+          <w:rFonts w:ascii="Arial" w:hAnsi="Arial" w:cs="Arial"/>
+          <w:b/>
+          <w:bCs/>
+          <w:i w:val="0"/>
+          <w:iCs w:val="0"/>
+          <w:color w:val="215E99" w:themeColor="text2" w:themeTint="BF"/>
+          <w:sz w:val="24"/>
+          <w:szCs w:val="24"/>
+        </w:rPr>
+      </w:pPr>
+      <w:r>
+        <w:rPr>
+          <w:rFonts w:ascii="Arial" w:hAnsi="Arial" w:cs="Arial"/>
+          <w:b/>
+          <w:bCs/>
+          <w:i w:val="0"/>
+          <w:iCs w:val="0"/>
+          <w:color w:val="215E99" w:themeColor="text2" w:themeTint="BF"/>
+          <w:sz w:val="24"/>
+          <w:szCs w:val="24"/>
+        </w:rPr>
+        <w:t xml:space="preserve">Figure </w:t>
+      </w:r>
+      <w:r>
+        <w:rPr>
+          <w:rFonts w:ascii="Arial" w:hAnsi="Arial" w:cs="Arial"/>
+          <w:b/>
+          <w:bCs/>
+          <w:i w:val="0"/>
+          <w:iCs w:val="0"/>
+          <w:color w:val="215E99" w:themeColor="text2" w:themeTint="BF"/>
+          <w:sz w:val="24"/>
+          <w:szCs w:val="24"/>
+        </w:rPr>
+        <w:fldChar w:fldCharType="begin"/>
+      </w:r>
+      <w:r>
+        <w:rPr>
+          <w:rFonts w:ascii="Arial" w:hAnsi="Arial" w:cs="Arial"/>
+          <w:b/>
+          <w:bCs/>
+          <w:i w:val="0"/>
+          <w:iCs w:val="0"/>
+          <w:color w:val="215E99" w:themeColor="text2" w:themeTint="BF"/>
+          <w:sz w:val="24"/>
+          <w:szCs w:val="24"/>
+        </w:rPr>
+        <w:instrText xml:space="preserve"> SEQ Figure \* ARABIC </w:instrText>
+      </w:r>
+      <w:r>
+        <w:rPr>
+          <w:rFonts w:ascii="Arial" w:hAnsi="Arial" w:cs="Arial"/>
+          <w:b/>
+          <w:bCs/>
+          <w:i w:val="0"/>
+          <w:iCs w:val="0"/>
+          <w:color w:val="215E99" w:themeColor="text2" w:themeTint="BF"/>
+          <w:sz w:val="24"/>
+          <w:szCs w:val="24"/>
+        </w:rPr>
+        <w:fldChar w:fldCharType="separate"/>
+      </w:r>
+      <w:r>
+        <w:rPr>
+          <w:rFonts w:ascii="Arial" w:hAnsi="Arial" w:cs="Arial"/>
+          <w:b/>
+          <w:bCs/>
+          <w:i w:val="0"/>
+          <w:iCs w:val="0"/>
+          <w:noProof/>
+          <w:color w:val="215E99" w:themeColor="text2" w:themeTint="BF"/>
+          <w:sz w:val="24"/>
+          <w:szCs w:val="24"/>
+        </w:rPr>
+        <w:t>2</w:t>
+      </w:r>
+      <w:r>
+        <w:rPr>
+          <w:rFonts w:ascii="Arial" w:hAnsi="Arial" w:cs="Arial"/>
+          <w:b/>
+          <w:bCs/>
+          <w:i w:val="0"/>
+          <w:iCs w:val="0"/>
+          <w:color w:val="215E99" w:themeColor="text2" w:themeTint="BF"/>
+          <w:sz w:val="24"/>
+          <w:szCs w:val="24"/>
+        </w:rPr>
+        <w:fldChar w:fldCharType="end"/>
+      </w:r>
+      <w:r>
+        <w:rPr>
+          <w:rFonts w:ascii="Arial" w:hAnsi="Arial" w:cs="Arial"/>
+          <w:b/>
+          <w:bCs/>
+          <w:i w:val="0"/>
+          <w:iCs w:val="0"/>
+          <w:color w:val="215E99" w:themeColor="text2" w:themeTint="BF"/>
+          <w:sz w:val="24"/>
+          <w:szCs w:val="24"/>
+        </w:rPr>
+        <w:t>: Refined class diagram of Course Enrolment System</w:t>
       </w:r>
     </w:p>
     <w:p>
@@ -1399,7 +1813,7 @@
           <w:sz w:val="28"/>
           <w:szCs w:val="28"/>
         </w:rPr>
-        <w:t xml:space="preserve">2.1. </w:t>
+        <w:t>2.</w:t>
       </w:r>
       <w:r>
         <w:rPr>
@@ -1410,7 +1824,7 @@
           <w:sz w:val="28"/>
           <w:szCs w:val="28"/>
         </w:rPr>
-        <w:t>Activity</w:t>
+        <w:t>2</w:t>
       </w:r>
       <w:r>
         <w:rPr>
@@ -1421,7 +1835,30 @@
           <w:sz w:val="28"/>
           <w:szCs w:val="28"/>
         </w:rPr>
-        <w:t xml:space="preserve"> digram</w:t>
+        <w:t xml:space="preserve">. </w:t>
+      </w:r>
+      <w:bookmarkEnd w:id="3"/>
+      <w:r>
+        <w:rPr>
+          <w:rFonts w:ascii="Arial" w:hAnsi="Arial" w:cs="Arial"/>
+          <w:b/>
+          <w:bCs/>
+          <w:color w:val="EE0000"/>
+          <w:sz w:val="28"/>
+          <w:szCs w:val="28"/>
+        </w:rPr>
+        <w:t xml:space="preserve">Sequence </w:t>
+      </w:r>
+      <w:r>
+        <w:rPr>
+          <w:rFonts w:ascii="Arial" w:hAnsi="Arial" w:cs="Arial"/>
+          <w:b/>
+          <w:bCs/>
+          <w:color w:val="EE0000"/>
+          <w:sz w:val="28"/>
+          <w:szCs w:val="28"/>
+        </w:rPr>
+        <w:t>diagram</w:t>
       </w:r>
     </w:p>
     <w:p>
@@ -1437,7 +1874,14 @@
         <w:rPr>
           <w:rFonts w:ascii="Arial" w:hAnsi="Arial" w:cs="Arial"/>
         </w:rPr>
-        <w:t>To further represent the dynamic behaviour of the Course Enrolment System, activity diagrams were developed to model the workflow of major system processes. Unlike sequence diagrams, which focus on object interactions and message flow, activity diagrams provide a clearer representation of process flow, decision making, and responsibility allocation between different system components and external systems. Swimlanes were used to improve readability and clearly separate responsibilities between users, internal system components, and supporting services.</w:t>
+        <w:t xml:space="preserve">To represent the dynamic behaviour of the Course Enrolment System, sequence diagrams were developed. They illustrate how different system components interact to complete key business processes. Sequence diagrams provide a clearer </w:t>
+      </w:r>
+      <w:r>
+        <w:rPr>
+          <w:rFonts w:ascii="Arial" w:hAnsi="Arial" w:cs="Arial"/>
+        </w:rPr>
+        <w:lastRenderedPageBreak/>
+        <w:t>representation of object interactions, message flow, system responsibilities, and communication between internal classes and external systems.</w:t>
       </w:r>
     </w:p>
     <w:p>
@@ -1453,7 +1897,7 @@
         <w:rPr>
           <w:rFonts w:ascii="Arial" w:hAnsi="Arial" w:cs="Arial"/>
         </w:rPr>
-        <w:t>The first activity diagram represents the student course enrolment process. It models the workflow beginning from student login, course searching, viewing course information, selecting available courses, and submitting an enrolment request. Decision nodes were included to represent important business rules, such as login validation and course availability checking. If a course has reached full capacity, the student is required to select another course. After the enrolment request is submitted, the system creates an enrolment request with a pending status and records the activity through the AuditService. This diagram demonstrates how students interact with the system to complete the enrolment process while ensuring validation and tracking are performed.</w:t>
+        <w:t>Three key system scenarios were selected for modelling, including student login, course selection and enrolment submission, and enrolment review and approval by registry staff. These processes were chosen because they represent the main workflow of the Course Enrolment System and involve interactions between multiple users, system classes, services, and external systems.</w:t>
       </w:r>
     </w:p>
     <w:p>
@@ -1469,20 +1913,1464 @@
         <w:rPr>
           <w:rFonts w:ascii="Arial" w:hAnsi="Arial" w:cs="Arial"/>
         </w:rPr>
-        <w:t xml:space="preserve">The second activity diagram represents the registry staff enrolment review and approval process. It illustrates how registry staff monitor enrolment requests, review student details, and perform eligibility checks through external systems such as IStudentInfoSystem and IFinanceSystem. Decision points are used to determine </w:t>
-      </w:r>
-      <w:r>
-        <w:rPr>
-          <w:rFonts w:ascii="Arial" w:hAnsi="Arial" w:cs="Arial"/>
-        </w:rPr>
-        <w:lastRenderedPageBreak/>
-        <w:t>whether the student meets enrolment requirements, including academic eligibility, payment status, and insurance verification. Based on the outcome, the enrolment request is either approved or rejected, and the final action is recorded through the AuditService. This diagram helps demonstrate how the system supports staff decision-making while coordinating interactions between multiple system components and external services.</w:t>
+        <w:t xml:space="preserve">The first sequence diagram represents the student login process. It demonstrates how the student submits a login request through the system interface, which then communicates with the User class to authenticate the provided credentials. A loop structure is used to allow repeated login attempts until valid credentials are entered. Depending on the authentication result, the system records the login activity through </w:t>
+      </w:r>
+      <w:proofErr w:type="spellStart"/>
+      <w:r>
+        <w:rPr>
+          <w:rFonts w:ascii="Arial" w:hAnsi="Arial" w:cs="Arial"/>
+        </w:rPr>
+        <w:t>AuditService</w:t>
+      </w:r>
+      <w:proofErr w:type="spellEnd"/>
+      <w:r>
+        <w:rPr>
+          <w:rFonts w:ascii="Arial" w:hAnsi="Arial" w:cs="Arial"/>
+        </w:rPr>
+        <w:t xml:space="preserve"> and either displays the student dashboard for successful login or an error message for invalid credentials. After successful authentication, the student </w:t>
+      </w:r>
+      <w:proofErr w:type="gramStart"/>
+      <w:r>
+        <w:rPr>
+          <w:rFonts w:ascii="Arial" w:hAnsi="Arial" w:cs="Arial"/>
+        </w:rPr>
+        <w:t>is able to</w:t>
+      </w:r>
+      <w:proofErr w:type="gramEnd"/>
+      <w:r>
+        <w:rPr>
+          <w:rFonts w:ascii="Arial" w:hAnsi="Arial" w:cs="Arial"/>
+        </w:rPr>
+        <w:t xml:space="preserve"> continue accessing system functions such as searching, viewing, and selecting available courses.</w:t>
       </w:r>
     </w:p>
     <w:p>
       <w:pPr>
+        <w:keepNext/>
+        <w:spacing w:after="0" w:line="360" w:lineRule="auto"/>
+        <w:ind w:left="567"/>
+        <w:jc w:val="both"/>
+        <w:rPr>
+          <w:rFonts w:ascii="Arial" w:hAnsi="Arial" w:cs="Arial"/>
+        </w:rPr>
+      </w:pPr>
+      <w:r>
+        <w:rPr>
+          <w:rFonts w:ascii="Arial" w:hAnsi="Arial" w:cs="Arial"/>
+          <w:noProof/>
+        </w:rPr>
+        <w:drawing>
+          <wp:inline distT="0" distB="0" distL="0" distR="0" wp14:anchorId="46D0216C" wp14:editId="49D55EE8">
+            <wp:extent cx="5939155" cy="3005455"/>
+            <wp:effectExtent l="19050" t="19050" r="23495" b="23495"/>
+            <wp:docPr id="2131821543" name="Picture 3"/>
+            <wp:cNvGraphicFramePr>
+              <a:graphicFrameLocks xmlns:a="http://schemas.openxmlformats.org/drawingml/2006/main" noChangeAspect="1"/>
+            </wp:cNvGraphicFramePr>
+            <a:graphic xmlns:a="http://schemas.openxmlformats.org/drawingml/2006/main">
+              <a:graphicData uri="http://schemas.openxmlformats.org/drawingml/2006/picture">
+                <pic:pic xmlns:pic="http://schemas.openxmlformats.org/drawingml/2006/picture">
+                  <pic:nvPicPr>
+                    <pic:cNvPr id="0" name="Picture 3"/>
+                    <pic:cNvPicPr>
+                      <a:picLocks noChangeAspect="1" noChangeArrowheads="1"/>
+                    </pic:cNvPicPr>
+                  </pic:nvPicPr>
+                  <pic:blipFill>
+                    <a:blip r:embed="rId12">
+                      <a:extLst>
+                        <a:ext uri="{28A0092B-C50C-407E-A947-70E740481C1C}">
+                          <a14:useLocalDpi xmlns:a14="http://schemas.microsoft.com/office/drawing/2010/main" val="0"/>
+                        </a:ext>
+                      </a:extLst>
+                    </a:blip>
+                    <a:srcRect/>
+                    <a:stretch>
+                      <a:fillRect/>
+                    </a:stretch>
+                  </pic:blipFill>
+                  <pic:spPr bwMode="auto">
+                    <a:xfrm>
+                      <a:off x="0" y="0"/>
+                      <a:ext cx="5939155" cy="3005455"/>
+                    </a:xfrm>
+                    <a:prstGeom prst="rect">
+                      <a:avLst/>
+                    </a:prstGeom>
+                    <a:noFill/>
+                    <a:ln>
+                      <a:solidFill>
+                        <a:schemeClr val="bg1">
+                          <a:lumMod val="85000"/>
+                        </a:schemeClr>
+                      </a:solidFill>
+                    </a:ln>
+                  </pic:spPr>
+                </pic:pic>
+              </a:graphicData>
+            </a:graphic>
+          </wp:inline>
+        </w:drawing>
+      </w:r>
+    </w:p>
+    <w:p>
+      <w:pPr>
+        <w:pStyle w:val="Caption"/>
+        <w:ind w:left="567"/>
+        <w:jc w:val="both"/>
+        <w:rPr>
+          <w:rFonts w:ascii="Arial" w:hAnsi="Arial" w:cs="Arial"/>
+          <w:b/>
+          <w:bCs/>
+          <w:i w:val="0"/>
+          <w:iCs w:val="0"/>
+          <w:color w:val="215E99" w:themeColor="text2" w:themeTint="BF"/>
+          <w:sz w:val="24"/>
+          <w:szCs w:val="24"/>
+        </w:rPr>
+      </w:pPr>
+      <w:r>
+        <w:rPr>
+          <w:rFonts w:ascii="Arial" w:hAnsi="Arial" w:cs="Arial"/>
+          <w:b/>
+          <w:bCs/>
+          <w:i w:val="0"/>
+          <w:iCs w:val="0"/>
+          <w:color w:val="215E99" w:themeColor="text2" w:themeTint="BF"/>
+          <w:sz w:val="24"/>
+          <w:szCs w:val="24"/>
+        </w:rPr>
+        <w:t xml:space="preserve">Figure </w:t>
+      </w:r>
+      <w:r>
+        <w:rPr>
+          <w:rFonts w:ascii="Arial" w:hAnsi="Arial" w:cs="Arial"/>
+          <w:b/>
+          <w:bCs/>
+          <w:i w:val="0"/>
+          <w:iCs w:val="0"/>
+          <w:color w:val="215E99" w:themeColor="text2" w:themeTint="BF"/>
+          <w:sz w:val="24"/>
+          <w:szCs w:val="24"/>
+        </w:rPr>
+        <w:fldChar w:fldCharType="begin"/>
+      </w:r>
+      <w:r>
+        <w:rPr>
+          <w:rFonts w:ascii="Arial" w:hAnsi="Arial" w:cs="Arial"/>
+          <w:b/>
+          <w:bCs/>
+          <w:i w:val="0"/>
+          <w:iCs w:val="0"/>
+          <w:color w:val="215E99" w:themeColor="text2" w:themeTint="BF"/>
+          <w:sz w:val="24"/>
+          <w:szCs w:val="24"/>
+        </w:rPr>
+        <w:instrText xml:space="preserve"> SEQ Figure \* ARABIC </w:instrText>
+      </w:r>
+      <w:r>
+        <w:rPr>
+          <w:rFonts w:ascii="Arial" w:hAnsi="Arial" w:cs="Arial"/>
+          <w:b/>
+          <w:bCs/>
+          <w:i w:val="0"/>
+          <w:iCs w:val="0"/>
+          <w:color w:val="215E99" w:themeColor="text2" w:themeTint="BF"/>
+          <w:sz w:val="24"/>
+          <w:szCs w:val="24"/>
+        </w:rPr>
+        <w:fldChar w:fldCharType="separate"/>
+      </w:r>
+      <w:r>
+        <w:rPr>
+          <w:rFonts w:ascii="Arial" w:hAnsi="Arial" w:cs="Arial"/>
+          <w:b/>
+          <w:bCs/>
+          <w:i w:val="0"/>
+          <w:iCs w:val="0"/>
+          <w:noProof/>
+          <w:color w:val="215E99" w:themeColor="text2" w:themeTint="BF"/>
+          <w:sz w:val="24"/>
+          <w:szCs w:val="24"/>
+        </w:rPr>
+        <w:t>3</w:t>
+      </w:r>
+      <w:r>
+        <w:rPr>
+          <w:rFonts w:ascii="Arial" w:hAnsi="Arial" w:cs="Arial"/>
+          <w:b/>
+          <w:bCs/>
+          <w:i w:val="0"/>
+          <w:iCs w:val="0"/>
+          <w:color w:val="215E99" w:themeColor="text2" w:themeTint="BF"/>
+          <w:sz w:val="24"/>
+          <w:szCs w:val="24"/>
+        </w:rPr>
+        <w:fldChar w:fldCharType="end"/>
+      </w:r>
+      <w:r>
+        <w:rPr>
+          <w:rFonts w:ascii="Arial" w:hAnsi="Arial" w:cs="Arial"/>
+          <w:b/>
+          <w:bCs/>
+          <w:i w:val="0"/>
+          <w:iCs w:val="0"/>
+          <w:color w:val="215E99" w:themeColor="text2" w:themeTint="BF"/>
+          <w:sz w:val="24"/>
+          <w:szCs w:val="24"/>
+        </w:rPr>
+        <w:t xml:space="preserve">: </w:t>
+      </w:r>
+      <w:r>
+        <w:rPr>
+          <w:rFonts w:ascii="Arial" w:hAnsi="Arial" w:cs="Arial"/>
+          <w:b/>
+          <w:bCs/>
+          <w:i w:val="0"/>
+          <w:iCs w:val="0"/>
+          <w:color w:val="215E99" w:themeColor="text2" w:themeTint="BF"/>
+          <w:sz w:val="24"/>
+          <w:szCs w:val="24"/>
+        </w:rPr>
+        <w:t xml:space="preserve">Sequence </w:t>
+      </w:r>
+      <w:r>
+        <w:rPr>
+          <w:rFonts w:ascii="Arial" w:hAnsi="Arial" w:cs="Arial"/>
+          <w:b/>
+          <w:bCs/>
+          <w:i w:val="0"/>
+          <w:iCs w:val="0"/>
+          <w:color w:val="215E99" w:themeColor="text2" w:themeTint="BF"/>
+          <w:sz w:val="24"/>
+          <w:szCs w:val="24"/>
+        </w:rPr>
+        <w:t>d</w:t>
+      </w:r>
+      <w:r>
+        <w:rPr>
+          <w:rFonts w:ascii="Arial" w:hAnsi="Arial" w:cs="Arial"/>
+          <w:b/>
+          <w:bCs/>
+          <w:i w:val="0"/>
+          <w:iCs w:val="0"/>
+          <w:color w:val="215E99" w:themeColor="text2" w:themeTint="BF"/>
+          <w:sz w:val="24"/>
+          <w:szCs w:val="24"/>
+        </w:rPr>
+        <w:t xml:space="preserve">iagram of </w:t>
+      </w:r>
+      <w:r>
+        <w:rPr>
+          <w:rFonts w:ascii="Arial" w:hAnsi="Arial" w:cs="Arial"/>
+          <w:b/>
+          <w:bCs/>
+          <w:i w:val="0"/>
+          <w:iCs w:val="0"/>
+          <w:color w:val="215E99" w:themeColor="text2" w:themeTint="BF"/>
+          <w:sz w:val="24"/>
+          <w:szCs w:val="24"/>
+        </w:rPr>
+        <w:t>S</w:t>
+      </w:r>
+      <w:r>
+        <w:rPr>
+          <w:rFonts w:ascii="Arial" w:hAnsi="Arial" w:cs="Arial"/>
+          <w:b/>
+          <w:bCs/>
+          <w:i w:val="0"/>
+          <w:iCs w:val="0"/>
+          <w:color w:val="215E99" w:themeColor="text2" w:themeTint="BF"/>
+          <w:sz w:val="24"/>
+          <w:szCs w:val="24"/>
+        </w:rPr>
+        <w:t xml:space="preserve">tudent </w:t>
+      </w:r>
+      <w:r>
+        <w:rPr>
+          <w:rFonts w:ascii="Arial" w:hAnsi="Arial" w:cs="Arial"/>
+          <w:b/>
+          <w:bCs/>
+          <w:i w:val="0"/>
+          <w:iCs w:val="0"/>
+          <w:color w:val="215E99" w:themeColor="text2" w:themeTint="BF"/>
+          <w:sz w:val="24"/>
+          <w:szCs w:val="24"/>
+        </w:rPr>
+        <w:t>L</w:t>
+      </w:r>
+      <w:r>
+        <w:rPr>
+          <w:rFonts w:ascii="Arial" w:hAnsi="Arial" w:cs="Arial"/>
+          <w:b/>
+          <w:bCs/>
+          <w:i w:val="0"/>
+          <w:iCs w:val="0"/>
+          <w:color w:val="215E99" w:themeColor="text2" w:themeTint="BF"/>
+          <w:sz w:val="24"/>
+          <w:szCs w:val="24"/>
+        </w:rPr>
+        <w:t xml:space="preserve">ogin </w:t>
+      </w:r>
+      <w:r>
+        <w:rPr>
+          <w:rFonts w:ascii="Arial" w:hAnsi="Arial" w:cs="Arial"/>
+          <w:b/>
+          <w:bCs/>
+          <w:i w:val="0"/>
+          <w:iCs w:val="0"/>
+          <w:color w:val="215E99" w:themeColor="text2" w:themeTint="BF"/>
+          <w:sz w:val="24"/>
+          <w:szCs w:val="24"/>
+        </w:rPr>
+        <w:t>P</w:t>
+      </w:r>
+      <w:r>
+        <w:rPr>
+          <w:rFonts w:ascii="Arial" w:hAnsi="Arial" w:cs="Arial"/>
+          <w:b/>
+          <w:bCs/>
+          <w:i w:val="0"/>
+          <w:iCs w:val="0"/>
+          <w:color w:val="215E99" w:themeColor="text2" w:themeTint="BF"/>
+          <w:sz w:val="24"/>
+          <w:szCs w:val="24"/>
+        </w:rPr>
+        <w:t>rocess</w:t>
+      </w:r>
+    </w:p>
+    <w:p>
+      <w:pPr>
+        <w:keepNext/>
+        <w:spacing w:after="0" w:line="360" w:lineRule="auto"/>
+        <w:ind w:left="567"/>
+        <w:jc w:val="both"/>
+        <w:rPr>
+          <w:rFonts w:ascii="Arial" w:hAnsi="Arial" w:cs="Arial"/>
+        </w:rPr>
+      </w:pPr>
+      <w:r>
+        <w:rPr>
+          <w:rFonts w:ascii="Arial" w:hAnsi="Arial" w:cs="Arial"/>
+        </w:rPr>
+        <w:lastRenderedPageBreak/>
+        <w:t xml:space="preserve">The second sequence diagram represents the course selection and enrolment submission process. It illustrates how a student searches for available courses, views course details, and selects a course based on availability. The process is modelled as an iterative loop, allowing the student to repeat searching and selection until they decide to submit an enrolment request. When a course is available, an </w:t>
+      </w:r>
+      <w:proofErr w:type="spellStart"/>
+      <w:r>
+        <w:rPr>
+          <w:rFonts w:ascii="Arial" w:hAnsi="Arial" w:cs="Arial"/>
+        </w:rPr>
+        <w:t>EnrolmentRequest</w:t>
+      </w:r>
+      <w:proofErr w:type="spellEnd"/>
+      <w:r>
+        <w:rPr>
+          <w:rFonts w:ascii="Arial" w:hAnsi="Arial" w:cs="Arial"/>
+        </w:rPr>
+        <w:t xml:space="preserve"> is created if it does not already exist, and the selected course is added to the request. Finally, the student submits the enrolment, where the request is finalised and processed by the system, and the action is recorded by the </w:t>
+      </w:r>
+      <w:proofErr w:type="spellStart"/>
+      <w:r>
+        <w:rPr>
+          <w:rFonts w:ascii="Arial" w:hAnsi="Arial" w:cs="Arial"/>
+        </w:rPr>
+        <w:t>AuditService</w:t>
+      </w:r>
+      <w:proofErr w:type="spellEnd"/>
+      <w:r>
+        <w:rPr>
+          <w:rFonts w:ascii="Arial" w:hAnsi="Arial" w:cs="Arial"/>
+        </w:rPr>
+        <w:t xml:space="preserve"> to ensure traceability and accountability within the system.</w:t>
+      </w:r>
+    </w:p>
+    <w:p>
+      <w:pPr>
+        <w:keepNext/>
+        <w:spacing w:after="0" w:line="360" w:lineRule="auto"/>
+        <w:ind w:left="567"/>
+        <w:jc w:val="both"/>
+      </w:pPr>
+      <w:r>
+        <w:rPr>
+          <w:rFonts w:ascii="Arial" w:hAnsi="Arial" w:cs="Arial"/>
+          <w:noProof/>
+        </w:rPr>
+        <w:drawing>
+          <wp:inline distT="0" distB="0" distL="0" distR="0" wp14:anchorId="2AE295D1" wp14:editId="4F54AE92">
+            <wp:extent cx="5061600" cy="5379032"/>
+            <wp:effectExtent l="19050" t="19050" r="24765" b="12700"/>
+            <wp:docPr id="2051698132" name="Picture 5"/>
+            <wp:cNvGraphicFramePr>
+              <a:graphicFrameLocks xmlns:a="http://schemas.openxmlformats.org/drawingml/2006/main" noChangeAspect="1"/>
+            </wp:cNvGraphicFramePr>
+            <a:graphic xmlns:a="http://schemas.openxmlformats.org/drawingml/2006/main">
+              <a:graphicData uri="http://schemas.openxmlformats.org/drawingml/2006/picture">
+                <pic:pic xmlns:pic="http://schemas.openxmlformats.org/drawingml/2006/picture">
+                  <pic:nvPicPr>
+                    <pic:cNvPr id="0" name="Picture 5"/>
+                    <pic:cNvPicPr>
+                      <a:picLocks noChangeAspect="1" noChangeArrowheads="1"/>
+                    </pic:cNvPicPr>
+                  </pic:nvPicPr>
+                  <pic:blipFill>
+                    <a:blip r:embed="rId13">
+                      <a:extLst>
+                        <a:ext uri="{28A0092B-C50C-407E-A947-70E740481C1C}">
+                          <a14:useLocalDpi xmlns:a14="http://schemas.microsoft.com/office/drawing/2010/main" val="0"/>
+                        </a:ext>
+                      </a:extLst>
+                    </a:blip>
+                    <a:srcRect/>
+                    <a:stretch>
+                      <a:fillRect/>
+                    </a:stretch>
+                  </pic:blipFill>
+                  <pic:spPr bwMode="auto">
+                    <a:xfrm>
+                      <a:off x="0" y="0"/>
+                      <a:ext cx="5061600" cy="5379032"/>
+                    </a:xfrm>
+                    <a:prstGeom prst="rect">
+                      <a:avLst/>
+                    </a:prstGeom>
+                    <a:noFill/>
+                    <a:ln>
+                      <a:solidFill>
+                        <a:schemeClr val="bg1">
+                          <a:lumMod val="85000"/>
+                        </a:schemeClr>
+                      </a:solidFill>
+                    </a:ln>
+                  </pic:spPr>
+                </pic:pic>
+              </a:graphicData>
+            </a:graphic>
+          </wp:inline>
+        </w:drawing>
+      </w:r>
+    </w:p>
+    <w:p>
+      <w:pPr>
+        <w:pStyle w:val="Caption"/>
+        <w:ind w:left="567"/>
+        <w:jc w:val="both"/>
+        <w:rPr>
+          <w:rFonts w:ascii="Arial" w:hAnsi="Arial" w:cs="Arial"/>
+          <w:b/>
+          <w:bCs/>
+          <w:i w:val="0"/>
+          <w:iCs w:val="0"/>
+          <w:color w:val="215E99" w:themeColor="text2" w:themeTint="BF"/>
+          <w:sz w:val="24"/>
+          <w:szCs w:val="24"/>
+        </w:rPr>
+      </w:pPr>
+      <w:r>
+        <w:rPr>
+          <w:rFonts w:ascii="Arial" w:hAnsi="Arial" w:cs="Arial"/>
+          <w:b/>
+          <w:bCs/>
+          <w:i w:val="0"/>
+          <w:iCs w:val="0"/>
+          <w:color w:val="215E99" w:themeColor="text2" w:themeTint="BF"/>
+          <w:sz w:val="24"/>
+          <w:szCs w:val="24"/>
+        </w:rPr>
+        <w:t xml:space="preserve">Figure </w:t>
+      </w:r>
+      <w:r>
+        <w:rPr>
+          <w:rFonts w:ascii="Arial" w:hAnsi="Arial" w:cs="Arial"/>
+          <w:b/>
+          <w:bCs/>
+          <w:i w:val="0"/>
+          <w:iCs w:val="0"/>
+          <w:color w:val="215E99" w:themeColor="text2" w:themeTint="BF"/>
+          <w:sz w:val="24"/>
+          <w:szCs w:val="24"/>
+        </w:rPr>
+        <w:fldChar w:fldCharType="begin"/>
+      </w:r>
+      <w:r>
+        <w:rPr>
+          <w:rFonts w:ascii="Arial" w:hAnsi="Arial" w:cs="Arial"/>
+          <w:b/>
+          <w:bCs/>
+          <w:i w:val="0"/>
+          <w:iCs w:val="0"/>
+          <w:color w:val="215E99" w:themeColor="text2" w:themeTint="BF"/>
+          <w:sz w:val="24"/>
+          <w:szCs w:val="24"/>
+        </w:rPr>
+        <w:instrText xml:space="preserve"> SEQ Figure \* ARABIC </w:instrText>
+      </w:r>
+      <w:r>
+        <w:rPr>
+          <w:rFonts w:ascii="Arial" w:hAnsi="Arial" w:cs="Arial"/>
+          <w:b/>
+          <w:bCs/>
+          <w:i w:val="0"/>
+          <w:iCs w:val="0"/>
+          <w:color w:val="215E99" w:themeColor="text2" w:themeTint="BF"/>
+          <w:sz w:val="24"/>
+          <w:szCs w:val="24"/>
+        </w:rPr>
+        <w:fldChar w:fldCharType="separate"/>
+      </w:r>
+      <w:r>
+        <w:rPr>
+          <w:rFonts w:ascii="Arial" w:hAnsi="Arial" w:cs="Arial"/>
+          <w:b/>
+          <w:bCs/>
+          <w:i w:val="0"/>
+          <w:iCs w:val="0"/>
+          <w:noProof/>
+          <w:color w:val="215E99" w:themeColor="text2" w:themeTint="BF"/>
+          <w:sz w:val="24"/>
+          <w:szCs w:val="24"/>
+        </w:rPr>
+        <w:t>4</w:t>
+      </w:r>
+      <w:r>
+        <w:rPr>
+          <w:rFonts w:ascii="Arial" w:hAnsi="Arial" w:cs="Arial"/>
+          <w:b/>
+          <w:bCs/>
+          <w:i w:val="0"/>
+          <w:iCs w:val="0"/>
+          <w:color w:val="215E99" w:themeColor="text2" w:themeTint="BF"/>
+          <w:sz w:val="24"/>
+          <w:szCs w:val="24"/>
+        </w:rPr>
+        <w:fldChar w:fldCharType="end"/>
+      </w:r>
+      <w:r>
+        <w:rPr>
+          <w:rFonts w:ascii="Arial" w:hAnsi="Arial" w:cs="Arial"/>
+          <w:b/>
+          <w:bCs/>
+          <w:i w:val="0"/>
+          <w:iCs w:val="0"/>
+          <w:color w:val="215E99" w:themeColor="text2" w:themeTint="BF"/>
+          <w:sz w:val="24"/>
+          <w:szCs w:val="24"/>
+        </w:rPr>
+        <w:t xml:space="preserve">: Sequence diagram of </w:t>
+      </w:r>
+      <w:r>
+        <w:rPr>
+          <w:rFonts w:ascii="Arial" w:hAnsi="Arial" w:cs="Arial"/>
+          <w:b/>
+          <w:bCs/>
+          <w:i w:val="0"/>
+          <w:iCs w:val="0"/>
+          <w:color w:val="215E99" w:themeColor="text2" w:themeTint="BF"/>
+          <w:sz w:val="24"/>
+          <w:szCs w:val="24"/>
+        </w:rPr>
+        <w:t>Course Selection and Enrolment Submission Process</w:t>
+      </w:r>
+    </w:p>
+    <w:p>
+      <w:pPr>
         <w:spacing w:line="360" w:lineRule="auto"/>
         <w:ind w:left="567"/>
+        <w:jc w:val="both"/>
+        <w:rPr>
+          <w:rFonts w:ascii="Arial" w:hAnsi="Arial" w:cs="Arial"/>
+        </w:rPr>
+      </w:pPr>
+      <w:r>
+        <w:rPr>
+          <w:rFonts w:ascii="Arial" w:hAnsi="Arial" w:cs="Arial"/>
+        </w:rPr>
+        <w:lastRenderedPageBreak/>
+        <w:t xml:space="preserve">The third sequence diagram represents the enrolment review and approval process performed by </w:t>
+      </w:r>
+      <w:proofErr w:type="spellStart"/>
+      <w:r>
+        <w:rPr>
+          <w:rFonts w:ascii="Arial" w:hAnsi="Arial" w:cs="Arial"/>
+        </w:rPr>
+        <w:t>RegistryStaff</w:t>
+      </w:r>
+      <w:proofErr w:type="spellEnd"/>
+      <w:r>
+        <w:rPr>
+          <w:rFonts w:ascii="Arial" w:hAnsi="Arial" w:cs="Arial"/>
+        </w:rPr>
+        <w:t xml:space="preserve">. It illustrates how </w:t>
+      </w:r>
+      <w:proofErr w:type="spellStart"/>
+      <w:r>
+        <w:rPr>
+          <w:rFonts w:ascii="Arial" w:hAnsi="Arial" w:cs="Arial"/>
+        </w:rPr>
+        <w:t>RegistryStaff</w:t>
+      </w:r>
+      <w:proofErr w:type="spellEnd"/>
+      <w:r>
+        <w:rPr>
+          <w:rFonts w:ascii="Arial" w:hAnsi="Arial" w:cs="Arial"/>
+        </w:rPr>
+        <w:t xml:space="preserve"> initiates the review of an enrolment request by accessing the student’s academic record, payment status, and insurance information through the system UI. The system interacts with the enrolment request and external services, including </w:t>
+      </w:r>
+      <w:proofErr w:type="spellStart"/>
+      <w:r>
+        <w:rPr>
+          <w:rFonts w:ascii="Arial" w:hAnsi="Arial" w:cs="Arial"/>
+        </w:rPr>
+        <w:t>IStudentInfoSystem</w:t>
+      </w:r>
+      <w:proofErr w:type="spellEnd"/>
+      <w:r>
+        <w:rPr>
+          <w:rFonts w:ascii="Arial" w:hAnsi="Arial" w:cs="Arial"/>
+        </w:rPr>
+        <w:t xml:space="preserve"> and </w:t>
+      </w:r>
+      <w:proofErr w:type="spellStart"/>
+      <w:r>
+        <w:rPr>
+          <w:rFonts w:ascii="Arial" w:hAnsi="Arial" w:cs="Arial"/>
+        </w:rPr>
+        <w:t>IFinanceSystem</w:t>
+      </w:r>
+      <w:proofErr w:type="spellEnd"/>
+      <w:r>
+        <w:rPr>
+          <w:rFonts w:ascii="Arial" w:hAnsi="Arial" w:cs="Arial"/>
+        </w:rPr>
+        <w:t xml:space="preserve">, to retrieve the required information. Based on </w:t>
+      </w:r>
+      <w:r>
+        <w:rPr>
+          <w:rFonts w:ascii="Arial" w:hAnsi="Arial" w:cs="Arial"/>
+        </w:rPr>
+        <w:t>this information</w:t>
+      </w:r>
+      <w:r>
+        <w:rPr>
+          <w:rFonts w:ascii="Arial" w:hAnsi="Arial" w:cs="Arial"/>
+        </w:rPr>
+        <w:t xml:space="preserve">, </w:t>
+      </w:r>
+      <w:proofErr w:type="spellStart"/>
+      <w:r>
+        <w:rPr>
+          <w:rFonts w:ascii="Arial" w:hAnsi="Arial" w:cs="Arial"/>
+        </w:rPr>
+        <w:t>RegistryStaff</w:t>
+      </w:r>
+      <w:proofErr w:type="spellEnd"/>
+      <w:r>
+        <w:rPr>
+          <w:rFonts w:ascii="Arial" w:hAnsi="Arial" w:cs="Arial"/>
+        </w:rPr>
+        <w:t xml:space="preserve"> either approves or rejects the enrolment request. The final decision is updated in the system, and the action is recorded by the </w:t>
+      </w:r>
+      <w:proofErr w:type="spellStart"/>
+      <w:r>
+        <w:rPr>
+          <w:rFonts w:ascii="Arial" w:hAnsi="Arial" w:cs="Arial"/>
+        </w:rPr>
+        <w:t>AuditService</w:t>
+      </w:r>
+      <w:proofErr w:type="spellEnd"/>
+      <w:r>
+        <w:rPr>
+          <w:rFonts w:ascii="Arial" w:hAnsi="Arial" w:cs="Arial"/>
+        </w:rPr>
+        <w:t xml:space="preserve"> to ensure traceability and accountability of administrative operations</w:t>
+      </w:r>
+      <w:r>
+        <w:rPr>
+          <w:rFonts w:ascii="Arial" w:hAnsi="Arial" w:cs="Arial"/>
+        </w:rPr>
+        <w:t>.</w:t>
+      </w:r>
+    </w:p>
+    <w:p>
+      <w:pPr>
+        <w:keepNext/>
+        <w:spacing w:after="0" w:line="360" w:lineRule="auto"/>
+        <w:ind w:left="567"/>
+        <w:jc w:val="both"/>
+      </w:pPr>
+      <w:r>
+        <w:rPr>
+          <w:rFonts w:ascii="Arial" w:hAnsi="Arial" w:cs="Arial"/>
+          <w:noProof/>
+        </w:rPr>
+        <w:drawing>
+          <wp:inline distT="0" distB="0" distL="0" distR="0" wp14:anchorId="7AFAD373" wp14:editId="3F16A1AD">
+            <wp:extent cx="5769806" cy="3370652"/>
+            <wp:effectExtent l="19050" t="19050" r="21590" b="20320"/>
+            <wp:docPr id="1419139730" name="Picture 6"/>
+            <wp:cNvGraphicFramePr>
+              <a:graphicFrameLocks xmlns:a="http://schemas.openxmlformats.org/drawingml/2006/main" noChangeAspect="1"/>
+            </wp:cNvGraphicFramePr>
+            <a:graphic xmlns:a="http://schemas.openxmlformats.org/drawingml/2006/main">
+              <a:graphicData uri="http://schemas.openxmlformats.org/drawingml/2006/picture">
+                <pic:pic xmlns:pic="http://schemas.openxmlformats.org/drawingml/2006/picture">
+                  <pic:nvPicPr>
+                    <pic:cNvPr id="0" name="Picture 6"/>
+                    <pic:cNvPicPr>
+                      <a:picLocks noChangeAspect="1" noChangeArrowheads="1"/>
+                    </pic:cNvPicPr>
+                  </pic:nvPicPr>
+                  <pic:blipFill>
+                    <a:blip r:embed="rId14">
+                      <a:extLst>
+                        <a:ext uri="{28A0092B-C50C-407E-A947-70E740481C1C}">
+                          <a14:useLocalDpi xmlns:a14="http://schemas.microsoft.com/office/drawing/2010/main" val="0"/>
+                        </a:ext>
+                      </a:extLst>
+                    </a:blip>
+                    <a:srcRect/>
+                    <a:stretch>
+                      <a:fillRect/>
+                    </a:stretch>
+                  </pic:blipFill>
+                  <pic:spPr bwMode="auto">
+                    <a:xfrm>
+                      <a:off x="0" y="0"/>
+                      <a:ext cx="5794161" cy="3384880"/>
+                    </a:xfrm>
+                    <a:prstGeom prst="rect">
+                      <a:avLst/>
+                    </a:prstGeom>
+                    <a:noFill/>
+                    <a:ln>
+                      <a:solidFill>
+                        <a:schemeClr val="bg1">
+                          <a:lumMod val="85000"/>
+                        </a:schemeClr>
+                      </a:solidFill>
+                    </a:ln>
+                  </pic:spPr>
+                </pic:pic>
+              </a:graphicData>
+            </a:graphic>
+          </wp:inline>
+        </w:drawing>
+      </w:r>
+    </w:p>
+    <w:p>
+      <w:pPr>
+        <w:pStyle w:val="Caption"/>
+        <w:ind w:left="567"/>
+        <w:jc w:val="both"/>
+        <w:rPr>
+          <w:rFonts w:ascii="Arial" w:hAnsi="Arial" w:cs="Arial"/>
+          <w:b/>
+          <w:bCs/>
+          <w:i w:val="0"/>
+          <w:iCs w:val="0"/>
+          <w:color w:val="215E99" w:themeColor="text2" w:themeTint="BF"/>
+          <w:sz w:val="24"/>
+          <w:szCs w:val="24"/>
+        </w:rPr>
+      </w:pPr>
+      <w:r>
+        <w:rPr>
+          <w:rFonts w:ascii="Arial" w:hAnsi="Arial" w:cs="Arial"/>
+          <w:b/>
+          <w:bCs/>
+          <w:i w:val="0"/>
+          <w:iCs w:val="0"/>
+          <w:color w:val="215E99" w:themeColor="text2" w:themeTint="BF"/>
+          <w:sz w:val="24"/>
+          <w:szCs w:val="24"/>
+        </w:rPr>
+        <w:t xml:space="preserve">Figure </w:t>
+      </w:r>
+      <w:r>
+        <w:rPr>
+          <w:rFonts w:ascii="Arial" w:hAnsi="Arial" w:cs="Arial"/>
+          <w:b/>
+          <w:bCs/>
+          <w:i w:val="0"/>
+          <w:iCs w:val="0"/>
+          <w:color w:val="215E99" w:themeColor="text2" w:themeTint="BF"/>
+          <w:sz w:val="24"/>
+          <w:szCs w:val="24"/>
+        </w:rPr>
+        <w:fldChar w:fldCharType="begin"/>
+      </w:r>
+      <w:r>
+        <w:rPr>
+          <w:rFonts w:ascii="Arial" w:hAnsi="Arial" w:cs="Arial"/>
+          <w:b/>
+          <w:bCs/>
+          <w:i w:val="0"/>
+          <w:iCs w:val="0"/>
+          <w:color w:val="215E99" w:themeColor="text2" w:themeTint="BF"/>
+          <w:sz w:val="24"/>
+          <w:szCs w:val="24"/>
+        </w:rPr>
+        <w:instrText xml:space="preserve"> SEQ Figure \* ARABIC </w:instrText>
+      </w:r>
+      <w:r>
+        <w:rPr>
+          <w:rFonts w:ascii="Arial" w:hAnsi="Arial" w:cs="Arial"/>
+          <w:b/>
+          <w:bCs/>
+          <w:i w:val="0"/>
+          <w:iCs w:val="0"/>
+          <w:color w:val="215E99" w:themeColor="text2" w:themeTint="BF"/>
+          <w:sz w:val="24"/>
+          <w:szCs w:val="24"/>
+        </w:rPr>
+        <w:fldChar w:fldCharType="separate"/>
+      </w:r>
+      <w:r>
+        <w:rPr>
+          <w:rFonts w:ascii="Arial" w:hAnsi="Arial" w:cs="Arial"/>
+          <w:b/>
+          <w:bCs/>
+          <w:i w:val="0"/>
+          <w:iCs w:val="0"/>
+          <w:noProof/>
+          <w:color w:val="215E99" w:themeColor="text2" w:themeTint="BF"/>
+          <w:sz w:val="24"/>
+          <w:szCs w:val="24"/>
+        </w:rPr>
+        <w:t>5</w:t>
+      </w:r>
+      <w:r>
+        <w:rPr>
+          <w:rFonts w:ascii="Arial" w:hAnsi="Arial" w:cs="Arial"/>
+          <w:b/>
+          <w:bCs/>
+          <w:i w:val="0"/>
+          <w:iCs w:val="0"/>
+          <w:color w:val="215E99" w:themeColor="text2" w:themeTint="BF"/>
+          <w:sz w:val="24"/>
+          <w:szCs w:val="24"/>
+        </w:rPr>
+        <w:fldChar w:fldCharType="end"/>
+      </w:r>
+      <w:r>
+        <w:rPr>
+          <w:rFonts w:ascii="Arial" w:hAnsi="Arial" w:cs="Arial"/>
+          <w:b/>
+          <w:bCs/>
+          <w:i w:val="0"/>
+          <w:iCs w:val="0"/>
+          <w:color w:val="215E99" w:themeColor="text2" w:themeTint="BF"/>
+          <w:sz w:val="24"/>
+          <w:szCs w:val="24"/>
+        </w:rPr>
+        <w:t xml:space="preserve">: </w:t>
+      </w:r>
+      <w:r>
+        <w:rPr>
+          <w:rFonts w:ascii="Arial" w:hAnsi="Arial" w:cs="Arial"/>
+          <w:b/>
+          <w:bCs/>
+          <w:i w:val="0"/>
+          <w:iCs w:val="0"/>
+          <w:color w:val="215E99" w:themeColor="text2" w:themeTint="BF"/>
+          <w:sz w:val="24"/>
+          <w:szCs w:val="24"/>
+        </w:rPr>
+        <w:t>Sequence Diagram of Enrolment Review and Approval Process</w:t>
+      </w:r>
+    </w:p>
+    <w:p>
+      <w:pPr>
+        <w:spacing w:line="360" w:lineRule="auto"/>
+        <w:ind w:left="567"/>
+        <w:jc w:val="both"/>
+        <w:rPr>
+          <w:rFonts w:ascii="Arial" w:hAnsi="Arial" w:cs="Arial"/>
+        </w:rPr>
+      </w:pPr>
+      <w:r>
+        <w:rPr>
+          <w:rFonts w:ascii="Arial" w:hAnsi="Arial" w:cs="Arial"/>
+        </w:rPr>
+        <w:t>These sequence diagrams provide a clearer understanding of the system workflow by showing message ordering, interaction flow, and responsibilities between classes and external systems. They also improve consistency between the UML models and the C# implementation of the Course Enrolment System.</w:t>
+      </w:r>
+    </w:p>
+    <w:p>
+      <w:pPr>
+        <w:pStyle w:val="Heading2"/>
+        <w:spacing w:before="0" w:line="360" w:lineRule="auto"/>
+        <w:ind w:left="284"/>
+        <w:jc w:val="both"/>
+        <w:rPr>
+          <w:rFonts w:ascii="Arial" w:hAnsi="Arial" w:cs="Arial"/>
+          <w:b/>
+          <w:bCs/>
+          <w:color w:val="EE0000"/>
+          <w:sz w:val="28"/>
+          <w:szCs w:val="28"/>
+        </w:rPr>
+      </w:pPr>
+      <w:r>
+        <w:rPr>
+          <w:rFonts w:ascii="Arial" w:hAnsi="Arial" w:cs="Arial"/>
+          <w:b/>
+          <w:bCs/>
+          <w:color w:val="EE0000"/>
+          <w:sz w:val="28"/>
+          <w:szCs w:val="28"/>
+        </w:rPr>
+        <w:t>2.</w:t>
+      </w:r>
+      <w:r>
+        <w:rPr>
+          <w:rFonts w:ascii="Arial" w:hAnsi="Arial" w:cs="Arial"/>
+          <w:b/>
+          <w:bCs/>
+          <w:color w:val="EE0000"/>
+          <w:sz w:val="28"/>
+          <w:szCs w:val="28"/>
+        </w:rPr>
+        <w:t>3</w:t>
+      </w:r>
+      <w:r>
+        <w:rPr>
+          <w:rFonts w:ascii="Arial" w:hAnsi="Arial" w:cs="Arial"/>
+          <w:b/>
+          <w:bCs/>
+          <w:color w:val="EE0000"/>
+          <w:sz w:val="28"/>
+          <w:szCs w:val="28"/>
+        </w:rPr>
+        <w:t xml:space="preserve">. Activity </w:t>
+      </w:r>
+      <w:r>
+        <w:rPr>
+          <w:rFonts w:ascii="Arial" w:hAnsi="Arial" w:cs="Arial"/>
+          <w:b/>
+          <w:bCs/>
+          <w:color w:val="EE0000"/>
+          <w:sz w:val="28"/>
+          <w:szCs w:val="28"/>
+        </w:rPr>
+        <w:t>diagram</w:t>
+      </w:r>
+    </w:p>
+    <w:p>
+      <w:pPr>
+        <w:spacing w:line="360" w:lineRule="auto"/>
+        <w:ind w:left="720"/>
+        <w:jc w:val="both"/>
+        <w:rPr>
+          <w:rFonts w:ascii="Arial" w:hAnsi="Arial" w:cs="Arial"/>
+        </w:rPr>
+      </w:pPr>
+      <w:r>
+        <w:rPr>
+          <w:rFonts w:ascii="Arial" w:hAnsi="Arial" w:cs="Arial"/>
+        </w:rPr>
+        <w:t xml:space="preserve">To further represent the dynamic behaviour of the Course Enrolment System, activity diagrams were developed to model key system workflows. Unlike </w:t>
+      </w:r>
+      <w:r>
+        <w:rPr>
+          <w:rFonts w:ascii="Arial" w:hAnsi="Arial" w:cs="Arial"/>
+        </w:rPr>
+        <w:lastRenderedPageBreak/>
+        <w:t xml:space="preserve">sequence diagrams, which focus on object interactions, activity diagrams provide a clearer representation of process flow, decision-making, and responsibilities between users, system components, and external services </w:t>
+      </w:r>
+      <w:proofErr w:type="gramStart"/>
+      <w:r>
+        <w:rPr>
+          <w:rFonts w:ascii="Arial" w:hAnsi="Arial" w:cs="Arial"/>
+        </w:rPr>
+        <w:t>through the use of</w:t>
+      </w:r>
+      <w:proofErr w:type="gramEnd"/>
+      <w:r>
+        <w:rPr>
+          <w:rFonts w:ascii="Arial" w:hAnsi="Arial" w:cs="Arial"/>
+        </w:rPr>
+        <w:t xml:space="preserve"> </w:t>
+      </w:r>
+      <w:proofErr w:type="spellStart"/>
+      <w:r>
+        <w:rPr>
+          <w:rFonts w:ascii="Arial" w:hAnsi="Arial" w:cs="Arial"/>
+        </w:rPr>
+        <w:t>swimlanes</w:t>
+      </w:r>
+      <w:proofErr w:type="spellEnd"/>
+      <w:r>
+        <w:rPr>
+          <w:rFonts w:ascii="Arial" w:hAnsi="Arial" w:cs="Arial"/>
+        </w:rPr>
+        <w:t>.</w:t>
+      </w:r>
+    </w:p>
+    <w:p>
+      <w:pPr>
+        <w:spacing w:line="360" w:lineRule="auto"/>
+        <w:ind w:left="720"/>
+        <w:jc w:val="both"/>
+        <w:rPr>
+          <w:rFonts w:ascii="Arial" w:hAnsi="Arial" w:cs="Arial"/>
+        </w:rPr>
+      </w:pPr>
+      <w:r>
+        <w:rPr>
+          <w:rFonts w:ascii="Arial" w:hAnsi="Arial" w:cs="Arial"/>
+        </w:rPr>
+        <w:t xml:space="preserve">The first activity diagram represents the student course enrolment process. It models the workflow from student login, course searching, viewing course details, selecting available courses, and submitting an enrolment request. Decision nodes are used to represent business rules such as login validation, course availability, and whether additional courses are added before submission. Once submitted, the system creates an enrolment request with a pending status and records the activity through the </w:t>
+      </w:r>
+      <w:proofErr w:type="spellStart"/>
+      <w:r>
+        <w:rPr>
+          <w:rFonts w:ascii="Arial" w:hAnsi="Arial" w:cs="Arial"/>
+        </w:rPr>
+        <w:t>AuditService</w:t>
+      </w:r>
+      <w:proofErr w:type="spellEnd"/>
+      <w:r>
+        <w:rPr>
+          <w:rFonts w:ascii="Arial" w:hAnsi="Arial" w:cs="Arial"/>
+        </w:rPr>
+        <w:t>.</w:t>
+      </w:r>
+    </w:p>
+    <w:p>
+      <w:pPr>
+        <w:keepNext/>
+        <w:spacing w:after="0" w:line="360" w:lineRule="auto"/>
+        <w:ind w:left="720"/>
+        <w:jc w:val="both"/>
+      </w:pPr>
+      <w:r>
+        <w:rPr>
+          <w:rFonts w:ascii="Arial" w:hAnsi="Arial" w:cs="Arial"/>
+          <w:noProof/>
+        </w:rPr>
+        <w:drawing>
+          <wp:inline distT="0" distB="0" distL="0" distR="0" wp14:anchorId="68444362" wp14:editId="32C5C8B8">
+            <wp:extent cx="5490000" cy="4864936"/>
+            <wp:effectExtent l="0" t="0" r="0" b="0"/>
+            <wp:docPr id="554039119" name="Picture 7"/>
+            <wp:cNvGraphicFramePr>
+              <a:graphicFrameLocks xmlns:a="http://schemas.openxmlformats.org/drawingml/2006/main" noChangeAspect="1"/>
+            </wp:cNvGraphicFramePr>
+            <a:graphic xmlns:a="http://schemas.openxmlformats.org/drawingml/2006/main">
+              <a:graphicData uri="http://schemas.openxmlformats.org/drawingml/2006/picture">
+                <pic:pic xmlns:pic="http://schemas.openxmlformats.org/drawingml/2006/picture">
+                  <pic:nvPicPr>
+                    <pic:cNvPr id="0" name="Picture 7"/>
+                    <pic:cNvPicPr>
+                      <a:picLocks noChangeAspect="1" noChangeArrowheads="1"/>
+                    </pic:cNvPicPr>
+                  </pic:nvPicPr>
+                  <pic:blipFill>
+                    <a:blip r:embed="rId15">
+                      <a:extLst>
+                        <a:ext uri="{28A0092B-C50C-407E-A947-70E740481C1C}">
+                          <a14:useLocalDpi xmlns:a14="http://schemas.microsoft.com/office/drawing/2010/main" val="0"/>
+                        </a:ext>
+                      </a:extLst>
+                    </a:blip>
+                    <a:srcRect/>
+                    <a:stretch>
+                      <a:fillRect/>
+                    </a:stretch>
+                  </pic:blipFill>
+                  <pic:spPr bwMode="auto">
+                    <a:xfrm>
+                      <a:off x="0" y="0"/>
+                      <a:ext cx="5490000" cy="4864936"/>
+                    </a:xfrm>
+                    <a:prstGeom prst="rect">
+                      <a:avLst/>
+                    </a:prstGeom>
+                    <a:noFill/>
+                    <a:ln>
+                      <a:noFill/>
+                    </a:ln>
+                  </pic:spPr>
+                </pic:pic>
+              </a:graphicData>
+            </a:graphic>
+          </wp:inline>
+        </w:drawing>
+      </w:r>
+    </w:p>
+    <w:p>
+      <w:pPr>
+        <w:pStyle w:val="Caption"/>
+        <w:ind w:left="709"/>
+        <w:jc w:val="both"/>
+        <w:rPr>
+          <w:rFonts w:ascii="Arial" w:hAnsi="Arial" w:cs="Arial"/>
+          <w:b/>
+          <w:bCs/>
+          <w:i w:val="0"/>
+          <w:iCs w:val="0"/>
+          <w:color w:val="215E99" w:themeColor="text2" w:themeTint="BF"/>
+          <w:sz w:val="24"/>
+          <w:szCs w:val="24"/>
+        </w:rPr>
+      </w:pPr>
+      <w:r>
+        <w:rPr>
+          <w:rFonts w:ascii="Arial" w:hAnsi="Arial" w:cs="Arial"/>
+          <w:b/>
+          <w:bCs/>
+          <w:i w:val="0"/>
+          <w:iCs w:val="0"/>
+          <w:color w:val="215E99" w:themeColor="text2" w:themeTint="BF"/>
+          <w:sz w:val="24"/>
+          <w:szCs w:val="24"/>
+        </w:rPr>
+        <w:t xml:space="preserve">Figure </w:t>
+      </w:r>
+      <w:r>
+        <w:rPr>
+          <w:rFonts w:ascii="Arial" w:hAnsi="Arial" w:cs="Arial"/>
+          <w:b/>
+          <w:bCs/>
+          <w:i w:val="0"/>
+          <w:iCs w:val="0"/>
+          <w:color w:val="215E99" w:themeColor="text2" w:themeTint="BF"/>
+          <w:sz w:val="24"/>
+          <w:szCs w:val="24"/>
+        </w:rPr>
+        <w:fldChar w:fldCharType="begin"/>
+      </w:r>
+      <w:r>
+        <w:rPr>
+          <w:rFonts w:ascii="Arial" w:hAnsi="Arial" w:cs="Arial"/>
+          <w:b/>
+          <w:bCs/>
+          <w:i w:val="0"/>
+          <w:iCs w:val="0"/>
+          <w:color w:val="215E99" w:themeColor="text2" w:themeTint="BF"/>
+          <w:sz w:val="24"/>
+          <w:szCs w:val="24"/>
+        </w:rPr>
+        <w:instrText xml:space="preserve"> SEQ Figure \* ARABIC </w:instrText>
+      </w:r>
+      <w:r>
+        <w:rPr>
+          <w:rFonts w:ascii="Arial" w:hAnsi="Arial" w:cs="Arial"/>
+          <w:b/>
+          <w:bCs/>
+          <w:i w:val="0"/>
+          <w:iCs w:val="0"/>
+          <w:color w:val="215E99" w:themeColor="text2" w:themeTint="BF"/>
+          <w:sz w:val="24"/>
+          <w:szCs w:val="24"/>
+        </w:rPr>
+        <w:fldChar w:fldCharType="separate"/>
+      </w:r>
+      <w:r>
+        <w:rPr>
+          <w:rFonts w:ascii="Arial" w:hAnsi="Arial" w:cs="Arial"/>
+          <w:b/>
+          <w:bCs/>
+          <w:i w:val="0"/>
+          <w:iCs w:val="0"/>
+          <w:noProof/>
+          <w:color w:val="215E99" w:themeColor="text2" w:themeTint="BF"/>
+          <w:sz w:val="24"/>
+          <w:szCs w:val="24"/>
+        </w:rPr>
+        <w:t>6</w:t>
+      </w:r>
+      <w:r>
+        <w:rPr>
+          <w:rFonts w:ascii="Arial" w:hAnsi="Arial" w:cs="Arial"/>
+          <w:b/>
+          <w:bCs/>
+          <w:i w:val="0"/>
+          <w:iCs w:val="0"/>
+          <w:color w:val="215E99" w:themeColor="text2" w:themeTint="BF"/>
+          <w:sz w:val="24"/>
+          <w:szCs w:val="24"/>
+        </w:rPr>
+        <w:fldChar w:fldCharType="end"/>
+      </w:r>
+      <w:r>
+        <w:rPr>
+          <w:rFonts w:ascii="Arial" w:hAnsi="Arial" w:cs="Arial"/>
+          <w:b/>
+          <w:bCs/>
+          <w:i w:val="0"/>
+          <w:iCs w:val="0"/>
+          <w:color w:val="215E99" w:themeColor="text2" w:themeTint="BF"/>
+          <w:sz w:val="24"/>
+          <w:szCs w:val="24"/>
+        </w:rPr>
+        <w:t>: Activity diagram of Student Course Enrolment Process</w:t>
+      </w:r>
+    </w:p>
+    <w:p>
+      <w:pPr>
+        <w:keepNext/>
+        <w:spacing w:after="0" w:line="360" w:lineRule="auto"/>
+        <w:ind w:left="720"/>
+        <w:jc w:val="both"/>
+        <w:rPr>
+          <w:rFonts w:ascii="Arial" w:hAnsi="Arial" w:cs="Arial"/>
+        </w:rPr>
+      </w:pPr>
+      <w:r>
+        <w:rPr>
+          <w:rFonts w:ascii="Arial" w:hAnsi="Arial" w:cs="Arial"/>
+        </w:rPr>
+        <w:lastRenderedPageBreak/>
+        <w:t xml:space="preserve">The second activity diagram represents the Registry Staff enrolment review and approval process. It illustrates how </w:t>
+      </w:r>
+      <w:proofErr w:type="spellStart"/>
+      <w:r>
+        <w:rPr>
+          <w:rFonts w:ascii="Arial" w:hAnsi="Arial" w:cs="Arial"/>
+        </w:rPr>
+        <w:t>RegistryStaff</w:t>
+      </w:r>
+      <w:proofErr w:type="spellEnd"/>
+      <w:r>
+        <w:rPr>
+          <w:rFonts w:ascii="Arial" w:hAnsi="Arial" w:cs="Arial"/>
+        </w:rPr>
+        <w:t xml:space="preserve"> review enrolment requests and </w:t>
+      </w:r>
+      <w:proofErr w:type="gramStart"/>
+      <w:r>
+        <w:rPr>
+          <w:rFonts w:ascii="Arial" w:hAnsi="Arial" w:cs="Arial"/>
+        </w:rPr>
+        <w:t>perform</w:t>
+      </w:r>
+      <w:proofErr w:type="gramEnd"/>
+      <w:r>
+        <w:rPr>
+          <w:rFonts w:ascii="Arial" w:hAnsi="Arial" w:cs="Arial"/>
+        </w:rPr>
+        <w:t xml:space="preserve"> eligibility checks through </w:t>
+      </w:r>
+      <w:proofErr w:type="spellStart"/>
+      <w:r>
+        <w:rPr>
+          <w:rFonts w:ascii="Arial" w:hAnsi="Arial" w:cs="Arial"/>
+        </w:rPr>
+        <w:t>IStudentInfoSystem</w:t>
+      </w:r>
+      <w:proofErr w:type="spellEnd"/>
+      <w:r>
+        <w:rPr>
+          <w:rFonts w:ascii="Arial" w:hAnsi="Arial" w:cs="Arial"/>
+        </w:rPr>
+        <w:t xml:space="preserve"> and </w:t>
+      </w:r>
+      <w:proofErr w:type="spellStart"/>
+      <w:r>
+        <w:rPr>
+          <w:rFonts w:ascii="Arial" w:hAnsi="Arial" w:cs="Arial"/>
+        </w:rPr>
+        <w:t>IFinanceSystem</w:t>
+      </w:r>
+      <w:proofErr w:type="spellEnd"/>
+      <w:r>
+        <w:rPr>
+          <w:rFonts w:ascii="Arial" w:hAnsi="Arial" w:cs="Arial"/>
+        </w:rPr>
+        <w:t xml:space="preserve">. Decision points are used to verify academic eligibility, payment status, and insurance requirements. Based on the outcome, the enrolment request is either approved or rejected, and the action is recorded through the </w:t>
+      </w:r>
+      <w:proofErr w:type="spellStart"/>
+      <w:r>
+        <w:rPr>
+          <w:rFonts w:ascii="Arial" w:hAnsi="Arial" w:cs="Arial"/>
+        </w:rPr>
+        <w:t>AuditService</w:t>
+      </w:r>
+      <w:proofErr w:type="spellEnd"/>
+      <w:r>
+        <w:rPr>
+          <w:rFonts w:ascii="Arial" w:hAnsi="Arial" w:cs="Arial"/>
+        </w:rPr>
+        <w:t>.</w:t>
+      </w:r>
+    </w:p>
+    <w:p>
+      <w:pPr>
+        <w:keepNext/>
+        <w:spacing w:after="0" w:line="360" w:lineRule="auto"/>
+        <w:ind w:left="720"/>
+        <w:jc w:val="both"/>
+      </w:pPr>
+      <w:r>
+        <w:rPr>
+          <w:rFonts w:ascii="Arial" w:hAnsi="Arial" w:cs="Arial"/>
+          <w:noProof/>
+        </w:rPr>
+        <w:drawing>
+          <wp:inline distT="0" distB="0" distL="0" distR="0" wp14:anchorId="764EBD3A" wp14:editId="4A95DBFE">
+            <wp:extent cx="5939790" cy="5279390"/>
+            <wp:effectExtent l="0" t="0" r="3810" b="0"/>
+            <wp:docPr id="177175159" name="Picture 8"/>
+            <wp:cNvGraphicFramePr>
+              <a:graphicFrameLocks xmlns:a="http://schemas.openxmlformats.org/drawingml/2006/main" noChangeAspect="1"/>
+            </wp:cNvGraphicFramePr>
+            <a:graphic xmlns:a="http://schemas.openxmlformats.org/drawingml/2006/main">
+              <a:graphicData uri="http://schemas.openxmlformats.org/drawingml/2006/picture">
+                <pic:pic xmlns:pic="http://schemas.openxmlformats.org/drawingml/2006/picture">
+                  <pic:nvPicPr>
+                    <pic:cNvPr id="0" name="Picture 8"/>
+                    <pic:cNvPicPr>
+                      <a:picLocks noChangeAspect="1" noChangeArrowheads="1"/>
+                    </pic:cNvPicPr>
+                  </pic:nvPicPr>
+                  <pic:blipFill>
+                    <a:blip r:embed="rId16">
+                      <a:extLst>
+                        <a:ext uri="{28A0092B-C50C-407E-A947-70E740481C1C}">
+                          <a14:useLocalDpi xmlns:a14="http://schemas.microsoft.com/office/drawing/2010/main" val="0"/>
+                        </a:ext>
+                      </a:extLst>
+                    </a:blip>
+                    <a:srcRect/>
+                    <a:stretch>
+                      <a:fillRect/>
+                    </a:stretch>
+                  </pic:blipFill>
+                  <pic:spPr bwMode="auto">
+                    <a:xfrm>
+                      <a:off x="0" y="0"/>
+                      <a:ext cx="5939790" cy="5279390"/>
+                    </a:xfrm>
+                    <a:prstGeom prst="rect">
+                      <a:avLst/>
+                    </a:prstGeom>
+                    <a:noFill/>
+                    <a:ln>
+                      <a:noFill/>
+                    </a:ln>
+                  </pic:spPr>
+                </pic:pic>
+              </a:graphicData>
+            </a:graphic>
+          </wp:inline>
+        </w:drawing>
+      </w:r>
+    </w:p>
+    <w:p>
+      <w:pPr>
+        <w:pStyle w:val="Caption"/>
+        <w:ind w:left="709"/>
+        <w:jc w:val="both"/>
+        <w:rPr>
+          <w:rFonts w:ascii="Arial" w:hAnsi="Arial" w:cs="Arial"/>
+          <w:b/>
+          <w:bCs/>
+          <w:i w:val="0"/>
+          <w:iCs w:val="0"/>
+          <w:color w:val="215E99" w:themeColor="text2" w:themeTint="BF"/>
+          <w:sz w:val="24"/>
+          <w:szCs w:val="24"/>
+        </w:rPr>
+      </w:pPr>
+      <w:r>
+        <w:rPr>
+          <w:rFonts w:ascii="Arial" w:hAnsi="Arial" w:cs="Arial"/>
+          <w:b/>
+          <w:bCs/>
+          <w:i w:val="0"/>
+          <w:iCs w:val="0"/>
+          <w:color w:val="215E99" w:themeColor="text2" w:themeTint="BF"/>
+          <w:sz w:val="24"/>
+          <w:szCs w:val="24"/>
+        </w:rPr>
+        <w:t xml:space="preserve">Figure </w:t>
+      </w:r>
+      <w:r>
+        <w:rPr>
+          <w:rFonts w:ascii="Arial" w:hAnsi="Arial" w:cs="Arial"/>
+          <w:b/>
+          <w:bCs/>
+          <w:i w:val="0"/>
+          <w:iCs w:val="0"/>
+          <w:color w:val="215E99" w:themeColor="text2" w:themeTint="BF"/>
+          <w:sz w:val="24"/>
+          <w:szCs w:val="24"/>
+        </w:rPr>
+        <w:fldChar w:fldCharType="begin"/>
+      </w:r>
+      <w:r>
+        <w:rPr>
+          <w:rFonts w:ascii="Arial" w:hAnsi="Arial" w:cs="Arial"/>
+          <w:b/>
+          <w:bCs/>
+          <w:i w:val="0"/>
+          <w:iCs w:val="0"/>
+          <w:color w:val="215E99" w:themeColor="text2" w:themeTint="BF"/>
+          <w:sz w:val="24"/>
+          <w:szCs w:val="24"/>
+        </w:rPr>
+        <w:instrText xml:space="preserve"> SEQ Figure \* ARABIC </w:instrText>
+      </w:r>
+      <w:r>
+        <w:rPr>
+          <w:rFonts w:ascii="Arial" w:hAnsi="Arial" w:cs="Arial"/>
+          <w:b/>
+          <w:bCs/>
+          <w:i w:val="0"/>
+          <w:iCs w:val="0"/>
+          <w:color w:val="215E99" w:themeColor="text2" w:themeTint="BF"/>
+          <w:sz w:val="24"/>
+          <w:szCs w:val="24"/>
+        </w:rPr>
+        <w:fldChar w:fldCharType="separate"/>
+      </w:r>
+      <w:r>
+        <w:rPr>
+          <w:rFonts w:ascii="Arial" w:hAnsi="Arial" w:cs="Arial"/>
+          <w:b/>
+          <w:bCs/>
+          <w:i w:val="0"/>
+          <w:iCs w:val="0"/>
+          <w:noProof/>
+          <w:color w:val="215E99" w:themeColor="text2" w:themeTint="BF"/>
+          <w:sz w:val="24"/>
+          <w:szCs w:val="24"/>
+        </w:rPr>
+        <w:t>7</w:t>
+      </w:r>
+      <w:r>
+        <w:rPr>
+          <w:rFonts w:ascii="Arial" w:hAnsi="Arial" w:cs="Arial"/>
+          <w:b/>
+          <w:bCs/>
+          <w:i w:val="0"/>
+          <w:iCs w:val="0"/>
+          <w:color w:val="215E99" w:themeColor="text2" w:themeTint="BF"/>
+          <w:sz w:val="24"/>
+          <w:szCs w:val="24"/>
+        </w:rPr>
+        <w:fldChar w:fldCharType="end"/>
+      </w:r>
+      <w:r>
+        <w:rPr>
+          <w:rFonts w:ascii="Arial" w:hAnsi="Arial" w:cs="Arial"/>
+          <w:b/>
+          <w:bCs/>
+          <w:i w:val="0"/>
+          <w:iCs w:val="0"/>
+          <w:color w:val="215E99" w:themeColor="text2" w:themeTint="BF"/>
+          <w:sz w:val="24"/>
+          <w:szCs w:val="24"/>
+        </w:rPr>
+        <w:t>: Activity diagram of Registry Staff Review and Approval Process</w:t>
+      </w:r>
+    </w:p>
+    <w:p>
+      <w:pPr>
+        <w:spacing w:line="360" w:lineRule="auto"/>
+        <w:ind w:left="720"/>
         <w:jc w:val="both"/>
         <w:rPr>
           <w:rFonts w:ascii="Arial" w:hAnsi="Arial" w:cs="Arial"/>
@@ -1772,7 +3660,7 @@
       </w:pPr>
     </w:p>
     <w:sectPr>
-      <w:footerReference w:type="default" r:id="rId10"/>
+      <w:footerReference w:type="default" r:id="rId17"/>
       <w:type w:val="continuous"/>
       <w:pgSz w:w="12240" w:h="15840"/>
       <w:pgMar w:top="1440" w:right="1440" w:bottom="1440" w:left="1440" w:header="708" w:footer="708" w:gutter="0"/>
@@ -7093,7 +8981,6 @@
   <w:style w:type="character" w:default="1" w:styleId="DefaultParagraphFont">
     <w:name w:val="Default Paragraph Font"/>
     <w:uiPriority w:val="1"/>
-    <w:semiHidden/>
     <w:unhideWhenUsed/>
   </w:style>
   <w:style w:type="table" w:default="1" w:styleId="TableNormal">

</xml_diff>

<commit_message>
Upload the final report's Design Pattern Application part
</commit_message>
<xml_diff>
--- a/Project Final Report/Assignment_Phase_2-Thanh_Tran-24247169.docx
+++ b/Project Final Report/Assignment_Phase_2-Thanh_Tran-24247169.docx
@@ -462,7 +462,7 @@
             <w:rPr>
               <w:rFonts w:ascii="Arial" w:hAnsi="Arial" w:cs="Arial"/>
               <w:noProof/>
-              <w:lang w:eastAsia="en-NZ"/>
+              <w:lang w:val="en-US" w:eastAsia="en-US"/>
             </w:rPr>
           </w:pPr>
           <w:r>
@@ -483,7 +483,7 @@
             </w:rPr>
             <w:fldChar w:fldCharType="separate"/>
           </w:r>
-          <w:hyperlink w:anchor="_Toc229061201" w:history="1">
+          <w:hyperlink w:anchor="_Toc231032919" w:history="1">
             <w:r>
               <w:rPr>
                 <w:rStyle w:val="Hyperlink"/>
@@ -498,7 +498,7 @@
               <w:rPr>
                 <w:rFonts w:ascii="Arial" w:hAnsi="Arial" w:cs="Arial"/>
                 <w:noProof/>
-                <w:lang w:eastAsia="en-NZ"/>
+                <w:lang w:val="en-US" w:eastAsia="en-US"/>
               </w:rPr>
               <w:tab/>
             </w:r>
@@ -534,7 +534,7 @@
                 <w:noProof/>
                 <w:webHidden/>
               </w:rPr>
-              <w:instrText xml:space="preserve"> PAGEREF _Toc229061201 \h </w:instrText>
+              <w:instrText xml:space="preserve"> PAGEREF _Toc231032919 \h </w:instrText>
             </w:r>
             <w:r>
               <w:rPr>
@@ -579,10 +579,10 @@
             <w:rPr>
               <w:rFonts w:ascii="Arial" w:hAnsi="Arial" w:cs="Arial"/>
               <w:noProof/>
-              <w:lang w:eastAsia="en-NZ"/>
+              <w:lang w:val="en-US" w:eastAsia="en-US"/>
             </w:rPr>
           </w:pPr>
-          <w:hyperlink w:anchor="_Toc229061202" w:history="1">
+          <w:hyperlink w:anchor="_Toc231032920" w:history="1">
             <w:r>
               <w:rPr>
                 <w:rStyle w:val="Hyperlink"/>
@@ -597,7 +597,7 @@
               <w:rPr>
                 <w:rFonts w:ascii="Arial" w:hAnsi="Arial" w:cs="Arial"/>
                 <w:noProof/>
-                <w:lang w:eastAsia="en-NZ"/>
+                <w:lang w:val="en-US" w:eastAsia="en-US"/>
               </w:rPr>
               <w:tab/>
             </w:r>
@@ -633,7 +633,7 @@
                 <w:noProof/>
                 <w:webHidden/>
               </w:rPr>
-              <w:instrText xml:space="preserve"> PAGEREF _Toc229061202 \h </w:instrText>
+              <w:instrText xml:space="preserve"> PAGEREF _Toc231032920 \h </w:instrText>
             </w:r>
             <w:r>
               <w:rPr>
@@ -670,18 +670,17 @@
         </w:p>
         <w:p>
           <w:pPr>
-            <w:pStyle w:val="TOC1"/>
+            <w:pStyle w:val="TOC2"/>
             <w:tabs>
-              <w:tab w:val="left" w:pos="480"/>
               <w:tab w:val="right" w:leader="dot" w:pos="9350"/>
             </w:tabs>
             <w:rPr>
               <w:rFonts w:ascii="Arial" w:hAnsi="Arial" w:cs="Arial"/>
               <w:noProof/>
-              <w:lang w:eastAsia="en-NZ"/>
+              <w:lang w:val="en-US" w:eastAsia="en-US"/>
             </w:rPr>
           </w:pPr>
-          <w:hyperlink w:anchor="_Toc229061203" w:history="1">
+          <w:hyperlink w:anchor="_Toc231032921" w:history="1">
             <w:r>
               <w:rPr>
                 <w:rStyle w:val="Hyperlink"/>
@@ -690,25 +689,7 @@
                 <w:bCs/>
                 <w:noProof/>
               </w:rPr>
-              <w:t>3.</w:t>
-            </w:r>
-            <w:r>
-              <w:rPr>
-                <w:rFonts w:ascii="Arial" w:hAnsi="Arial" w:cs="Arial"/>
-                <w:noProof/>
-                <w:lang w:eastAsia="en-NZ"/>
-              </w:rPr>
-              <w:tab/>
-            </w:r>
-            <w:r>
-              <w:rPr>
-                <w:rStyle w:val="Hyperlink"/>
-                <w:rFonts w:ascii="Arial" w:hAnsi="Arial" w:cs="Arial"/>
-                <w:b/>
-                <w:bCs/>
-                <w:noProof/>
-              </w:rPr>
-              <w:t>Design Pattern Application</w:t>
+              <w:t>2.1. Refined UML Class Diagram</w:t>
             </w:r>
             <w:r>
               <w:rPr>
@@ -732,7 +713,87 @@
                 <w:noProof/>
                 <w:webHidden/>
               </w:rPr>
-              <w:instrText xml:space="preserve"> PAGEREF _Toc229061203 \h </w:instrText>
+              <w:instrText xml:space="preserve"> PAGEREF _Toc231032921 \h </w:instrText>
+            </w:r>
+            <w:r>
+              <w:rPr>
+                <w:rFonts w:ascii="Arial" w:hAnsi="Arial" w:cs="Arial"/>
+                <w:noProof/>
+                <w:webHidden/>
+              </w:rPr>
+            </w:r>
+            <w:r>
+              <w:rPr>
+                <w:rFonts w:ascii="Arial" w:hAnsi="Arial" w:cs="Arial"/>
+                <w:noProof/>
+                <w:webHidden/>
+              </w:rPr>
+              <w:fldChar w:fldCharType="separate"/>
+            </w:r>
+            <w:r>
+              <w:rPr>
+                <w:rFonts w:ascii="Arial" w:hAnsi="Arial" w:cs="Arial"/>
+                <w:noProof/>
+                <w:webHidden/>
+              </w:rPr>
+              <w:t>2</w:t>
+            </w:r>
+            <w:r>
+              <w:rPr>
+                <w:rFonts w:ascii="Arial" w:hAnsi="Arial" w:cs="Arial"/>
+                <w:noProof/>
+                <w:webHidden/>
+              </w:rPr>
+              <w:fldChar w:fldCharType="end"/>
+            </w:r>
+          </w:hyperlink>
+        </w:p>
+        <w:p>
+          <w:pPr>
+            <w:pStyle w:val="TOC2"/>
+            <w:tabs>
+              <w:tab w:val="right" w:leader="dot" w:pos="9350"/>
+            </w:tabs>
+            <w:rPr>
+              <w:rFonts w:ascii="Arial" w:hAnsi="Arial" w:cs="Arial"/>
+              <w:noProof/>
+              <w:lang w:val="en-US" w:eastAsia="en-US"/>
+            </w:rPr>
+          </w:pPr>
+          <w:hyperlink w:anchor="_Toc231032922" w:history="1">
+            <w:r>
+              <w:rPr>
+                <w:rStyle w:val="Hyperlink"/>
+                <w:rFonts w:ascii="Arial" w:hAnsi="Arial" w:cs="Arial"/>
+                <w:b/>
+                <w:bCs/>
+                <w:noProof/>
+              </w:rPr>
+              <w:t>2.2. Sequence diagram</w:t>
+            </w:r>
+            <w:r>
+              <w:rPr>
+                <w:rFonts w:ascii="Arial" w:hAnsi="Arial" w:cs="Arial"/>
+                <w:noProof/>
+                <w:webHidden/>
+              </w:rPr>
+              <w:tab/>
+            </w:r>
+            <w:r>
+              <w:rPr>
+                <w:rFonts w:ascii="Arial" w:hAnsi="Arial" w:cs="Arial"/>
+                <w:noProof/>
+                <w:webHidden/>
+              </w:rPr>
+              <w:fldChar w:fldCharType="begin"/>
+            </w:r>
+            <w:r>
+              <w:rPr>
+                <w:rFonts w:ascii="Arial" w:hAnsi="Arial" w:cs="Arial"/>
+                <w:noProof/>
+                <w:webHidden/>
+              </w:rPr>
+              <w:instrText xml:space="preserve"> PAGEREF _Toc231032922 \h </w:instrText>
             </w:r>
             <w:r>
               <w:rPr>
@@ -769,18 +830,17 @@
         </w:p>
         <w:p>
           <w:pPr>
-            <w:pStyle w:val="TOC1"/>
+            <w:pStyle w:val="TOC2"/>
             <w:tabs>
-              <w:tab w:val="left" w:pos="480"/>
               <w:tab w:val="right" w:leader="dot" w:pos="9350"/>
             </w:tabs>
             <w:rPr>
               <w:rFonts w:ascii="Arial" w:hAnsi="Arial" w:cs="Arial"/>
               <w:noProof/>
-              <w:lang w:eastAsia="en-NZ"/>
+              <w:lang w:val="en-US" w:eastAsia="en-US"/>
             </w:rPr>
           </w:pPr>
-          <w:hyperlink w:anchor="_Toc229061204" w:history="1">
+          <w:hyperlink w:anchor="_Toc231032923" w:history="1">
             <w:r>
               <w:rPr>
                 <w:rStyle w:val="Hyperlink"/>
@@ -789,25 +849,7 @@
                 <w:bCs/>
                 <w:noProof/>
               </w:rPr>
-              <w:t>4.</w:t>
-            </w:r>
-            <w:r>
-              <w:rPr>
-                <w:rFonts w:ascii="Arial" w:hAnsi="Arial" w:cs="Arial"/>
-                <w:noProof/>
-                <w:lang w:eastAsia="en-NZ"/>
-              </w:rPr>
-              <w:tab/>
-            </w:r>
-            <w:r>
-              <w:rPr>
-                <w:rStyle w:val="Hyperlink"/>
-                <w:rFonts w:ascii="Arial" w:hAnsi="Arial" w:cs="Arial"/>
-                <w:b/>
-                <w:bCs/>
-                <w:noProof/>
-              </w:rPr>
-              <w:t>Comparative Design Analysis</w:t>
+              <w:t>2.3. Activity diagram</w:t>
             </w:r>
             <w:r>
               <w:rPr>
@@ -831,186 +873,7 @@
                 <w:noProof/>
                 <w:webHidden/>
               </w:rPr>
-              <w:instrText xml:space="preserve"> PAGEREF _Toc229061204 \h </w:instrText>
-            </w:r>
-            <w:r>
-              <w:rPr>
-                <w:rFonts w:ascii="Arial" w:hAnsi="Arial" w:cs="Arial"/>
-                <w:noProof/>
-                <w:webHidden/>
-              </w:rPr>
-            </w:r>
-            <w:r>
-              <w:rPr>
-                <w:rFonts w:ascii="Arial" w:hAnsi="Arial" w:cs="Arial"/>
-                <w:noProof/>
-                <w:webHidden/>
-              </w:rPr>
-              <w:fldChar w:fldCharType="separate"/>
-            </w:r>
-            <w:r>
-              <w:rPr>
-                <w:rFonts w:ascii="Arial" w:hAnsi="Arial" w:cs="Arial"/>
-                <w:noProof/>
-                <w:webHidden/>
-              </w:rPr>
-              <w:t>4</w:t>
-            </w:r>
-            <w:r>
-              <w:rPr>
-                <w:rFonts w:ascii="Arial" w:hAnsi="Arial" w:cs="Arial"/>
-                <w:noProof/>
-                <w:webHidden/>
-              </w:rPr>
-              <w:fldChar w:fldCharType="end"/>
-            </w:r>
-          </w:hyperlink>
-        </w:p>
-        <w:p>
-          <w:pPr>
-            <w:pStyle w:val="TOC1"/>
-            <w:tabs>
-              <w:tab w:val="left" w:pos="480"/>
-              <w:tab w:val="right" w:leader="dot" w:pos="9350"/>
-            </w:tabs>
-            <w:rPr>
-              <w:rFonts w:ascii="Arial" w:hAnsi="Arial" w:cs="Arial"/>
-              <w:noProof/>
-              <w:lang w:eastAsia="en-NZ"/>
-            </w:rPr>
-          </w:pPr>
-          <w:hyperlink w:anchor="_Toc229061205" w:history="1">
-            <w:r>
-              <w:rPr>
-                <w:rStyle w:val="Hyperlink"/>
-                <w:rFonts w:ascii="Arial" w:hAnsi="Arial" w:cs="Arial"/>
-                <w:b/>
-                <w:bCs/>
-                <w:noProof/>
-              </w:rPr>
-              <w:t>5.</w:t>
-            </w:r>
-            <w:r>
-              <w:rPr>
-                <w:rFonts w:ascii="Arial" w:hAnsi="Arial" w:cs="Arial"/>
-                <w:noProof/>
-                <w:lang w:eastAsia="en-NZ"/>
-              </w:rPr>
-              <w:tab/>
-            </w:r>
-            <w:r>
-              <w:rPr>
-                <w:rStyle w:val="Hyperlink"/>
-                <w:rFonts w:ascii="Arial" w:hAnsi="Arial" w:cs="Arial"/>
-                <w:b/>
-                <w:bCs/>
-                <w:noProof/>
-              </w:rPr>
-              <w:t>Conclusion</w:t>
-            </w:r>
-            <w:r>
-              <w:rPr>
-                <w:rFonts w:ascii="Arial" w:hAnsi="Arial" w:cs="Arial"/>
-                <w:noProof/>
-                <w:webHidden/>
-              </w:rPr>
-              <w:tab/>
-            </w:r>
-            <w:r>
-              <w:rPr>
-                <w:rFonts w:ascii="Arial" w:hAnsi="Arial" w:cs="Arial"/>
-                <w:noProof/>
-                <w:webHidden/>
-              </w:rPr>
-              <w:fldChar w:fldCharType="begin"/>
-            </w:r>
-            <w:r>
-              <w:rPr>
-                <w:rFonts w:ascii="Arial" w:hAnsi="Arial" w:cs="Arial"/>
-                <w:noProof/>
-                <w:webHidden/>
-              </w:rPr>
-              <w:instrText xml:space="preserve"> PAGEREF _Toc229061205 \h </w:instrText>
-            </w:r>
-            <w:r>
-              <w:rPr>
-                <w:rFonts w:ascii="Arial" w:hAnsi="Arial" w:cs="Arial"/>
-                <w:noProof/>
-                <w:webHidden/>
-              </w:rPr>
-            </w:r>
-            <w:r>
-              <w:rPr>
-                <w:rFonts w:ascii="Arial" w:hAnsi="Arial" w:cs="Arial"/>
-                <w:noProof/>
-                <w:webHidden/>
-              </w:rPr>
-              <w:fldChar w:fldCharType="separate"/>
-            </w:r>
-            <w:r>
-              <w:rPr>
-                <w:rFonts w:ascii="Arial" w:hAnsi="Arial" w:cs="Arial"/>
-                <w:noProof/>
-                <w:webHidden/>
-              </w:rPr>
-              <w:t>5</w:t>
-            </w:r>
-            <w:r>
-              <w:rPr>
-                <w:rFonts w:ascii="Arial" w:hAnsi="Arial" w:cs="Arial"/>
-                <w:noProof/>
-                <w:webHidden/>
-              </w:rPr>
-              <w:fldChar w:fldCharType="end"/>
-            </w:r>
-          </w:hyperlink>
-        </w:p>
-        <w:p>
-          <w:pPr>
-            <w:pStyle w:val="TOC1"/>
-            <w:tabs>
-              <w:tab w:val="right" w:leader="dot" w:pos="9350"/>
-            </w:tabs>
-            <w:rPr>
-              <w:rFonts w:ascii="Arial" w:hAnsi="Arial" w:cs="Arial"/>
-              <w:noProof/>
-              <w:lang w:eastAsia="en-NZ"/>
-            </w:rPr>
-          </w:pPr>
-          <w:hyperlink w:anchor="_Toc229061206" w:history="1">
-            <w:r>
-              <w:rPr>
-                <w:rStyle w:val="Hyperlink"/>
-                <w:rFonts w:ascii="Arial" w:hAnsi="Arial" w:cs="Arial"/>
-                <w:b/>
-                <w:bCs/>
-                <w:noProof/>
-              </w:rPr>
-              <w:t>References</w:t>
-            </w:r>
-            <w:r>
-              <w:rPr>
-                <w:rFonts w:ascii="Arial" w:hAnsi="Arial" w:cs="Arial"/>
-                <w:noProof/>
-                <w:webHidden/>
-              </w:rPr>
-              <w:tab/>
-            </w:r>
-            <w:r>
-              <w:rPr>
-                <w:rFonts w:ascii="Arial" w:hAnsi="Arial" w:cs="Arial"/>
-                <w:noProof/>
-                <w:webHidden/>
-              </w:rPr>
-              <w:fldChar w:fldCharType="begin"/>
-            </w:r>
-            <w:r>
-              <w:rPr>
-                <w:rFonts w:ascii="Arial" w:hAnsi="Arial" w:cs="Arial"/>
-                <w:noProof/>
-                <w:webHidden/>
-              </w:rPr>
-              <w:instrText xml:space="preserve"> PAGEREF _Toc229061206 \h </w:instrText>
+              <w:instrText xml:space="preserve"> PAGEREF _Toc231032923 \h </w:instrText>
             </w:r>
             <w:r>
               <w:rPr>
@@ -1047,6 +910,383 @@
         </w:p>
         <w:p>
           <w:pPr>
+            <w:pStyle w:val="TOC1"/>
+            <w:tabs>
+              <w:tab w:val="left" w:pos="480"/>
+              <w:tab w:val="right" w:leader="dot" w:pos="9350"/>
+            </w:tabs>
+            <w:rPr>
+              <w:rFonts w:ascii="Arial" w:hAnsi="Arial" w:cs="Arial"/>
+              <w:noProof/>
+              <w:lang w:val="en-US" w:eastAsia="en-US"/>
+            </w:rPr>
+          </w:pPr>
+          <w:hyperlink w:anchor="_Toc231032924" w:history="1">
+            <w:r>
+              <w:rPr>
+                <w:rStyle w:val="Hyperlink"/>
+                <w:rFonts w:ascii="Arial" w:hAnsi="Arial" w:cs="Arial"/>
+                <w:b/>
+                <w:bCs/>
+                <w:noProof/>
+              </w:rPr>
+              <w:t>3.</w:t>
+            </w:r>
+            <w:r>
+              <w:rPr>
+                <w:rFonts w:ascii="Arial" w:hAnsi="Arial" w:cs="Arial"/>
+                <w:noProof/>
+                <w:lang w:val="en-US" w:eastAsia="en-US"/>
+              </w:rPr>
+              <w:tab/>
+            </w:r>
+            <w:r>
+              <w:rPr>
+                <w:rStyle w:val="Hyperlink"/>
+                <w:rFonts w:ascii="Arial" w:hAnsi="Arial" w:cs="Arial"/>
+                <w:b/>
+                <w:bCs/>
+                <w:noProof/>
+              </w:rPr>
+              <w:t>Design Pattern Application</w:t>
+            </w:r>
+            <w:r>
+              <w:rPr>
+                <w:rFonts w:ascii="Arial" w:hAnsi="Arial" w:cs="Arial"/>
+                <w:noProof/>
+                <w:webHidden/>
+              </w:rPr>
+              <w:tab/>
+            </w:r>
+            <w:r>
+              <w:rPr>
+                <w:rFonts w:ascii="Arial" w:hAnsi="Arial" w:cs="Arial"/>
+                <w:noProof/>
+                <w:webHidden/>
+              </w:rPr>
+              <w:fldChar w:fldCharType="begin"/>
+            </w:r>
+            <w:r>
+              <w:rPr>
+                <w:rFonts w:ascii="Arial" w:hAnsi="Arial" w:cs="Arial"/>
+                <w:noProof/>
+                <w:webHidden/>
+              </w:rPr>
+              <w:instrText xml:space="preserve"> PAGEREF _Toc231032924 \h </w:instrText>
+            </w:r>
+            <w:r>
+              <w:rPr>
+                <w:rFonts w:ascii="Arial" w:hAnsi="Arial" w:cs="Arial"/>
+                <w:noProof/>
+                <w:webHidden/>
+              </w:rPr>
+            </w:r>
+            <w:r>
+              <w:rPr>
+                <w:rFonts w:ascii="Arial" w:hAnsi="Arial" w:cs="Arial"/>
+                <w:noProof/>
+                <w:webHidden/>
+              </w:rPr>
+              <w:fldChar w:fldCharType="separate"/>
+            </w:r>
+            <w:r>
+              <w:rPr>
+                <w:rFonts w:ascii="Arial" w:hAnsi="Arial" w:cs="Arial"/>
+                <w:noProof/>
+                <w:webHidden/>
+              </w:rPr>
+              <w:t>9</w:t>
+            </w:r>
+            <w:r>
+              <w:rPr>
+                <w:rFonts w:ascii="Arial" w:hAnsi="Arial" w:cs="Arial"/>
+                <w:noProof/>
+                <w:webHidden/>
+              </w:rPr>
+              <w:fldChar w:fldCharType="end"/>
+            </w:r>
+          </w:hyperlink>
+        </w:p>
+        <w:p>
+          <w:pPr>
+            <w:pStyle w:val="TOC1"/>
+            <w:tabs>
+              <w:tab w:val="left" w:pos="480"/>
+              <w:tab w:val="right" w:leader="dot" w:pos="9350"/>
+            </w:tabs>
+            <w:rPr>
+              <w:rFonts w:ascii="Arial" w:hAnsi="Arial" w:cs="Arial"/>
+              <w:noProof/>
+              <w:lang w:val="en-US" w:eastAsia="en-US"/>
+            </w:rPr>
+          </w:pPr>
+          <w:hyperlink w:anchor="_Toc231032925" w:history="1">
+            <w:r>
+              <w:rPr>
+                <w:rStyle w:val="Hyperlink"/>
+                <w:rFonts w:ascii="Arial" w:hAnsi="Arial" w:cs="Arial"/>
+                <w:b/>
+                <w:bCs/>
+                <w:noProof/>
+              </w:rPr>
+              <w:t>4.</w:t>
+            </w:r>
+            <w:r>
+              <w:rPr>
+                <w:rFonts w:ascii="Arial" w:hAnsi="Arial" w:cs="Arial"/>
+                <w:noProof/>
+                <w:lang w:val="en-US" w:eastAsia="en-US"/>
+              </w:rPr>
+              <w:tab/>
+            </w:r>
+            <w:r>
+              <w:rPr>
+                <w:rStyle w:val="Hyperlink"/>
+                <w:rFonts w:ascii="Arial" w:hAnsi="Arial" w:cs="Arial"/>
+                <w:b/>
+                <w:bCs/>
+                <w:noProof/>
+              </w:rPr>
+              <w:t>Comparative Design Analysis</w:t>
+            </w:r>
+            <w:r>
+              <w:rPr>
+                <w:rFonts w:ascii="Arial" w:hAnsi="Arial" w:cs="Arial"/>
+                <w:noProof/>
+                <w:webHidden/>
+              </w:rPr>
+              <w:tab/>
+            </w:r>
+            <w:r>
+              <w:rPr>
+                <w:rFonts w:ascii="Arial" w:hAnsi="Arial" w:cs="Arial"/>
+                <w:noProof/>
+                <w:webHidden/>
+              </w:rPr>
+              <w:fldChar w:fldCharType="begin"/>
+            </w:r>
+            <w:r>
+              <w:rPr>
+                <w:rFonts w:ascii="Arial" w:hAnsi="Arial" w:cs="Arial"/>
+                <w:noProof/>
+                <w:webHidden/>
+              </w:rPr>
+              <w:instrText xml:space="preserve"> PAGEREF _Toc231032925 \h </w:instrText>
+            </w:r>
+            <w:r>
+              <w:rPr>
+                <w:rFonts w:ascii="Arial" w:hAnsi="Arial" w:cs="Arial"/>
+                <w:noProof/>
+                <w:webHidden/>
+              </w:rPr>
+            </w:r>
+            <w:r>
+              <w:rPr>
+                <w:rFonts w:ascii="Arial" w:hAnsi="Arial" w:cs="Arial"/>
+                <w:noProof/>
+                <w:webHidden/>
+              </w:rPr>
+              <w:fldChar w:fldCharType="separate"/>
+            </w:r>
+            <w:r>
+              <w:rPr>
+                <w:rFonts w:ascii="Arial" w:hAnsi="Arial" w:cs="Arial"/>
+                <w:noProof/>
+                <w:webHidden/>
+              </w:rPr>
+              <w:t>10</w:t>
+            </w:r>
+            <w:r>
+              <w:rPr>
+                <w:rFonts w:ascii="Arial" w:hAnsi="Arial" w:cs="Arial"/>
+                <w:noProof/>
+                <w:webHidden/>
+              </w:rPr>
+              <w:fldChar w:fldCharType="end"/>
+            </w:r>
+          </w:hyperlink>
+        </w:p>
+        <w:p>
+          <w:pPr>
+            <w:pStyle w:val="TOC1"/>
+            <w:tabs>
+              <w:tab w:val="left" w:pos="480"/>
+              <w:tab w:val="right" w:leader="dot" w:pos="9350"/>
+            </w:tabs>
+            <w:rPr>
+              <w:rFonts w:ascii="Arial" w:hAnsi="Arial" w:cs="Arial"/>
+              <w:noProof/>
+              <w:lang w:val="en-US" w:eastAsia="en-US"/>
+            </w:rPr>
+          </w:pPr>
+          <w:hyperlink w:anchor="_Toc231032926" w:history="1">
+            <w:r>
+              <w:rPr>
+                <w:rStyle w:val="Hyperlink"/>
+                <w:rFonts w:ascii="Arial" w:hAnsi="Arial" w:cs="Arial"/>
+                <w:b/>
+                <w:bCs/>
+                <w:noProof/>
+              </w:rPr>
+              <w:t>5.</w:t>
+            </w:r>
+            <w:r>
+              <w:rPr>
+                <w:rFonts w:ascii="Arial" w:hAnsi="Arial" w:cs="Arial"/>
+                <w:noProof/>
+                <w:lang w:val="en-US" w:eastAsia="en-US"/>
+              </w:rPr>
+              <w:tab/>
+            </w:r>
+            <w:r>
+              <w:rPr>
+                <w:rStyle w:val="Hyperlink"/>
+                <w:rFonts w:ascii="Arial" w:hAnsi="Arial" w:cs="Arial"/>
+                <w:b/>
+                <w:bCs/>
+                <w:noProof/>
+              </w:rPr>
+              <w:t>Conclusion</w:t>
+            </w:r>
+            <w:r>
+              <w:rPr>
+                <w:rFonts w:ascii="Arial" w:hAnsi="Arial" w:cs="Arial"/>
+                <w:noProof/>
+                <w:webHidden/>
+              </w:rPr>
+              <w:tab/>
+            </w:r>
+            <w:r>
+              <w:rPr>
+                <w:rFonts w:ascii="Arial" w:hAnsi="Arial" w:cs="Arial"/>
+                <w:noProof/>
+                <w:webHidden/>
+              </w:rPr>
+              <w:fldChar w:fldCharType="begin"/>
+            </w:r>
+            <w:r>
+              <w:rPr>
+                <w:rFonts w:ascii="Arial" w:hAnsi="Arial" w:cs="Arial"/>
+                <w:noProof/>
+                <w:webHidden/>
+              </w:rPr>
+              <w:instrText xml:space="preserve"> PAGEREF _Toc231032926 \h </w:instrText>
+            </w:r>
+            <w:r>
+              <w:rPr>
+                <w:rFonts w:ascii="Arial" w:hAnsi="Arial" w:cs="Arial"/>
+                <w:noProof/>
+                <w:webHidden/>
+              </w:rPr>
+            </w:r>
+            <w:r>
+              <w:rPr>
+                <w:rFonts w:ascii="Arial" w:hAnsi="Arial" w:cs="Arial"/>
+                <w:noProof/>
+                <w:webHidden/>
+              </w:rPr>
+              <w:fldChar w:fldCharType="separate"/>
+            </w:r>
+            <w:r>
+              <w:rPr>
+                <w:rFonts w:ascii="Arial" w:hAnsi="Arial" w:cs="Arial"/>
+                <w:noProof/>
+                <w:webHidden/>
+              </w:rPr>
+              <w:t>11</w:t>
+            </w:r>
+            <w:r>
+              <w:rPr>
+                <w:rFonts w:ascii="Arial" w:hAnsi="Arial" w:cs="Arial"/>
+                <w:noProof/>
+                <w:webHidden/>
+              </w:rPr>
+              <w:fldChar w:fldCharType="end"/>
+            </w:r>
+          </w:hyperlink>
+        </w:p>
+        <w:p>
+          <w:pPr>
+            <w:pStyle w:val="TOC1"/>
+            <w:tabs>
+              <w:tab w:val="right" w:leader="dot" w:pos="9350"/>
+            </w:tabs>
+            <w:rPr>
+              <w:rFonts w:ascii="Arial" w:hAnsi="Arial" w:cs="Arial"/>
+              <w:noProof/>
+              <w:lang w:val="en-US" w:eastAsia="en-US"/>
+            </w:rPr>
+          </w:pPr>
+          <w:hyperlink w:anchor="_Toc231032927" w:history="1">
+            <w:r>
+              <w:rPr>
+                <w:rStyle w:val="Hyperlink"/>
+                <w:rFonts w:ascii="Arial" w:hAnsi="Arial" w:cs="Arial"/>
+                <w:b/>
+                <w:bCs/>
+                <w:noProof/>
+              </w:rPr>
+              <w:t>References</w:t>
+            </w:r>
+            <w:r>
+              <w:rPr>
+                <w:rFonts w:ascii="Arial" w:hAnsi="Arial" w:cs="Arial"/>
+                <w:noProof/>
+                <w:webHidden/>
+              </w:rPr>
+              <w:tab/>
+            </w:r>
+            <w:r>
+              <w:rPr>
+                <w:rFonts w:ascii="Arial" w:hAnsi="Arial" w:cs="Arial"/>
+                <w:noProof/>
+                <w:webHidden/>
+              </w:rPr>
+              <w:fldChar w:fldCharType="begin"/>
+            </w:r>
+            <w:r>
+              <w:rPr>
+                <w:rFonts w:ascii="Arial" w:hAnsi="Arial" w:cs="Arial"/>
+                <w:noProof/>
+                <w:webHidden/>
+              </w:rPr>
+              <w:instrText xml:space="preserve"> PAGEREF _Toc231032927 \h </w:instrText>
+            </w:r>
+            <w:r>
+              <w:rPr>
+                <w:rFonts w:ascii="Arial" w:hAnsi="Arial" w:cs="Arial"/>
+                <w:noProof/>
+                <w:webHidden/>
+              </w:rPr>
+            </w:r>
+            <w:r>
+              <w:rPr>
+                <w:rFonts w:ascii="Arial" w:hAnsi="Arial" w:cs="Arial"/>
+                <w:noProof/>
+                <w:webHidden/>
+              </w:rPr>
+              <w:fldChar w:fldCharType="separate"/>
+            </w:r>
+            <w:r>
+              <w:rPr>
+                <w:rFonts w:ascii="Arial" w:hAnsi="Arial" w:cs="Arial"/>
+                <w:noProof/>
+                <w:webHidden/>
+              </w:rPr>
+              <w:t>12</w:t>
+            </w:r>
+            <w:r>
+              <w:rPr>
+                <w:rFonts w:ascii="Arial" w:hAnsi="Arial" w:cs="Arial"/>
+                <w:noProof/>
+                <w:webHidden/>
+              </w:rPr>
+              <w:fldChar w:fldCharType="end"/>
+            </w:r>
+          </w:hyperlink>
+        </w:p>
+        <w:p>
+          <w:pPr>
             <w:jc w:val="both"/>
             <w:rPr>
               <w:rFonts w:ascii="Arial" w:hAnsi="Arial" w:cs="Arial"/>
@@ -1104,7 +1344,7 @@
           <w:szCs w:val="32"/>
         </w:rPr>
       </w:pPr>
-      <w:bookmarkStart w:id="1" w:name="_Toc229061201"/>
+      <w:bookmarkStart w:id="1" w:name="_Toc231032919"/>
       <w:r>
         <w:rPr>
           <w:rFonts w:ascii="Arial" w:hAnsi="Arial" w:cs="Arial"/>
@@ -1180,35 +1420,7 @@
         <w:rPr>
           <w:rFonts w:ascii="Arial" w:hAnsi="Arial" w:cs="Arial"/>
         </w:rPr>
-        <w:t xml:space="preserve">Phase 1 also included a partial C# implementation of core classes such as User, Student, Staff, </w:t>
-      </w:r>
-      <w:proofErr w:type="spellStart"/>
-      <w:r>
-        <w:rPr>
-          <w:rFonts w:ascii="Arial" w:hAnsi="Arial" w:cs="Arial"/>
-        </w:rPr>
-        <w:t>RegistryStaff</w:t>
-      </w:r>
-      <w:proofErr w:type="spellEnd"/>
-      <w:r>
-        <w:rPr>
-          <w:rFonts w:ascii="Arial" w:hAnsi="Arial" w:cs="Arial"/>
-        </w:rPr>
-        <w:t xml:space="preserve">, Course, and </w:t>
-      </w:r>
-      <w:proofErr w:type="spellStart"/>
-      <w:r>
-        <w:rPr>
-          <w:rFonts w:ascii="Arial" w:hAnsi="Arial" w:cs="Arial"/>
-        </w:rPr>
-        <w:t>EnrolmentRequest</w:t>
-      </w:r>
-      <w:proofErr w:type="spellEnd"/>
-      <w:r>
-        <w:rPr>
-          <w:rFonts w:ascii="Arial" w:hAnsi="Arial" w:cs="Arial"/>
-        </w:rPr>
-        <w:t xml:space="preserve"> to demonstrate enrolment functions including course selection, enrolment submission, approval processing, and enrolment monitoring. Several design weaknesses were also identified, including dependency on external systems, risks of tight coupling, and possible performance issues during peak enrolment periods.</w:t>
+        <w:t>Phase 1 also included a partial C# implementation of core classes such as User, Student, Staff, RegistryStaff, Course, and EnrolmentRequest to demonstrate enrolment functions including course selection, enrolment submission, approval processing, and enrolment monitoring. Several design weaknesses were also identified, including dependency on external systems, risks of tight coupling, and possible performance issues during peak enrolment periods.</w:t>
       </w:r>
     </w:p>
     <w:p>
@@ -1224,21 +1436,7 @@
         <w:rPr>
           <w:rFonts w:ascii="Arial" w:hAnsi="Arial" w:cs="Arial"/>
         </w:rPr>
-        <w:t xml:space="preserve">Building on this foundation, phase 2 focuses on refining the system design to improve abstraction, cohesion, modularity, maintainability, and extensibility using additional UML models and </w:t>
-      </w:r>
-      <w:proofErr w:type="spellStart"/>
-      <w:r>
-        <w:rPr>
-          <w:rFonts w:ascii="Arial" w:hAnsi="Arial" w:cs="Arial"/>
-        </w:rPr>
-        <w:t>GoF</w:t>
-      </w:r>
-      <w:proofErr w:type="spellEnd"/>
-      <w:r>
-        <w:rPr>
-          <w:rFonts w:ascii="Arial" w:hAnsi="Arial" w:cs="Arial"/>
-        </w:rPr>
-        <w:t xml:space="preserve"> design patterns. The refined design is then implemented in C#</w:t>
+        <w:t>Building on this foundation, phase 2 focuses on refining the system design to improve abstraction, cohesion, modularity, maintainability, and extensibility using additional UML models and GoF design patterns. The refined design is then implemented in C#</w:t>
       </w:r>
       <w:r>
         <w:rPr>
@@ -1300,7 +1498,7 @@
           <w:szCs w:val="32"/>
         </w:rPr>
       </w:pPr>
-      <w:bookmarkStart w:id="2" w:name="_Toc229061202"/>
+      <w:bookmarkStart w:id="2" w:name="_Toc231032920"/>
       <w:r>
         <w:rPr>
           <w:rFonts w:ascii="Arial" w:hAnsi="Arial" w:cs="Arial"/>
@@ -1331,6 +1529,7 @@
         </w:rPr>
       </w:pPr>
       <w:bookmarkStart w:id="3" w:name="_Toc227531409"/>
+      <w:bookmarkStart w:id="4" w:name="_Toc231032921"/>
       <w:r>
         <w:rPr>
           <w:rFonts w:ascii="Arial" w:hAnsi="Arial" w:cs="Arial"/>
@@ -1342,6 +1541,7 @@
         </w:rPr>
         <w:t>2.1. Refined UML Class Diagram</w:t>
       </w:r>
+      <w:bookmarkEnd w:id="4"/>
     </w:p>
     <w:p>
       <w:pPr>
@@ -1534,46 +1734,7 @@
           <w:sz w:val="24"/>
           <w:szCs w:val="24"/>
         </w:rPr>
-        <w:t xml:space="preserve">: Phase 1’s class diagram of </w:t>
-      </w:r>
-      <w:r>
-        <w:rPr>
-          <w:rFonts w:ascii="Arial" w:hAnsi="Arial" w:cs="Arial"/>
-          <w:b/>
-          <w:bCs/>
-          <w:i w:val="0"/>
-          <w:iCs w:val="0"/>
-          <w:color w:val="215E99" w:themeColor="text2" w:themeTint="BF"/>
-          <w:sz w:val="24"/>
-          <w:szCs w:val="24"/>
-        </w:rPr>
-        <w:t>Course</w:t>
-      </w:r>
-      <w:r>
-        <w:rPr>
-          <w:rFonts w:ascii="Arial" w:hAnsi="Arial" w:cs="Arial"/>
-          <w:b/>
-          <w:bCs/>
-          <w:i w:val="0"/>
-          <w:iCs w:val="0"/>
-          <w:color w:val="215E99" w:themeColor="text2" w:themeTint="BF"/>
-          <w:sz w:val="24"/>
-          <w:szCs w:val="24"/>
-        </w:rPr>
-        <w:t xml:space="preserve"> </w:t>
-      </w:r>
-      <w:r>
-        <w:rPr>
-          <w:rFonts w:ascii="Arial" w:hAnsi="Arial" w:cs="Arial"/>
-          <w:b/>
-          <w:bCs/>
-          <w:i w:val="0"/>
-          <w:iCs w:val="0"/>
-          <w:color w:val="215E99" w:themeColor="text2" w:themeTint="BF"/>
-          <w:sz w:val="24"/>
-          <w:szCs w:val="24"/>
-        </w:rPr>
-        <w:t>Enrolment System</w:t>
+        <w:t>: Phase 1’s class diagram of Course Enrolment System</w:t>
       </w:r>
     </w:p>
     <w:p>
@@ -1589,28 +1750,14 @@
         <w:rPr>
           <w:rFonts w:ascii="Arial" w:hAnsi="Arial" w:cs="Arial"/>
         </w:rPr>
-        <w:t xml:space="preserve">To address these issues, the class diagram has been refined by strengthening encapsulation and reducing implementation-level detail in the UML representation. Internal states such as course capacity, enrolment status, and identifier attributes are now set to private to improve encapsulation, enhance data integrity, and reduce </w:t>
+        <w:t xml:space="preserve">To address these issues, the class diagram has been refined by improving encapsulation and reducing implementation-level detail. Key attributes such as course capacity and identifiers are now private to protect data integrity. Some implementation-specific attributes and operations have been removed or simplified </w:t>
       </w:r>
       <w:r>
         <w:rPr>
           <w:rFonts w:ascii="Arial" w:hAnsi="Arial" w:cs="Arial"/>
         </w:rPr>
         <w:lastRenderedPageBreak/>
-        <w:t xml:space="preserve">direct external access. In addition, some attributes and operations have been removed where they were considered too implementation-specific, </w:t>
-      </w:r>
-      <w:proofErr w:type="gramStart"/>
-      <w:r>
-        <w:rPr>
-          <w:rFonts w:ascii="Arial" w:hAnsi="Arial" w:cs="Arial"/>
-        </w:rPr>
-        <w:t>in order to</w:t>
-      </w:r>
-      <w:proofErr w:type="gramEnd"/>
-      <w:r>
-        <w:rPr>
-          <w:rFonts w:ascii="Arial" w:hAnsi="Arial" w:cs="Arial"/>
-        </w:rPr>
-        <w:t xml:space="preserve"> maintain a clearer conceptual focus in the model. Operations are also now represented using simplified names without detailed parameters where appropriate, further reducing unnecessary implementation-level detail. Furthermore, associations have been clarified through the introduction of meaningful relationship labels such as “has” and “belongs to”, improving the readability and semantic clarity of multiplicities within the model.</w:t>
+        <w:t>to maintain a clearer conceptual model. Associations are now expressed using clearer relationship labels such as “has” and “belongs to” to improve readability. Dependency relationships have also been refined by distributing responsibilities across specialised service classes, reducing coupling and improving overall system modularity.</w:t>
       </w:r>
     </w:p>
     <w:p>
@@ -1628,10 +1775,10 @@
           <w:noProof/>
         </w:rPr>
         <w:drawing>
-          <wp:inline distT="0" distB="0" distL="0" distR="0" wp14:anchorId="3ECBDDF8" wp14:editId="6C3CBF87">
-            <wp:extent cx="7740650" cy="4143817"/>
-            <wp:effectExtent l="19050" t="19050" r="12700" b="28575"/>
-            <wp:docPr id="1562697201" name="Picture 1"/>
+          <wp:inline distT="0" distB="0" distL="0" distR="0" wp14:anchorId="07C4590C" wp14:editId="296A29DB">
+            <wp:extent cx="7702550" cy="4049199"/>
+            <wp:effectExtent l="19050" t="19050" r="12700" b="27940"/>
+            <wp:docPr id="28070849" name="Picture 7"/>
             <wp:cNvGraphicFramePr>
               <a:graphicFrameLocks xmlns:a="http://schemas.openxmlformats.org/drawingml/2006/main" noChangeAspect="1"/>
             </wp:cNvGraphicFramePr>
@@ -1639,7 +1786,7 @@
               <a:graphicData uri="http://schemas.openxmlformats.org/drawingml/2006/picture">
                 <pic:pic xmlns:pic="http://schemas.openxmlformats.org/drawingml/2006/picture">
                   <pic:nvPicPr>
-                    <pic:cNvPr id="0" name="Picture 1"/>
+                    <pic:cNvPr id="0" name="Picture 7"/>
                     <pic:cNvPicPr>
                       <a:picLocks noChangeAspect="1" noChangeArrowheads="1"/>
                     </pic:cNvPicPr>
@@ -1660,7 +1807,7 @@
                   <pic:spPr bwMode="auto">
                     <a:xfrm>
                       <a:off x="0" y="0"/>
-                      <a:ext cx="7752896" cy="4150373"/>
+                      <a:ext cx="7711193" cy="4053742"/>
                     </a:xfrm>
                     <a:prstGeom prst="rect">
                       <a:avLst/>
@@ -1669,7 +1816,7 @@
                     <a:ln>
                       <a:solidFill>
                         <a:schemeClr val="bg1">
-                          <a:lumMod val="85000"/>
+                          <a:lumMod val="65000"/>
                         </a:schemeClr>
                       </a:solidFill>
                     </a:ln>
@@ -1804,6 +1951,7 @@
           <w:szCs w:val="28"/>
         </w:rPr>
       </w:pPr>
+      <w:bookmarkStart w:id="5" w:name="_Toc231032922"/>
       <w:r>
         <w:rPr>
           <w:rFonts w:ascii="Arial" w:hAnsi="Arial" w:cs="Arial"/>
@@ -1860,6 +2008,7 @@
         </w:rPr>
         <w:t>diagram</w:t>
       </w:r>
+      <w:bookmarkEnd w:id="5"/>
     </w:p>
     <w:p>
       <w:pPr>
@@ -1874,14 +2023,7 @@
         <w:rPr>
           <w:rFonts w:ascii="Arial" w:hAnsi="Arial" w:cs="Arial"/>
         </w:rPr>
-        <w:t xml:space="preserve">To represent the dynamic behaviour of the Course Enrolment System, sequence diagrams were developed. They illustrate how different system components interact to complete key business processes. Sequence diagrams provide a clearer </w:t>
-      </w:r>
-      <w:r>
-        <w:rPr>
-          <w:rFonts w:ascii="Arial" w:hAnsi="Arial" w:cs="Arial"/>
-        </w:rPr>
-        <w:lastRenderedPageBreak/>
-        <w:t>representation of object interactions, message flow, system responsibilities, and communication between internal classes and external systems.</w:t>
+        <w:t>To represent the dynamic behaviour of the Course Enrolment System, sequence diagrams were developed. They illustrate how different system components interact to complete key business processes. Sequence diagrams provide a clearer representation of object interactions, message flow, system responsibilities, and communication between internal classes and external systems.</w:t>
       </w:r>
     </w:p>
     <w:p>
@@ -1897,7 +2039,14 @@
         <w:rPr>
           <w:rFonts w:ascii="Arial" w:hAnsi="Arial" w:cs="Arial"/>
         </w:rPr>
-        <w:t>Three key system scenarios were selected for modelling, including student login, course selection and enrolment submission, and enrolment review and approval by registry staff. These processes were chosen because they represent the main workflow of the Course Enrolment System and involve interactions between multiple users, system classes, services, and external systems.</w:t>
+        <w:t xml:space="preserve">Three key system scenarios were selected for modelling, including student login, course selection and enrolment submission, and enrolment review and approval by </w:t>
+      </w:r>
+      <w:r>
+        <w:rPr>
+          <w:rFonts w:ascii="Arial" w:hAnsi="Arial" w:cs="Arial"/>
+        </w:rPr>
+        <w:lastRenderedPageBreak/>
+        <w:t>registry staff. These processes were chosen because they represent the main workflow of the Course Enrolment System and involve interactions between multiple users, system classes, services, and external systems.</w:t>
       </w:r>
     </w:p>
     <w:p>
@@ -1913,35 +2062,7 @@
         <w:rPr>
           <w:rFonts w:ascii="Arial" w:hAnsi="Arial" w:cs="Arial"/>
         </w:rPr>
-        <w:t xml:space="preserve">The first sequence diagram represents the student login process. It demonstrates how the student submits a login request through the system interface, which then communicates with the User class to authenticate the provided credentials. A loop structure is used to allow repeated login attempts until valid credentials are entered. Depending on the authentication result, the system records the login activity through </w:t>
-      </w:r>
-      <w:proofErr w:type="spellStart"/>
-      <w:r>
-        <w:rPr>
-          <w:rFonts w:ascii="Arial" w:hAnsi="Arial" w:cs="Arial"/>
-        </w:rPr>
-        <w:t>AuditService</w:t>
-      </w:r>
-      <w:proofErr w:type="spellEnd"/>
-      <w:r>
-        <w:rPr>
-          <w:rFonts w:ascii="Arial" w:hAnsi="Arial" w:cs="Arial"/>
-        </w:rPr>
-        <w:t xml:space="preserve"> and either displays the student dashboard for successful login or an error message for invalid credentials. After successful authentication, the student </w:t>
-      </w:r>
-      <w:proofErr w:type="gramStart"/>
-      <w:r>
-        <w:rPr>
-          <w:rFonts w:ascii="Arial" w:hAnsi="Arial" w:cs="Arial"/>
-        </w:rPr>
-        <w:t>is able to</w:t>
-      </w:r>
-      <w:proofErr w:type="gramEnd"/>
-      <w:r>
-        <w:rPr>
-          <w:rFonts w:ascii="Arial" w:hAnsi="Arial" w:cs="Arial"/>
-        </w:rPr>
-        <w:t xml:space="preserve"> continue accessing system functions such as searching, viewing, and selecting available courses.</w:t>
+        <w:t>The first sequence diagram represents the student login process. It demonstrates how the student submits a login request through the system interface, which then communicates with the User class to authenticate the provided credentials. A loop structure is used to allow repeated login attempts until valid credentials are entered. Depending on the authentication result, the system records the login activity through AuditService and either displays the student dashboard for successful login or an error message for invalid credentials. After successful authentication, the student is able to continue accessing system functions such as searching, viewing, and selecting available courses.</w:t>
       </w:r>
     </w:p>
     <w:p>
@@ -2119,124 +2240,7 @@
           <w:sz w:val="24"/>
           <w:szCs w:val="24"/>
         </w:rPr>
-        <w:t xml:space="preserve">: </w:t>
-      </w:r>
-      <w:r>
-        <w:rPr>
-          <w:rFonts w:ascii="Arial" w:hAnsi="Arial" w:cs="Arial"/>
-          <w:b/>
-          <w:bCs/>
-          <w:i w:val="0"/>
-          <w:iCs w:val="0"/>
-          <w:color w:val="215E99" w:themeColor="text2" w:themeTint="BF"/>
-          <w:sz w:val="24"/>
-          <w:szCs w:val="24"/>
-        </w:rPr>
-        <w:t xml:space="preserve">Sequence </w:t>
-      </w:r>
-      <w:r>
-        <w:rPr>
-          <w:rFonts w:ascii="Arial" w:hAnsi="Arial" w:cs="Arial"/>
-          <w:b/>
-          <w:bCs/>
-          <w:i w:val="0"/>
-          <w:iCs w:val="0"/>
-          <w:color w:val="215E99" w:themeColor="text2" w:themeTint="BF"/>
-          <w:sz w:val="24"/>
-          <w:szCs w:val="24"/>
-        </w:rPr>
-        <w:t>d</w:t>
-      </w:r>
-      <w:r>
-        <w:rPr>
-          <w:rFonts w:ascii="Arial" w:hAnsi="Arial" w:cs="Arial"/>
-          <w:b/>
-          <w:bCs/>
-          <w:i w:val="0"/>
-          <w:iCs w:val="0"/>
-          <w:color w:val="215E99" w:themeColor="text2" w:themeTint="BF"/>
-          <w:sz w:val="24"/>
-          <w:szCs w:val="24"/>
-        </w:rPr>
-        <w:t xml:space="preserve">iagram of </w:t>
-      </w:r>
-      <w:r>
-        <w:rPr>
-          <w:rFonts w:ascii="Arial" w:hAnsi="Arial" w:cs="Arial"/>
-          <w:b/>
-          <w:bCs/>
-          <w:i w:val="0"/>
-          <w:iCs w:val="0"/>
-          <w:color w:val="215E99" w:themeColor="text2" w:themeTint="BF"/>
-          <w:sz w:val="24"/>
-          <w:szCs w:val="24"/>
-        </w:rPr>
-        <w:t>S</w:t>
-      </w:r>
-      <w:r>
-        <w:rPr>
-          <w:rFonts w:ascii="Arial" w:hAnsi="Arial" w:cs="Arial"/>
-          <w:b/>
-          <w:bCs/>
-          <w:i w:val="0"/>
-          <w:iCs w:val="0"/>
-          <w:color w:val="215E99" w:themeColor="text2" w:themeTint="BF"/>
-          <w:sz w:val="24"/>
-          <w:szCs w:val="24"/>
-        </w:rPr>
-        <w:t xml:space="preserve">tudent </w:t>
-      </w:r>
-      <w:r>
-        <w:rPr>
-          <w:rFonts w:ascii="Arial" w:hAnsi="Arial" w:cs="Arial"/>
-          <w:b/>
-          <w:bCs/>
-          <w:i w:val="0"/>
-          <w:iCs w:val="0"/>
-          <w:color w:val="215E99" w:themeColor="text2" w:themeTint="BF"/>
-          <w:sz w:val="24"/>
-          <w:szCs w:val="24"/>
-        </w:rPr>
-        <w:t>L</w:t>
-      </w:r>
-      <w:r>
-        <w:rPr>
-          <w:rFonts w:ascii="Arial" w:hAnsi="Arial" w:cs="Arial"/>
-          <w:b/>
-          <w:bCs/>
-          <w:i w:val="0"/>
-          <w:iCs w:val="0"/>
-          <w:color w:val="215E99" w:themeColor="text2" w:themeTint="BF"/>
-          <w:sz w:val="24"/>
-          <w:szCs w:val="24"/>
-        </w:rPr>
-        <w:t xml:space="preserve">ogin </w:t>
-      </w:r>
-      <w:r>
-        <w:rPr>
-          <w:rFonts w:ascii="Arial" w:hAnsi="Arial" w:cs="Arial"/>
-          <w:b/>
-          <w:bCs/>
-          <w:i w:val="0"/>
-          <w:iCs w:val="0"/>
-          <w:color w:val="215E99" w:themeColor="text2" w:themeTint="BF"/>
-          <w:sz w:val="24"/>
-          <w:szCs w:val="24"/>
-        </w:rPr>
-        <w:t>P</w:t>
-      </w:r>
-      <w:r>
-        <w:rPr>
-          <w:rFonts w:ascii="Arial" w:hAnsi="Arial" w:cs="Arial"/>
-          <w:b/>
-          <w:bCs/>
-          <w:i w:val="0"/>
-          <w:iCs w:val="0"/>
-          <w:color w:val="215E99" w:themeColor="text2" w:themeTint="BF"/>
-          <w:sz w:val="24"/>
-          <w:szCs w:val="24"/>
-        </w:rPr>
-        <w:t>rocess</w:t>
+        <w:t>: Sequence diagram of Student Login Process</w:t>
       </w:r>
     </w:p>
     <w:p>
@@ -2253,36 +2257,14 @@
         <w:rPr>
           <w:rFonts w:ascii="Arial" w:hAnsi="Arial" w:cs="Arial"/>
         </w:rPr>
+        <w:t xml:space="preserve">The second sequence diagram represents the course selection and enrolment submission process. It illustrates how a student searches for available courses, views course details, and selects a course based on availability. The process is modelled as an iterative loop, allowing the student to repeat searching and selection until they decide to submit an enrolment request. When a course is available, an </w:t>
+      </w:r>
+      <w:r>
+        <w:rPr>
+          <w:rFonts w:ascii="Arial" w:hAnsi="Arial" w:cs="Arial"/>
+        </w:rPr>
         <w:lastRenderedPageBreak/>
-        <w:t xml:space="preserve">The second sequence diagram represents the course selection and enrolment submission process. It illustrates how a student searches for available courses, views course details, and selects a course based on availability. The process is modelled as an iterative loop, allowing the student to repeat searching and selection until they decide to submit an enrolment request. When a course is available, an </w:t>
-      </w:r>
-      <w:proofErr w:type="spellStart"/>
-      <w:r>
-        <w:rPr>
-          <w:rFonts w:ascii="Arial" w:hAnsi="Arial" w:cs="Arial"/>
-        </w:rPr>
-        <w:t>EnrolmentRequest</w:t>
-      </w:r>
-      <w:proofErr w:type="spellEnd"/>
-      <w:r>
-        <w:rPr>
-          <w:rFonts w:ascii="Arial" w:hAnsi="Arial" w:cs="Arial"/>
-        </w:rPr>
-        <w:t xml:space="preserve"> is created if it does not already exist, and the selected course is added to the request. Finally, the student submits the enrolment, where the request is finalised and processed by the system, and the action is recorded by the </w:t>
-      </w:r>
-      <w:proofErr w:type="spellStart"/>
-      <w:r>
-        <w:rPr>
-          <w:rFonts w:ascii="Arial" w:hAnsi="Arial" w:cs="Arial"/>
-        </w:rPr>
-        <w:t>AuditService</w:t>
-      </w:r>
-      <w:proofErr w:type="spellEnd"/>
-      <w:r>
-        <w:rPr>
-          <w:rFonts w:ascii="Arial" w:hAnsi="Arial" w:cs="Arial"/>
-        </w:rPr>
-        <w:t xml:space="preserve"> to ensure traceability and accountability within the system.</w:t>
+        <w:t>EnrolmentRequest is created if it does not already exist, and the selected course is added to the request. Finally, the student submits the enrolment, where the request is finalised and processed by the system, and the action is recorded by the AuditService to ensure traceability and accountability within the system.</w:t>
       </w:r>
     </w:p>
     <w:p>
@@ -2291,6 +2273,9 @@
         <w:spacing w:after="0" w:line="360" w:lineRule="auto"/>
         <w:ind w:left="567"/>
         <w:jc w:val="both"/>
+        <w:rPr>
+          <w:rFonts w:ascii="Arial" w:hAnsi="Arial" w:cs="Arial"/>
+        </w:rPr>
       </w:pPr>
       <w:r>
         <w:rPr>
@@ -2298,10 +2283,10 @@
           <w:noProof/>
         </w:rPr>
         <w:drawing>
-          <wp:inline distT="0" distB="0" distL="0" distR="0" wp14:anchorId="2AE295D1" wp14:editId="4F54AE92">
-            <wp:extent cx="5061600" cy="5379032"/>
-            <wp:effectExtent l="19050" t="19050" r="24765" b="12700"/>
-            <wp:docPr id="2051698132" name="Picture 5"/>
+          <wp:inline distT="0" distB="0" distL="0" distR="0" wp14:anchorId="141633DB" wp14:editId="2A8BA884">
+            <wp:extent cx="5796000" cy="5358495"/>
+            <wp:effectExtent l="19050" t="19050" r="14605" b="13970"/>
+            <wp:docPr id="955875978" name="Picture 2"/>
             <wp:cNvGraphicFramePr>
               <a:graphicFrameLocks xmlns:a="http://schemas.openxmlformats.org/drawingml/2006/main" noChangeAspect="1"/>
             </wp:cNvGraphicFramePr>
@@ -2309,7 +2294,7 @@
               <a:graphicData uri="http://schemas.openxmlformats.org/drawingml/2006/picture">
                 <pic:pic xmlns:pic="http://schemas.openxmlformats.org/drawingml/2006/picture">
                   <pic:nvPicPr>
-                    <pic:cNvPr id="0" name="Picture 5"/>
+                    <pic:cNvPr id="0" name="Picture 2"/>
                     <pic:cNvPicPr>
                       <a:picLocks noChangeAspect="1" noChangeArrowheads="1"/>
                     </pic:cNvPicPr>
@@ -2330,7 +2315,7 @@
                   <pic:spPr bwMode="auto">
                     <a:xfrm>
                       <a:off x="0" y="0"/>
-                      <a:ext cx="5061600" cy="5379032"/>
+                      <a:ext cx="5796000" cy="5358495"/>
                     </a:xfrm>
                     <a:prstGeom prst="rect">
                       <a:avLst/>
@@ -2339,7 +2324,7 @@
                     <a:ln>
                       <a:solidFill>
                         <a:schemeClr val="bg1">
-                          <a:lumMod val="85000"/>
+                          <a:lumMod val="65000"/>
                         </a:schemeClr>
                       </a:solidFill>
                     </a:ln>
@@ -2457,139 +2442,7 @@
           <w:sz w:val="24"/>
           <w:szCs w:val="24"/>
         </w:rPr>
-        <w:t xml:space="preserve">: Sequence diagram of </w:t>
-      </w:r>
-      <w:r>
-        <w:rPr>
-          <w:rFonts w:ascii="Arial" w:hAnsi="Arial" w:cs="Arial"/>
-          <w:b/>
-          <w:bCs/>
-          <w:i w:val="0"/>
-          <w:iCs w:val="0"/>
-          <w:color w:val="215E99" w:themeColor="text2" w:themeTint="BF"/>
-          <w:sz w:val="24"/>
-          <w:szCs w:val="24"/>
-        </w:rPr>
-        <w:t>Course Selection and Enrolment Submission Process</w:t>
-      </w:r>
-    </w:p>
-    <w:p>
-      <w:pPr>
-        <w:spacing w:line="360" w:lineRule="auto"/>
-        <w:ind w:left="567"/>
-        <w:jc w:val="both"/>
-        <w:rPr>
-          <w:rFonts w:ascii="Arial" w:hAnsi="Arial" w:cs="Arial"/>
-        </w:rPr>
-      </w:pPr>
-      <w:r>
-        <w:rPr>
-          <w:rFonts w:ascii="Arial" w:hAnsi="Arial" w:cs="Arial"/>
-        </w:rPr>
-        <w:lastRenderedPageBreak/>
-        <w:t xml:space="preserve">The third sequence diagram represents the enrolment review and approval process performed by </w:t>
-      </w:r>
-      <w:proofErr w:type="spellStart"/>
-      <w:r>
-        <w:rPr>
-          <w:rFonts w:ascii="Arial" w:hAnsi="Arial" w:cs="Arial"/>
-        </w:rPr>
-        <w:t>RegistryStaff</w:t>
-      </w:r>
-      <w:proofErr w:type="spellEnd"/>
-      <w:r>
-        <w:rPr>
-          <w:rFonts w:ascii="Arial" w:hAnsi="Arial" w:cs="Arial"/>
-        </w:rPr>
-        <w:t xml:space="preserve">. It illustrates how </w:t>
-      </w:r>
-      <w:proofErr w:type="spellStart"/>
-      <w:r>
-        <w:rPr>
-          <w:rFonts w:ascii="Arial" w:hAnsi="Arial" w:cs="Arial"/>
-        </w:rPr>
-        <w:t>RegistryStaff</w:t>
-      </w:r>
-      <w:proofErr w:type="spellEnd"/>
-      <w:r>
-        <w:rPr>
-          <w:rFonts w:ascii="Arial" w:hAnsi="Arial" w:cs="Arial"/>
-        </w:rPr>
-        <w:t xml:space="preserve"> initiates the review of an enrolment request by accessing the student’s academic record, payment status, and insurance information through the system UI. The system interacts with the enrolment request and external services, including </w:t>
-      </w:r>
-      <w:proofErr w:type="spellStart"/>
-      <w:r>
-        <w:rPr>
-          <w:rFonts w:ascii="Arial" w:hAnsi="Arial" w:cs="Arial"/>
-        </w:rPr>
-        <w:t>IStudentInfoSystem</w:t>
-      </w:r>
-      <w:proofErr w:type="spellEnd"/>
-      <w:r>
-        <w:rPr>
-          <w:rFonts w:ascii="Arial" w:hAnsi="Arial" w:cs="Arial"/>
-        </w:rPr>
-        <w:t xml:space="preserve"> and </w:t>
-      </w:r>
-      <w:proofErr w:type="spellStart"/>
-      <w:r>
-        <w:rPr>
-          <w:rFonts w:ascii="Arial" w:hAnsi="Arial" w:cs="Arial"/>
-        </w:rPr>
-        <w:t>IFinanceSystem</w:t>
-      </w:r>
-      <w:proofErr w:type="spellEnd"/>
-      <w:r>
-        <w:rPr>
-          <w:rFonts w:ascii="Arial" w:hAnsi="Arial" w:cs="Arial"/>
-        </w:rPr>
-        <w:t xml:space="preserve">, to retrieve the required information. Based on </w:t>
-      </w:r>
-      <w:r>
-        <w:rPr>
-          <w:rFonts w:ascii="Arial" w:hAnsi="Arial" w:cs="Arial"/>
-        </w:rPr>
-        <w:t>this information</w:t>
-      </w:r>
-      <w:r>
-        <w:rPr>
-          <w:rFonts w:ascii="Arial" w:hAnsi="Arial" w:cs="Arial"/>
-        </w:rPr>
-        <w:t xml:space="preserve">, </w:t>
-      </w:r>
-      <w:proofErr w:type="spellStart"/>
-      <w:r>
-        <w:rPr>
-          <w:rFonts w:ascii="Arial" w:hAnsi="Arial" w:cs="Arial"/>
-        </w:rPr>
-        <w:t>RegistryStaff</w:t>
-      </w:r>
-      <w:proofErr w:type="spellEnd"/>
-      <w:r>
-        <w:rPr>
-          <w:rFonts w:ascii="Arial" w:hAnsi="Arial" w:cs="Arial"/>
-        </w:rPr>
-        <w:t xml:space="preserve"> either approves or rejects the enrolment request. The final decision is updated in the system, and the action is recorded by the </w:t>
-      </w:r>
-      <w:proofErr w:type="spellStart"/>
-      <w:r>
-        <w:rPr>
-          <w:rFonts w:ascii="Arial" w:hAnsi="Arial" w:cs="Arial"/>
-        </w:rPr>
-        <w:t>AuditService</w:t>
-      </w:r>
-      <w:proofErr w:type="spellEnd"/>
-      <w:r>
-        <w:rPr>
-          <w:rFonts w:ascii="Arial" w:hAnsi="Arial" w:cs="Arial"/>
-        </w:rPr>
-        <w:t xml:space="preserve"> to ensure traceability and accountability of administrative operations</w:t>
-      </w:r>
-      <w:r>
-        <w:rPr>
-          <w:rFonts w:ascii="Arial" w:hAnsi="Arial" w:cs="Arial"/>
-        </w:rPr>
-        <w:t>.</w:t>
+        <w:t>: Sequence diagram of Course Selection and Enrolment Submission Process</w:t>
       </w:r>
     </w:p>
     <w:p>
@@ -2598,17 +2451,33 @@
         <w:spacing w:after="0" w:line="360" w:lineRule="auto"/>
         <w:ind w:left="567"/>
         <w:jc w:val="both"/>
-      </w:pPr>
+        <w:rPr>
+          <w:rFonts w:ascii="Arial" w:hAnsi="Arial" w:cs="Arial"/>
+        </w:rPr>
+      </w:pPr>
+      <w:r>
+        <w:rPr>
+          <w:rFonts w:ascii="Arial" w:hAnsi="Arial" w:cs="Arial"/>
+        </w:rPr>
+        <w:t xml:space="preserve">The third sequence diagram represents the enrolment review and approval process performed by RegistryStaff. It shows how RegistryStaff reviews an enrolment request through the system UI, where EnrolmentService retrieves the request details along with the student’s academic record, payment status, and insurance </w:t>
+      </w:r>
+      <w:r>
+        <w:rPr>
+          <w:rFonts w:ascii="Arial" w:hAnsi="Arial" w:cs="Arial"/>
+        </w:rPr>
+        <w:lastRenderedPageBreak/>
+        <w:t>information from external systems such as IStudentInfoSystem and IFinanceSystem. Based on the displayed information, RegistryStaff approves or rejects the request. EnrolmentService then updates the request status accordingly and records the action through AuditService to ensure traceability and accountability.</w:t>
+      </w:r>
       <w:r>
         <w:rPr>
           <w:rFonts w:ascii="Arial" w:hAnsi="Arial" w:cs="Arial"/>
           <w:noProof/>
         </w:rPr>
         <w:drawing>
-          <wp:inline distT="0" distB="0" distL="0" distR="0" wp14:anchorId="7AFAD373" wp14:editId="3F16A1AD">
-            <wp:extent cx="5769806" cy="3370652"/>
-            <wp:effectExtent l="19050" t="19050" r="21590" b="20320"/>
-            <wp:docPr id="1419139730" name="Picture 6"/>
+          <wp:inline distT="0" distB="0" distL="0" distR="0" wp14:anchorId="4615F97B" wp14:editId="3F7DEF29">
+            <wp:extent cx="6427017" cy="3265084"/>
+            <wp:effectExtent l="19050" t="19050" r="12065" b="12065"/>
+            <wp:docPr id="332614852" name="Picture 3"/>
             <wp:cNvGraphicFramePr>
               <a:graphicFrameLocks xmlns:a="http://schemas.openxmlformats.org/drawingml/2006/main" noChangeAspect="1"/>
             </wp:cNvGraphicFramePr>
@@ -2616,7 +2485,7 @@
               <a:graphicData uri="http://schemas.openxmlformats.org/drawingml/2006/picture">
                 <pic:pic xmlns:pic="http://schemas.openxmlformats.org/drawingml/2006/picture">
                   <pic:nvPicPr>
-                    <pic:cNvPr id="0" name="Picture 6"/>
+                    <pic:cNvPr id="0" name="Picture 3"/>
                     <pic:cNvPicPr>
                       <a:picLocks noChangeAspect="1" noChangeArrowheads="1"/>
                     </pic:cNvPicPr>
@@ -2637,7 +2506,7 @@
                   <pic:spPr bwMode="auto">
                     <a:xfrm>
                       <a:off x="0" y="0"/>
-                      <a:ext cx="5794161" cy="3384880"/>
+                      <a:ext cx="6452569" cy="3278065"/>
                     </a:xfrm>
                     <a:prstGeom prst="rect">
                       <a:avLst/>
@@ -2646,7 +2515,7 @@
                     <a:ln>
                       <a:solidFill>
                         <a:schemeClr val="bg1">
-                          <a:lumMod val="85000"/>
+                          <a:lumMod val="65000"/>
                         </a:schemeClr>
                       </a:solidFill>
                     </a:ln>
@@ -2777,7 +2646,33 @@
           <w:sz w:val="24"/>
           <w:szCs w:val="24"/>
         </w:rPr>
-        <w:t>Sequence Diagram of Enrolment Review and Approval Process</w:t>
+        <w:t xml:space="preserve">Sequence </w:t>
+      </w:r>
+      <w:r>
+        <w:rPr>
+          <w:rFonts w:ascii="Arial" w:hAnsi="Arial" w:cs="Arial"/>
+          <w:b/>
+          <w:bCs/>
+          <w:i w:val="0"/>
+          <w:iCs w:val="0"/>
+          <w:color w:val="215E99" w:themeColor="text2" w:themeTint="BF"/>
+          <w:sz w:val="24"/>
+          <w:szCs w:val="24"/>
+        </w:rPr>
+        <w:t>d</w:t>
+      </w:r>
+      <w:r>
+        <w:rPr>
+          <w:rFonts w:ascii="Arial" w:hAnsi="Arial" w:cs="Arial"/>
+          <w:b/>
+          <w:bCs/>
+          <w:i w:val="0"/>
+          <w:iCs w:val="0"/>
+          <w:color w:val="215E99" w:themeColor="text2" w:themeTint="BF"/>
+          <w:sz w:val="24"/>
+          <w:szCs w:val="24"/>
+        </w:rPr>
+        <w:t>iagram of Enrolment Review and Approval Process</w:t>
       </w:r>
     </w:p>
     <w:p>
@@ -2811,6 +2706,7 @@
           <w:szCs w:val="28"/>
         </w:rPr>
       </w:pPr>
+      <w:bookmarkStart w:id="6" w:name="_Toc231032923"/>
       <w:r>
         <w:rPr>
           <w:rFonts w:ascii="Arial" w:hAnsi="Arial" w:cs="Arial"/>
@@ -2855,6 +2751,7 @@
         </w:rPr>
         <w:t>diagram</w:t>
       </w:r>
+      <w:bookmarkEnd w:id="6"/>
     </w:p>
     <w:p>
       <w:pPr>
@@ -2869,42 +2766,7 @@
         <w:rPr>
           <w:rFonts w:ascii="Arial" w:hAnsi="Arial" w:cs="Arial"/>
         </w:rPr>
-        <w:t xml:space="preserve">To further represent the dynamic behaviour of the Course Enrolment System, activity diagrams were developed to model key system workflows. Unlike </w:t>
-      </w:r>
-      <w:r>
-        <w:rPr>
-          <w:rFonts w:ascii="Arial" w:hAnsi="Arial" w:cs="Arial"/>
-        </w:rPr>
-        <w:lastRenderedPageBreak/>
-        <w:t xml:space="preserve">sequence diagrams, which focus on object interactions, activity diagrams provide a clearer representation of process flow, decision-making, and responsibilities between users, system components, and external services </w:t>
-      </w:r>
-      <w:proofErr w:type="gramStart"/>
-      <w:r>
-        <w:rPr>
-          <w:rFonts w:ascii="Arial" w:hAnsi="Arial" w:cs="Arial"/>
-        </w:rPr>
-        <w:t>through the use of</w:t>
-      </w:r>
-      <w:proofErr w:type="gramEnd"/>
-      <w:r>
-        <w:rPr>
-          <w:rFonts w:ascii="Arial" w:hAnsi="Arial" w:cs="Arial"/>
-        </w:rPr>
-        <w:t xml:space="preserve"> </w:t>
-      </w:r>
-      <w:proofErr w:type="spellStart"/>
-      <w:r>
-        <w:rPr>
-          <w:rFonts w:ascii="Arial" w:hAnsi="Arial" w:cs="Arial"/>
-        </w:rPr>
-        <w:t>swimlanes</w:t>
-      </w:r>
-      <w:proofErr w:type="spellEnd"/>
-      <w:r>
-        <w:rPr>
-          <w:rFonts w:ascii="Arial" w:hAnsi="Arial" w:cs="Arial"/>
-        </w:rPr>
-        <w:t>.</w:t>
+        <w:t>To further represent the dynamic behaviour of the Course Enrolment System, activity diagrams were developed to model key system workflows. Unlike sequence diagrams, which focus on object interactions, activity diagrams provide a clearer representation of process flow, decision-making, and responsibilities between users, system components, and external services through the use of swimlanes.</w:t>
       </w:r>
     </w:p>
     <w:p>
@@ -2920,16 +2782,15 @@
         <w:rPr>
           <w:rFonts w:ascii="Arial" w:hAnsi="Arial" w:cs="Arial"/>
         </w:rPr>
-        <w:t xml:space="preserve">The first activity diagram represents the student course enrolment process. It models the workflow from student login, course searching, viewing course details, selecting available courses, and submitting an enrolment request. Decision nodes are used to represent business rules such as login validation, course availability, and whether additional courses are added before submission. Once submitted, the system creates an enrolment request with a pending status and records the activity through the </w:t>
-      </w:r>
-      <w:proofErr w:type="spellStart"/>
-      <w:r>
-        <w:rPr>
-          <w:rFonts w:ascii="Arial" w:hAnsi="Arial" w:cs="Arial"/>
-        </w:rPr>
-        <w:t>AuditService</w:t>
-      </w:r>
-      <w:proofErr w:type="spellEnd"/>
+        <w:lastRenderedPageBreak/>
+        <w:t xml:space="preserve">The first activity diagram represents the student course enrolment process. It models the workflow from student login, course searching, viewing course details, selecting available courses, and submitting an enrolment request. Decision nodes are used to represent business rules such as login validation, course availability, and whether additional courses are added before submission. </w:t>
+      </w:r>
+      <w:r>
+        <w:rPr>
+          <w:rFonts w:ascii="Arial" w:hAnsi="Arial" w:cs="Arial"/>
+        </w:rPr>
+        <w:t>Once the enrolment is submitted, the request status is updated to pending and the activity is recorded through the AuditService</w:t>
+      </w:r>
       <w:r>
         <w:rPr>
           <w:rFonts w:ascii="Arial" w:hAnsi="Arial" w:cs="Arial"/>
@@ -2943,6 +2804,9 @@
         <w:spacing w:after="0" w:line="360" w:lineRule="auto"/>
         <w:ind w:left="720"/>
         <w:jc w:val="both"/>
+        <w:rPr>
+          <w:rFonts w:ascii="Arial" w:hAnsi="Arial" w:cs="Arial"/>
+        </w:rPr>
       </w:pPr>
       <w:r>
         <w:rPr>
@@ -2950,10 +2814,10 @@
           <w:noProof/>
         </w:rPr>
         <w:drawing>
-          <wp:inline distT="0" distB="0" distL="0" distR="0" wp14:anchorId="68444362" wp14:editId="32C5C8B8">
-            <wp:extent cx="5490000" cy="4864936"/>
-            <wp:effectExtent l="0" t="0" r="0" b="0"/>
-            <wp:docPr id="554039119" name="Picture 7"/>
+          <wp:inline distT="0" distB="0" distL="0" distR="0" wp14:anchorId="60049996" wp14:editId="0CBA82AA">
+            <wp:extent cx="5886000" cy="4861033"/>
+            <wp:effectExtent l="0" t="0" r="635" b="0"/>
+            <wp:docPr id="2115181916" name="Picture 1"/>
             <wp:cNvGraphicFramePr>
               <a:graphicFrameLocks xmlns:a="http://schemas.openxmlformats.org/drawingml/2006/main" noChangeAspect="1"/>
             </wp:cNvGraphicFramePr>
@@ -2961,7 +2825,7 @@
               <a:graphicData uri="http://schemas.openxmlformats.org/drawingml/2006/picture">
                 <pic:pic xmlns:pic="http://schemas.openxmlformats.org/drawingml/2006/picture">
                   <pic:nvPicPr>
-                    <pic:cNvPr id="0" name="Picture 7"/>
+                    <pic:cNvPr id="0" name="Picture 1"/>
                     <pic:cNvPicPr>
                       <a:picLocks noChangeAspect="1" noChangeArrowheads="1"/>
                     </pic:cNvPicPr>
@@ -2982,7 +2846,7 @@
                   <pic:spPr bwMode="auto">
                     <a:xfrm>
                       <a:off x="0" y="0"/>
-                      <a:ext cx="5490000" cy="4864936"/>
+                      <a:ext cx="5886000" cy="4861033"/>
                     </a:xfrm>
                     <a:prstGeom prst="rect">
                       <a:avLst/>
@@ -3122,78 +2986,14 @@
         <w:rPr>
           <w:rFonts w:ascii="Arial" w:hAnsi="Arial" w:cs="Arial"/>
         </w:rPr>
+        <w:t xml:space="preserve">The second activity diagram represents the Registry Staff enrolment review and approval process. It illustrates how RegistryStaff review enrolment requests and perform eligibility checks through IStudentInfoSystem and IFinanceSystem. Decision points are used to verify academic eligibility, payment status, and </w:t>
+      </w:r>
+      <w:r>
+        <w:rPr>
+          <w:rFonts w:ascii="Arial" w:hAnsi="Arial" w:cs="Arial"/>
+        </w:rPr>
         <w:lastRenderedPageBreak/>
-        <w:t xml:space="preserve">The second activity diagram represents the Registry Staff enrolment review and approval process. It illustrates how </w:t>
-      </w:r>
-      <w:proofErr w:type="spellStart"/>
-      <w:r>
-        <w:rPr>
-          <w:rFonts w:ascii="Arial" w:hAnsi="Arial" w:cs="Arial"/>
-        </w:rPr>
-        <w:t>RegistryStaff</w:t>
-      </w:r>
-      <w:proofErr w:type="spellEnd"/>
-      <w:r>
-        <w:rPr>
-          <w:rFonts w:ascii="Arial" w:hAnsi="Arial" w:cs="Arial"/>
-        </w:rPr>
-        <w:t xml:space="preserve"> review enrolment requests and </w:t>
-      </w:r>
-      <w:proofErr w:type="gramStart"/>
-      <w:r>
-        <w:rPr>
-          <w:rFonts w:ascii="Arial" w:hAnsi="Arial" w:cs="Arial"/>
-        </w:rPr>
-        <w:t>perform</w:t>
-      </w:r>
-      <w:proofErr w:type="gramEnd"/>
-      <w:r>
-        <w:rPr>
-          <w:rFonts w:ascii="Arial" w:hAnsi="Arial" w:cs="Arial"/>
-        </w:rPr>
-        <w:t xml:space="preserve"> eligibility checks through </w:t>
-      </w:r>
-      <w:proofErr w:type="spellStart"/>
-      <w:r>
-        <w:rPr>
-          <w:rFonts w:ascii="Arial" w:hAnsi="Arial" w:cs="Arial"/>
-        </w:rPr>
-        <w:t>IStudentInfoSystem</w:t>
-      </w:r>
-      <w:proofErr w:type="spellEnd"/>
-      <w:r>
-        <w:rPr>
-          <w:rFonts w:ascii="Arial" w:hAnsi="Arial" w:cs="Arial"/>
-        </w:rPr>
-        <w:t xml:space="preserve"> and </w:t>
-      </w:r>
-      <w:proofErr w:type="spellStart"/>
-      <w:r>
-        <w:rPr>
-          <w:rFonts w:ascii="Arial" w:hAnsi="Arial" w:cs="Arial"/>
-        </w:rPr>
-        <w:t>IFinanceSystem</w:t>
-      </w:r>
-      <w:proofErr w:type="spellEnd"/>
-      <w:r>
-        <w:rPr>
-          <w:rFonts w:ascii="Arial" w:hAnsi="Arial" w:cs="Arial"/>
-        </w:rPr>
-        <w:t xml:space="preserve">. Decision points are used to verify academic eligibility, payment status, and insurance requirements. Based on the outcome, the enrolment request is either approved or rejected, and the action is recorded through the </w:t>
-      </w:r>
-      <w:proofErr w:type="spellStart"/>
-      <w:r>
-        <w:rPr>
-          <w:rFonts w:ascii="Arial" w:hAnsi="Arial" w:cs="Arial"/>
-        </w:rPr>
-        <w:t>AuditService</w:t>
-      </w:r>
-      <w:proofErr w:type="spellEnd"/>
-      <w:r>
-        <w:rPr>
-          <w:rFonts w:ascii="Arial" w:hAnsi="Arial" w:cs="Arial"/>
-        </w:rPr>
-        <w:t>.</w:t>
+        <w:t>insurance requirements. Based on the outcome, the enrolment request is either approved or rejected, and the action is recorded through the AuditService.</w:t>
       </w:r>
     </w:p>
     <w:p>
@@ -3202,6 +3002,9 @@
         <w:spacing w:after="0" w:line="360" w:lineRule="auto"/>
         <w:ind w:left="720"/>
         <w:jc w:val="both"/>
+        <w:rPr>
+          <w:rFonts w:ascii="Arial" w:hAnsi="Arial" w:cs="Arial"/>
+        </w:rPr>
       </w:pPr>
       <w:r>
         <w:rPr>
@@ -3409,7 +3212,7 @@
           <w:szCs w:val="32"/>
         </w:rPr>
       </w:pPr>
-      <w:bookmarkStart w:id="4" w:name="_Toc229061203"/>
+      <w:bookmarkStart w:id="7" w:name="_Toc231032924"/>
       <w:r>
         <w:rPr>
           <w:rFonts w:ascii="Arial" w:hAnsi="Arial" w:cs="Arial"/>
@@ -3422,13 +3225,1077 @@
         <w:lastRenderedPageBreak/>
         <w:t>Design Pattern Application</w:t>
       </w:r>
-      <w:bookmarkEnd w:id="4"/>
+      <w:bookmarkEnd w:id="7"/>
     </w:p>
     <w:p>
       <w:pPr>
+        <w:ind w:left="284"/>
+        <w:jc w:val="both"/>
+        <w:rPr>
+          <w:rFonts w:ascii="Arial" w:hAnsi="Arial" w:cs="Arial"/>
+        </w:rPr>
+      </w:pPr>
+      <w:r>
+        <w:rPr>
+          <w:rFonts w:ascii="Arial" w:hAnsi="Arial" w:cs="Arial"/>
+        </w:rPr>
+        <w:t>In this system, three GoF design patterns have been applied to improve modularity, maintainability, and overall system design quality. The selected patterns are Factory Method, Singleton, and Adapter. These patterns are used to address different design concerns such as object creation, global access control, and system integration with external services.</w:t>
+      </w:r>
+    </w:p>
+    <w:p>
+      <w:pPr>
+        <w:pStyle w:val="Heading2"/>
+        <w:spacing w:before="0" w:line="360" w:lineRule="auto"/>
+        <w:ind w:left="284"/>
+        <w:jc w:val="both"/>
+        <w:rPr>
+          <w:rFonts w:ascii="Arial" w:hAnsi="Arial" w:cs="Arial"/>
+          <w:b/>
+          <w:bCs/>
+          <w:color w:val="EE0000"/>
+          <w:sz w:val="28"/>
+          <w:szCs w:val="28"/>
+        </w:rPr>
+      </w:pPr>
+      <w:r>
+        <w:rPr>
+          <w:rFonts w:ascii="Arial" w:hAnsi="Arial" w:cs="Arial"/>
+          <w:b/>
+          <w:bCs/>
+          <w:color w:val="EE0000"/>
+          <w:sz w:val="28"/>
+          <w:szCs w:val="28"/>
+        </w:rPr>
+        <w:t xml:space="preserve">3.1. Factory Method </w:t>
+      </w:r>
+      <w:r>
+        <w:rPr>
+          <w:rFonts w:ascii="Arial" w:hAnsi="Arial" w:cs="Arial"/>
+          <w:b/>
+          <w:bCs/>
+          <w:color w:val="EE0000"/>
+          <w:sz w:val="28"/>
+          <w:szCs w:val="28"/>
+        </w:rPr>
+        <w:t>p</w:t>
+      </w:r>
+      <w:r>
+        <w:rPr>
+          <w:rFonts w:ascii="Arial" w:hAnsi="Arial" w:cs="Arial"/>
+          <w:b/>
+          <w:bCs/>
+          <w:color w:val="EE0000"/>
+          <w:sz w:val="28"/>
+          <w:szCs w:val="28"/>
+        </w:rPr>
+        <w:t>attern</w:t>
+      </w:r>
+    </w:p>
+    <w:p>
+      <w:pPr>
         <w:spacing w:line="360" w:lineRule="auto"/>
+        <w:ind w:left="567"/>
+        <w:jc w:val="both"/>
+        <w:rPr>
+          <w:rFonts w:ascii="Arial" w:hAnsi="Arial" w:cs="Arial"/>
+        </w:rPr>
+      </w:pPr>
+      <w:r>
+        <w:rPr>
+          <w:rFonts w:ascii="Arial" w:hAnsi="Arial" w:cs="Arial"/>
+        </w:rPr>
+        <w:t>The Factory Method pattern is applied to create different types of users and system actors such as Student and various Staff types including RegistryStaff, FinanceStaff, ITStaff, and SystemAdmin. Instead of directly instantiating objects using new, a factory class is responsible for object creation, ensuring the system remains flexible and extensible when new user types are introduced. The figure below shows the changes in the class diagram after applying the Factory Method pattern</w:t>
+      </w:r>
+      <w:r>
+        <w:rPr>
+          <w:rFonts w:ascii="Arial" w:hAnsi="Arial" w:cs="Arial"/>
+        </w:rPr>
+        <w:t>.</w:t>
+      </w:r>
+    </w:p>
+    <w:p>
+      <w:pPr>
+        <w:spacing w:line="360" w:lineRule="auto"/>
+        <w:ind w:left="567"/>
+        <w:jc w:val="both"/>
+        <w:rPr>
+          <w:rFonts w:ascii="Arial" w:hAnsi="Arial" w:cs="Arial"/>
+        </w:rPr>
+      </w:pPr>
+      <w:r>
+        <w:rPr>
+          <w:rFonts w:ascii="Arial" w:hAnsi="Arial" w:cs="Arial"/>
+        </w:rPr>
+        <w:t>UserCreator acts as the creator class dependent on the User product, while concrete creator classes override the factory method to return different types of users. This improves system design quality by reducing tight coupling between client code and concrete classes, promoting adherence to the Open/Closed Principle, and making the system easier to extend and maintain without modifying existing code.</w:t>
+      </w:r>
+    </w:p>
+    <w:p>
+      <w:pPr>
+        <w:keepNext/>
+        <w:spacing w:after="0" w:line="360" w:lineRule="auto"/>
+        <w:ind w:left="567"/>
+        <w:jc w:val="both"/>
+        <w:rPr>
+          <w:rFonts w:ascii="Arial" w:hAnsi="Arial" w:cs="Arial"/>
+        </w:rPr>
+      </w:pPr>
+      <w:r>
+        <w:rPr>
+          <w:rFonts w:ascii="Arial" w:hAnsi="Arial" w:cs="Arial"/>
+        </w:rPr>
+        <w:drawing>
+          <wp:inline distT="0" distB="0" distL="0" distR="0" wp14:anchorId="25BA6A8D" wp14:editId="66EE17CC">
+            <wp:extent cx="6336000" cy="2822769"/>
+            <wp:effectExtent l="19050" t="19050" r="27305" b="15875"/>
+            <wp:docPr id="1392782623" name="Picture 1"/>
+            <wp:cNvGraphicFramePr>
+              <a:graphicFrameLocks xmlns:a="http://schemas.openxmlformats.org/drawingml/2006/main" noChangeAspect="1"/>
+            </wp:cNvGraphicFramePr>
+            <a:graphic xmlns:a="http://schemas.openxmlformats.org/drawingml/2006/main">
+              <a:graphicData uri="http://schemas.openxmlformats.org/drawingml/2006/picture">
+                <pic:pic xmlns:pic="http://schemas.openxmlformats.org/drawingml/2006/picture">
+                  <pic:nvPicPr>
+                    <pic:cNvPr id="1392782623" name=""/>
+                    <pic:cNvPicPr/>
+                  </pic:nvPicPr>
+                  <pic:blipFill>
+                    <a:blip r:embed="rId17"/>
+                    <a:stretch>
+                      <a:fillRect/>
+                    </a:stretch>
+                  </pic:blipFill>
+                  <pic:spPr>
+                    <a:xfrm>
+                      <a:off x="0" y="0"/>
+                      <a:ext cx="6336000" cy="2822769"/>
+                    </a:xfrm>
+                    <a:prstGeom prst="rect">
+                      <a:avLst/>
+                    </a:prstGeom>
+                    <a:ln>
+                      <a:solidFill>
+                        <a:schemeClr val="bg1">
+                          <a:lumMod val="65000"/>
+                        </a:schemeClr>
+                      </a:solidFill>
+                    </a:ln>
+                  </pic:spPr>
+                </pic:pic>
+              </a:graphicData>
+            </a:graphic>
+          </wp:inline>
+        </w:drawing>
+      </w:r>
+    </w:p>
+    <w:p>
+      <w:pPr>
+        <w:pStyle w:val="Caption"/>
+        <w:ind w:left="567"/>
+        <w:jc w:val="both"/>
+        <w:rPr>
+          <w:rFonts w:ascii="Arial" w:hAnsi="Arial" w:cs="Arial"/>
+          <w:b/>
+          <w:bCs/>
+          <w:i w:val="0"/>
+          <w:iCs w:val="0"/>
+          <w:color w:val="215E99" w:themeColor="text2" w:themeTint="BF"/>
+          <w:sz w:val="24"/>
+          <w:szCs w:val="24"/>
+        </w:rPr>
+      </w:pPr>
+      <w:r>
+        <w:rPr>
+          <w:rFonts w:ascii="Arial" w:hAnsi="Arial" w:cs="Arial"/>
+          <w:b/>
+          <w:bCs/>
+          <w:i w:val="0"/>
+          <w:iCs w:val="0"/>
+          <w:color w:val="215E99" w:themeColor="text2" w:themeTint="BF"/>
+          <w:sz w:val="24"/>
+          <w:szCs w:val="24"/>
+        </w:rPr>
+        <w:t xml:space="preserve">Figure </w:t>
+      </w:r>
+      <w:r>
+        <w:rPr>
+          <w:rFonts w:ascii="Arial" w:hAnsi="Arial" w:cs="Arial"/>
+          <w:b/>
+          <w:bCs/>
+          <w:i w:val="0"/>
+          <w:iCs w:val="0"/>
+          <w:color w:val="215E99" w:themeColor="text2" w:themeTint="BF"/>
+          <w:sz w:val="24"/>
+          <w:szCs w:val="24"/>
+        </w:rPr>
+        <w:fldChar w:fldCharType="begin"/>
+      </w:r>
+      <w:r>
+        <w:rPr>
+          <w:rFonts w:ascii="Arial" w:hAnsi="Arial" w:cs="Arial"/>
+          <w:b/>
+          <w:bCs/>
+          <w:i w:val="0"/>
+          <w:iCs w:val="0"/>
+          <w:color w:val="215E99" w:themeColor="text2" w:themeTint="BF"/>
+          <w:sz w:val="24"/>
+          <w:szCs w:val="24"/>
+        </w:rPr>
+        <w:instrText xml:space="preserve"> SEQ Figure \* ARABIC </w:instrText>
+      </w:r>
+      <w:r>
+        <w:rPr>
+          <w:rFonts w:ascii="Arial" w:hAnsi="Arial" w:cs="Arial"/>
+          <w:b/>
+          <w:bCs/>
+          <w:i w:val="0"/>
+          <w:iCs w:val="0"/>
+          <w:color w:val="215E99" w:themeColor="text2" w:themeTint="BF"/>
+          <w:sz w:val="24"/>
+          <w:szCs w:val="24"/>
+        </w:rPr>
+        <w:fldChar w:fldCharType="separate"/>
+      </w:r>
+      <w:r>
+        <w:rPr>
+          <w:rFonts w:ascii="Arial" w:hAnsi="Arial" w:cs="Arial"/>
+          <w:b/>
+          <w:bCs/>
+          <w:i w:val="0"/>
+          <w:iCs w:val="0"/>
+          <w:noProof/>
+          <w:color w:val="215E99" w:themeColor="text2" w:themeTint="BF"/>
+          <w:sz w:val="24"/>
+          <w:szCs w:val="24"/>
+        </w:rPr>
+        <w:t>8</w:t>
+      </w:r>
+      <w:r>
+        <w:rPr>
+          <w:rFonts w:ascii="Arial" w:hAnsi="Arial" w:cs="Arial"/>
+          <w:b/>
+          <w:bCs/>
+          <w:i w:val="0"/>
+          <w:iCs w:val="0"/>
+          <w:color w:val="215E99" w:themeColor="text2" w:themeTint="BF"/>
+          <w:sz w:val="24"/>
+          <w:szCs w:val="24"/>
+        </w:rPr>
+        <w:fldChar w:fldCharType="end"/>
+      </w:r>
+      <w:r>
+        <w:rPr>
+          <w:rFonts w:ascii="Arial" w:hAnsi="Arial" w:cs="Arial"/>
+          <w:b/>
+          <w:bCs/>
+          <w:i w:val="0"/>
+          <w:iCs w:val="0"/>
+          <w:color w:val="215E99" w:themeColor="text2" w:themeTint="BF"/>
+          <w:sz w:val="24"/>
+          <w:szCs w:val="24"/>
+        </w:rPr>
+        <w:t xml:space="preserve">: </w:t>
+      </w:r>
+      <w:r>
+        <w:rPr>
+          <w:rFonts w:ascii="Arial" w:hAnsi="Arial" w:cs="Arial"/>
+          <w:b/>
+          <w:bCs/>
+          <w:i w:val="0"/>
+          <w:iCs w:val="0"/>
+          <w:color w:val="215E99" w:themeColor="text2" w:themeTint="BF"/>
+          <w:sz w:val="24"/>
+          <w:szCs w:val="24"/>
+        </w:rPr>
+        <w:t>Updated class diagram after applying the Factory Method pattern (new components are circled)</w:t>
+      </w:r>
+    </w:p>
+    <w:p>
+      <w:pPr>
+        <w:pStyle w:val="Heading2"/>
+        <w:spacing w:before="0" w:line="360" w:lineRule="auto"/>
+        <w:ind w:left="284"/>
+        <w:jc w:val="both"/>
+        <w:rPr>
+          <w:rFonts w:ascii="Arial" w:hAnsi="Arial" w:cs="Arial"/>
+          <w:b/>
+          <w:bCs/>
+          <w:color w:val="EE0000"/>
+          <w:sz w:val="28"/>
+          <w:szCs w:val="28"/>
+        </w:rPr>
+      </w:pPr>
+      <w:r>
+        <w:rPr>
+          <w:rFonts w:ascii="Arial" w:hAnsi="Arial" w:cs="Arial"/>
+          <w:b/>
+          <w:bCs/>
+          <w:color w:val="EE0000"/>
+          <w:sz w:val="28"/>
+          <w:szCs w:val="28"/>
+        </w:rPr>
+        <w:lastRenderedPageBreak/>
+        <w:t>3.</w:t>
+      </w:r>
+      <w:r>
+        <w:rPr>
+          <w:rFonts w:ascii="Arial" w:hAnsi="Arial" w:cs="Arial"/>
+          <w:b/>
+          <w:bCs/>
+          <w:color w:val="EE0000"/>
+          <w:sz w:val="28"/>
+          <w:szCs w:val="28"/>
+        </w:rPr>
+        <w:t>2</w:t>
+      </w:r>
+      <w:r>
+        <w:rPr>
+          <w:rFonts w:ascii="Arial" w:hAnsi="Arial" w:cs="Arial"/>
+          <w:b/>
+          <w:bCs/>
+          <w:color w:val="EE0000"/>
+          <w:sz w:val="28"/>
+          <w:szCs w:val="28"/>
+        </w:rPr>
+        <w:t xml:space="preserve">. </w:t>
+      </w:r>
+      <w:r>
+        <w:rPr>
+          <w:rFonts w:ascii="Arial" w:hAnsi="Arial" w:cs="Arial"/>
+          <w:b/>
+          <w:bCs/>
+          <w:color w:val="EE0000"/>
+          <w:sz w:val="28"/>
+          <w:szCs w:val="28"/>
+        </w:rPr>
+        <w:t>Singleton</w:t>
+      </w:r>
+      <w:r>
+        <w:rPr>
+          <w:rFonts w:ascii="Arial" w:hAnsi="Arial" w:cs="Arial"/>
+          <w:b/>
+          <w:bCs/>
+          <w:color w:val="EE0000"/>
+          <w:sz w:val="28"/>
+          <w:szCs w:val="28"/>
+        </w:rPr>
+        <w:t xml:space="preserve"> </w:t>
+      </w:r>
+      <w:r>
+        <w:rPr>
+          <w:rFonts w:ascii="Arial" w:hAnsi="Arial" w:cs="Arial"/>
+          <w:b/>
+          <w:bCs/>
+          <w:color w:val="EE0000"/>
+          <w:sz w:val="28"/>
+          <w:szCs w:val="28"/>
+        </w:rPr>
+        <w:t>p</w:t>
+      </w:r>
+      <w:r>
+        <w:rPr>
+          <w:rFonts w:ascii="Arial" w:hAnsi="Arial" w:cs="Arial"/>
+          <w:b/>
+          <w:bCs/>
+          <w:color w:val="EE0000"/>
+          <w:sz w:val="28"/>
+          <w:szCs w:val="28"/>
+        </w:rPr>
+        <w:t>attern</w:t>
+      </w:r>
+    </w:p>
+    <w:p>
+      <w:pPr>
+        <w:spacing w:line="360" w:lineRule="auto"/>
+        <w:ind w:left="851"/>
+        <w:contextualSpacing/>
+        <w:jc w:val="both"/>
+        <w:rPr>
+          <w:rFonts w:ascii="Arial" w:hAnsi="Arial" w:cs="Arial"/>
+        </w:rPr>
+      </w:pPr>
+      <w:r>
+        <w:rPr>
+          <w:rFonts w:ascii="Arial" w:hAnsi="Arial" w:cs="Arial"/>
+        </w:rPr>
+        <w:t>The Singleton pattern is applied to the AuditService, which is responsible for recording all system activities such as login events, enrolment submissions, approvals, and rejections. This ensures that only one instance of AuditService exists throughout the system, providing a centralised and consistent logging mechanism. The figure below shows the implementation of the Singleton pattern in the class diagram.</w:t>
+      </w:r>
+    </w:p>
+    <w:p>
+      <w:pPr>
+        <w:spacing w:line="360" w:lineRule="auto"/>
+        <w:ind w:left="851"/>
+        <w:contextualSpacing/>
+        <w:jc w:val="both"/>
+        <w:rPr>
+          <w:rFonts w:ascii="Arial" w:hAnsi="Arial" w:cs="Arial"/>
+        </w:rPr>
+      </w:pPr>
+      <w:r>
+        <w:rPr>
+          <w:rFonts w:ascii="Arial" w:hAnsi="Arial" w:cs="Arial"/>
+        </w:rPr>
+        <w:t>AuditService is updated with a private constructor to prevent external instantiation and a static _instance field of type Lazy&lt;AuditService&gt; to support thread-safe, lazy initialization of the single shared instance. A public Instance property provides global access to this instance, and the logActivity() method is used to record system actions. This design improves system quality by ensuring consistent audit logging, reducing duplication, and maintaining reliable traceability across all system operations</w:t>
+      </w:r>
+      <w:r>
+        <w:rPr>
+          <w:rFonts w:ascii="Arial" w:hAnsi="Arial" w:cs="Arial"/>
+        </w:rPr>
+        <w:t>.</w:t>
+      </w:r>
+    </w:p>
+    <w:p>
+      <w:pPr>
+        <w:keepNext/>
+        <w:spacing w:after="0" w:line="360" w:lineRule="auto"/>
+        <w:ind w:left="851"/>
+        <w:contextualSpacing/>
+        <w:jc w:val="both"/>
+      </w:pPr>
+      <w:r>
+        <w:drawing>
+          <wp:inline distT="0" distB="0" distL="0" distR="0" wp14:anchorId="68E82FD3" wp14:editId="2E62AC30">
+            <wp:extent cx="4464000" cy="3945095"/>
+            <wp:effectExtent l="19050" t="19050" r="13335" b="17780"/>
+            <wp:docPr id="132958659" name="Picture 1"/>
+            <wp:cNvGraphicFramePr>
+              <a:graphicFrameLocks xmlns:a="http://schemas.openxmlformats.org/drawingml/2006/main" noChangeAspect="1"/>
+            </wp:cNvGraphicFramePr>
+            <a:graphic xmlns:a="http://schemas.openxmlformats.org/drawingml/2006/main">
+              <a:graphicData uri="http://schemas.openxmlformats.org/drawingml/2006/picture">
+                <pic:pic xmlns:pic="http://schemas.openxmlformats.org/drawingml/2006/picture">
+                  <pic:nvPicPr>
+                    <pic:cNvPr id="132958659" name=""/>
+                    <pic:cNvPicPr/>
+                  </pic:nvPicPr>
+                  <pic:blipFill>
+                    <a:blip r:embed="rId18"/>
+                    <a:stretch>
+                      <a:fillRect/>
+                    </a:stretch>
+                  </pic:blipFill>
+                  <pic:spPr>
+                    <a:xfrm>
+                      <a:off x="0" y="0"/>
+                      <a:ext cx="4464000" cy="3945095"/>
+                    </a:xfrm>
+                    <a:prstGeom prst="rect">
+                      <a:avLst/>
+                    </a:prstGeom>
+                    <a:ln>
+                      <a:solidFill>
+                        <a:schemeClr val="bg1">
+                          <a:lumMod val="65000"/>
+                        </a:schemeClr>
+                      </a:solidFill>
+                    </a:ln>
+                  </pic:spPr>
+                </pic:pic>
+              </a:graphicData>
+            </a:graphic>
+          </wp:inline>
+        </w:drawing>
+      </w:r>
+    </w:p>
+    <w:p>
+      <w:pPr>
+        <w:pStyle w:val="Caption"/>
+        <w:ind w:left="851"/>
+        <w:jc w:val="both"/>
+        <w:rPr>
+          <w:rFonts w:ascii="Arial" w:hAnsi="Arial" w:cs="Arial"/>
+          <w:b/>
+          <w:bCs/>
+          <w:i w:val="0"/>
+          <w:iCs w:val="0"/>
+          <w:color w:val="215E99" w:themeColor="text2" w:themeTint="BF"/>
+          <w:sz w:val="24"/>
+          <w:szCs w:val="24"/>
+        </w:rPr>
+      </w:pPr>
+      <w:r>
+        <w:rPr>
+          <w:rFonts w:ascii="Arial" w:hAnsi="Arial" w:cs="Arial"/>
+          <w:b/>
+          <w:bCs/>
+          <w:i w:val="0"/>
+          <w:iCs w:val="0"/>
+          <w:color w:val="215E99" w:themeColor="text2" w:themeTint="BF"/>
+          <w:sz w:val="24"/>
+          <w:szCs w:val="24"/>
+        </w:rPr>
+        <w:t xml:space="preserve">Figure </w:t>
+      </w:r>
+      <w:r>
+        <w:rPr>
+          <w:rFonts w:ascii="Arial" w:hAnsi="Arial" w:cs="Arial"/>
+          <w:b/>
+          <w:bCs/>
+          <w:i w:val="0"/>
+          <w:iCs w:val="0"/>
+          <w:color w:val="215E99" w:themeColor="text2" w:themeTint="BF"/>
+          <w:sz w:val="24"/>
+          <w:szCs w:val="24"/>
+        </w:rPr>
+        <w:fldChar w:fldCharType="begin"/>
+      </w:r>
+      <w:r>
+        <w:rPr>
+          <w:rFonts w:ascii="Arial" w:hAnsi="Arial" w:cs="Arial"/>
+          <w:b/>
+          <w:bCs/>
+          <w:i w:val="0"/>
+          <w:iCs w:val="0"/>
+          <w:color w:val="215E99" w:themeColor="text2" w:themeTint="BF"/>
+          <w:sz w:val="24"/>
+          <w:szCs w:val="24"/>
+        </w:rPr>
+        <w:instrText xml:space="preserve"> SEQ Figure \* ARABIC </w:instrText>
+      </w:r>
+      <w:r>
+        <w:rPr>
+          <w:rFonts w:ascii="Arial" w:hAnsi="Arial" w:cs="Arial"/>
+          <w:b/>
+          <w:bCs/>
+          <w:i w:val="0"/>
+          <w:iCs w:val="0"/>
+          <w:color w:val="215E99" w:themeColor="text2" w:themeTint="BF"/>
+          <w:sz w:val="24"/>
+          <w:szCs w:val="24"/>
+        </w:rPr>
+        <w:fldChar w:fldCharType="separate"/>
+      </w:r>
+      <w:r>
+        <w:rPr>
+          <w:rFonts w:ascii="Arial" w:hAnsi="Arial" w:cs="Arial"/>
+          <w:b/>
+          <w:bCs/>
+          <w:i w:val="0"/>
+          <w:iCs w:val="0"/>
+          <w:noProof/>
+          <w:color w:val="215E99" w:themeColor="text2" w:themeTint="BF"/>
+          <w:sz w:val="24"/>
+          <w:szCs w:val="24"/>
+        </w:rPr>
+        <w:t>9</w:t>
+      </w:r>
+      <w:r>
+        <w:rPr>
+          <w:rFonts w:ascii="Arial" w:hAnsi="Arial" w:cs="Arial"/>
+          <w:b/>
+          <w:bCs/>
+          <w:i w:val="0"/>
+          <w:iCs w:val="0"/>
+          <w:color w:val="215E99" w:themeColor="text2" w:themeTint="BF"/>
+          <w:sz w:val="24"/>
+          <w:szCs w:val="24"/>
+        </w:rPr>
+        <w:fldChar w:fldCharType="end"/>
+      </w:r>
+      <w:r>
+        <w:rPr>
+          <w:rFonts w:ascii="Arial" w:hAnsi="Arial" w:cs="Arial"/>
+          <w:b/>
+          <w:bCs/>
+          <w:i w:val="0"/>
+          <w:iCs w:val="0"/>
+          <w:color w:val="215E99" w:themeColor="text2" w:themeTint="BF"/>
+          <w:sz w:val="24"/>
+          <w:szCs w:val="24"/>
+        </w:rPr>
+        <w:t xml:space="preserve">: </w:t>
+      </w:r>
+      <w:r>
+        <w:rPr>
+          <w:rFonts w:ascii="Arial" w:hAnsi="Arial" w:cs="Arial"/>
+          <w:b/>
+          <w:bCs/>
+          <w:i w:val="0"/>
+          <w:iCs w:val="0"/>
+          <w:color w:val="215E99" w:themeColor="text2" w:themeTint="BF"/>
+          <w:sz w:val="24"/>
+          <w:szCs w:val="24"/>
+        </w:rPr>
+        <w:t>Updated class diagram of AuditService after applying the Singleton pattern</w:t>
+      </w:r>
+      <w:r>
+        <w:rPr>
+          <w:rFonts w:ascii="Arial" w:hAnsi="Arial" w:cs="Arial"/>
+          <w:b/>
+          <w:bCs/>
+          <w:i w:val="0"/>
+          <w:iCs w:val="0"/>
+          <w:color w:val="215E99" w:themeColor="text2" w:themeTint="BF"/>
+          <w:sz w:val="24"/>
+          <w:szCs w:val="24"/>
+        </w:rPr>
+        <w:t xml:space="preserve"> </w:t>
+      </w:r>
+      <w:r>
+        <w:rPr>
+          <w:rFonts w:ascii="Arial" w:hAnsi="Arial" w:cs="Arial"/>
+          <w:b/>
+          <w:bCs/>
+          <w:i w:val="0"/>
+          <w:iCs w:val="0"/>
+          <w:color w:val="215E99" w:themeColor="text2" w:themeTint="BF"/>
+          <w:sz w:val="24"/>
+          <w:szCs w:val="24"/>
+        </w:rPr>
+        <w:t xml:space="preserve">(updated </w:t>
+      </w:r>
+      <w:r>
+        <w:rPr>
+          <w:rFonts w:ascii="Arial" w:hAnsi="Arial" w:cs="Arial"/>
+          <w:b/>
+          <w:bCs/>
+          <w:i w:val="0"/>
+          <w:iCs w:val="0"/>
+          <w:color w:val="215E99" w:themeColor="text2" w:themeTint="BF"/>
+          <w:sz w:val="24"/>
+          <w:szCs w:val="24"/>
+        </w:rPr>
+        <w:t xml:space="preserve">AuditService </w:t>
+      </w:r>
+      <w:r>
+        <w:rPr>
+          <w:rFonts w:ascii="Arial" w:hAnsi="Arial" w:cs="Arial"/>
+          <w:b/>
+          <w:bCs/>
+          <w:i w:val="0"/>
+          <w:iCs w:val="0"/>
+          <w:color w:val="215E99" w:themeColor="text2" w:themeTint="BF"/>
+          <w:sz w:val="24"/>
+          <w:szCs w:val="24"/>
+        </w:rPr>
+        <w:t>is</w:t>
+      </w:r>
+      <w:r>
+        <w:rPr>
+          <w:rFonts w:ascii="Arial" w:hAnsi="Arial" w:cs="Arial"/>
+          <w:b/>
+          <w:bCs/>
+          <w:i w:val="0"/>
+          <w:iCs w:val="0"/>
+          <w:color w:val="215E99" w:themeColor="text2" w:themeTint="BF"/>
+          <w:sz w:val="24"/>
+          <w:szCs w:val="24"/>
+        </w:rPr>
+        <w:t xml:space="preserve"> circled)</w:t>
+      </w:r>
+    </w:p>
+    <w:p>
+      <w:pPr>
+        <w:pStyle w:val="Heading2"/>
+        <w:spacing w:before="0" w:line="360" w:lineRule="auto"/>
+        <w:ind w:left="284"/>
+        <w:jc w:val="both"/>
+        <w:rPr>
+          <w:rFonts w:ascii="Arial" w:hAnsi="Arial" w:cs="Arial"/>
+          <w:b/>
+          <w:bCs/>
+          <w:color w:val="EE0000"/>
+          <w:sz w:val="28"/>
+          <w:szCs w:val="28"/>
+        </w:rPr>
+      </w:pPr>
+      <w:r>
+        <w:rPr>
+          <w:rFonts w:ascii="Arial" w:hAnsi="Arial" w:cs="Arial"/>
+          <w:b/>
+          <w:bCs/>
+          <w:color w:val="EE0000"/>
+          <w:sz w:val="28"/>
+          <w:szCs w:val="28"/>
+        </w:rPr>
+        <w:lastRenderedPageBreak/>
+        <w:t>3.</w:t>
+      </w:r>
+      <w:r>
+        <w:rPr>
+          <w:rFonts w:ascii="Arial" w:hAnsi="Arial" w:cs="Arial"/>
+          <w:b/>
+          <w:bCs/>
+          <w:color w:val="EE0000"/>
+          <w:sz w:val="28"/>
+          <w:szCs w:val="28"/>
+        </w:rPr>
+        <w:t>3</w:t>
+      </w:r>
+      <w:r>
+        <w:rPr>
+          <w:rFonts w:ascii="Arial" w:hAnsi="Arial" w:cs="Arial"/>
+          <w:b/>
+          <w:bCs/>
+          <w:color w:val="EE0000"/>
+          <w:sz w:val="28"/>
+          <w:szCs w:val="28"/>
+        </w:rPr>
+        <w:t xml:space="preserve">. </w:t>
+      </w:r>
+      <w:r>
+        <w:rPr>
+          <w:rFonts w:ascii="Arial" w:hAnsi="Arial" w:cs="Arial"/>
+          <w:b/>
+          <w:bCs/>
+          <w:color w:val="EE0000"/>
+          <w:sz w:val="28"/>
+          <w:szCs w:val="28"/>
+        </w:rPr>
+        <w:t>Adapter</w:t>
+      </w:r>
+      <w:r>
+        <w:rPr>
+          <w:rFonts w:ascii="Arial" w:hAnsi="Arial" w:cs="Arial"/>
+          <w:b/>
+          <w:bCs/>
+          <w:color w:val="EE0000"/>
+          <w:sz w:val="28"/>
+          <w:szCs w:val="28"/>
+        </w:rPr>
+        <w:t xml:space="preserve"> p</w:t>
+      </w:r>
+      <w:r>
+        <w:rPr>
+          <w:rFonts w:ascii="Arial" w:hAnsi="Arial" w:cs="Arial"/>
+          <w:b/>
+          <w:bCs/>
+          <w:color w:val="EE0000"/>
+          <w:sz w:val="28"/>
+          <w:szCs w:val="28"/>
+        </w:rPr>
+        <w:t>attern</w:t>
+      </w:r>
+    </w:p>
+    <w:p>
+      <w:pPr>
+        <w:spacing w:line="360" w:lineRule="auto"/>
+        <w:ind w:left="851"/>
+        <w:contextualSpacing/>
+        <w:jc w:val="both"/>
+        <w:rPr>
+          <w:rFonts w:ascii="Arial" w:hAnsi="Arial" w:cs="Arial"/>
+        </w:rPr>
+      </w:pPr>
+      <w:r>
+        <w:rPr>
+          <w:rFonts w:ascii="Arial" w:hAnsi="Arial" w:cs="Arial"/>
+        </w:rPr>
+        <w:t xml:space="preserve">The Adapter pattern is applied to integrate multiple external legacy systems with the enrolment system, including course, student, finance, and HR systems. It allows incompatible interfaces to work together by converting the interface of each legacy system into a target interface expected by the system, ensuring that external systems can be reused without modifying their original implementation. The figure below shows the changes in the class diagram after applying the Adapter pattern. </w:t>
+      </w:r>
+    </w:p>
+    <w:p>
+      <w:pPr>
+        <w:spacing w:line="360" w:lineRule="auto"/>
+        <w:ind w:left="851"/>
+        <w:contextualSpacing/>
+        <w:jc w:val="both"/>
+        <w:rPr>
+          <w:rFonts w:ascii="Arial" w:hAnsi="Arial" w:cs="Arial"/>
+        </w:rPr>
+      </w:pPr>
+      <w:r>
+        <w:rPr>
+          <w:rFonts w:ascii="Arial" w:hAnsi="Arial" w:cs="Arial"/>
+        </w:rPr>
+        <w:t>Multiple adapter classes are introduced, such as CourseInfoAdapter, StudentInfoAdapter, FinanceAdapter, and HRAdapter, each implementing their corresponding target interfaces (ICourseInfoSystem, IStudentInfoSystem, IFinanceSystem, and IHRSystem). These adapters internally delegate requests to their respective legacy systems. This improves system design quality by reducing coupling between the enrolment system and external systems, increasing flexibility, and enabling seamless integration with legacy components while maintaining a clean separation of concerns.</w:t>
+      </w:r>
+    </w:p>
+    <w:p>
+      <w:pPr>
+        <w:keepNext/>
+        <w:spacing w:after="0" w:line="360" w:lineRule="auto"/>
+        <w:ind w:left="851"/>
+        <w:contextualSpacing/>
+        <w:jc w:val="both"/>
+      </w:pPr>
+      <w:r>
+        <w:rPr>
+          <w:rFonts w:ascii="Arial" w:hAnsi="Arial" w:cs="Arial"/>
+        </w:rPr>
+        <w:drawing>
+          <wp:inline distT="0" distB="0" distL="0" distR="0" wp14:anchorId="7C89D350" wp14:editId="72E9C597">
+            <wp:extent cx="6192421" cy="3040673"/>
+            <wp:effectExtent l="19050" t="19050" r="18415" b="26670"/>
+            <wp:docPr id="379322492" name="Picture 1"/>
+            <wp:cNvGraphicFramePr>
+              <a:graphicFrameLocks xmlns:a="http://schemas.openxmlformats.org/drawingml/2006/main" noChangeAspect="1"/>
+            </wp:cNvGraphicFramePr>
+            <a:graphic xmlns:a="http://schemas.openxmlformats.org/drawingml/2006/main">
+              <a:graphicData uri="http://schemas.openxmlformats.org/drawingml/2006/picture">
+                <pic:pic xmlns:pic="http://schemas.openxmlformats.org/drawingml/2006/picture">
+                  <pic:nvPicPr>
+                    <pic:cNvPr id="379322492" name=""/>
+                    <pic:cNvPicPr/>
+                  </pic:nvPicPr>
+                  <pic:blipFill rotWithShape="1">
+                    <a:blip r:embed="rId19"/>
+                    <a:srcRect l="4701"/>
+                    <a:stretch>
+                      <a:fillRect/>
+                    </a:stretch>
+                  </pic:blipFill>
+                  <pic:spPr bwMode="auto">
+                    <a:xfrm>
+                      <a:off x="0" y="0"/>
+                      <a:ext cx="6217898" cy="3053183"/>
+                    </a:xfrm>
+                    <a:prstGeom prst="rect">
+                      <a:avLst/>
+                    </a:prstGeom>
+                    <a:ln w="9525" cap="flat" cmpd="sng" algn="ctr">
+                      <a:solidFill>
+                        <a:sysClr val="window" lastClr="FFFFFF">
+                          <a:lumMod val="65000"/>
+                        </a:sysClr>
+                      </a:solidFill>
+                      <a:prstDash val="solid"/>
+                      <a:round/>
+                      <a:headEnd type="none" w="med" len="med"/>
+                      <a:tailEnd type="none" w="med" len="med"/>
+                      <a:extLst>
+                        <a:ext uri="{C807C97D-BFC1-408E-A445-0C87EB9F89A2}">
+                          <ask:lineSketchStyleProps xmlns:ask="http://schemas.microsoft.com/office/drawing/2018/sketchyshapes" sd="0">
+                            <a:custGeom>
+                              <a:avLst/>
+                              <a:gdLst/>
+                              <a:ahLst/>
+                              <a:cxnLst/>
+                              <a:rect l="0" t="0" r="0" b="0"/>
+                              <a:pathLst/>
+                            </a:custGeom>
+                            <ask:type/>
+                          </ask:lineSketchStyleProps>
+                        </a:ext>
+                      </a:extLst>
+                    </a:ln>
+                    <a:extLst>
+                      <a:ext uri="{53640926-AAD7-44D8-BBD7-CCE9431645EC}">
+                        <a14:shadowObscured xmlns:a14="http://schemas.microsoft.com/office/drawing/2010/main"/>
+                      </a:ext>
+                    </a:extLst>
+                  </pic:spPr>
+                </pic:pic>
+              </a:graphicData>
+            </a:graphic>
+          </wp:inline>
+        </w:drawing>
+      </w:r>
+    </w:p>
+    <w:p>
+      <w:pPr>
+        <w:pStyle w:val="Caption"/>
+        <w:ind w:left="851"/>
+        <w:jc w:val="both"/>
+        <w:rPr>
+          <w:rFonts w:ascii="Arial" w:hAnsi="Arial" w:cs="Arial"/>
+          <w:b/>
+          <w:bCs/>
+          <w:i w:val="0"/>
+          <w:iCs w:val="0"/>
+          <w:color w:val="215E99" w:themeColor="text2" w:themeTint="BF"/>
+          <w:sz w:val="24"/>
+          <w:szCs w:val="24"/>
+        </w:rPr>
+      </w:pPr>
+      <w:r>
+        <w:rPr>
+          <w:rFonts w:ascii="Arial" w:hAnsi="Arial" w:cs="Arial"/>
+          <w:b/>
+          <w:bCs/>
+          <w:i w:val="0"/>
+          <w:iCs w:val="0"/>
+          <w:color w:val="215E99" w:themeColor="text2" w:themeTint="BF"/>
+          <w:sz w:val="24"/>
+          <w:szCs w:val="24"/>
+        </w:rPr>
+        <w:t xml:space="preserve">Figure </w:t>
+      </w:r>
+      <w:r>
+        <w:rPr>
+          <w:rFonts w:ascii="Arial" w:hAnsi="Arial" w:cs="Arial"/>
+          <w:b/>
+          <w:bCs/>
+          <w:i w:val="0"/>
+          <w:iCs w:val="0"/>
+          <w:color w:val="215E99" w:themeColor="text2" w:themeTint="BF"/>
+          <w:sz w:val="24"/>
+          <w:szCs w:val="24"/>
+        </w:rPr>
+        <w:fldChar w:fldCharType="begin"/>
+      </w:r>
+      <w:r>
+        <w:rPr>
+          <w:rFonts w:ascii="Arial" w:hAnsi="Arial" w:cs="Arial"/>
+          <w:b/>
+          <w:bCs/>
+          <w:i w:val="0"/>
+          <w:iCs w:val="0"/>
+          <w:color w:val="215E99" w:themeColor="text2" w:themeTint="BF"/>
+          <w:sz w:val="24"/>
+          <w:szCs w:val="24"/>
+        </w:rPr>
+        <w:instrText xml:space="preserve"> SEQ Figure \* ARABIC </w:instrText>
+      </w:r>
+      <w:r>
+        <w:rPr>
+          <w:rFonts w:ascii="Arial" w:hAnsi="Arial" w:cs="Arial"/>
+          <w:b/>
+          <w:bCs/>
+          <w:i w:val="0"/>
+          <w:iCs w:val="0"/>
+          <w:color w:val="215E99" w:themeColor="text2" w:themeTint="BF"/>
+          <w:sz w:val="24"/>
+          <w:szCs w:val="24"/>
+        </w:rPr>
+        <w:fldChar w:fldCharType="separate"/>
+      </w:r>
+      <w:r>
+        <w:rPr>
+          <w:rFonts w:ascii="Arial" w:hAnsi="Arial" w:cs="Arial"/>
+          <w:b/>
+          <w:bCs/>
+          <w:i w:val="0"/>
+          <w:iCs w:val="0"/>
+          <w:noProof/>
+          <w:color w:val="215E99" w:themeColor="text2" w:themeTint="BF"/>
+          <w:sz w:val="24"/>
+          <w:szCs w:val="24"/>
+        </w:rPr>
+        <w:t>10</w:t>
+      </w:r>
+      <w:r>
+        <w:rPr>
+          <w:rFonts w:ascii="Arial" w:hAnsi="Arial" w:cs="Arial"/>
+          <w:b/>
+          <w:bCs/>
+          <w:i w:val="0"/>
+          <w:iCs w:val="0"/>
+          <w:color w:val="215E99" w:themeColor="text2" w:themeTint="BF"/>
+          <w:sz w:val="24"/>
+          <w:szCs w:val="24"/>
+        </w:rPr>
+        <w:fldChar w:fldCharType="end"/>
+      </w:r>
+      <w:r>
+        <w:rPr>
+          <w:rFonts w:ascii="Arial" w:hAnsi="Arial" w:cs="Arial"/>
+          <w:b/>
+          <w:bCs/>
+          <w:i w:val="0"/>
+          <w:iCs w:val="0"/>
+          <w:color w:val="215E99" w:themeColor="text2" w:themeTint="BF"/>
+          <w:sz w:val="24"/>
+          <w:szCs w:val="24"/>
+        </w:rPr>
+        <w:t>: Updated class diagram after applying the Adapter pattern (updated components are circled)</w:t>
+      </w:r>
+    </w:p>
+    <w:p>
+      <w:pPr>
+        <w:spacing w:after="0" w:line="360" w:lineRule="auto"/>
         <w:ind w:left="284"/>
         <w:contextualSpacing/>
+        <w:jc w:val="both"/>
+        <w:rPr>
+          <w:rFonts w:ascii="Arial" w:hAnsi="Arial" w:cs="Arial"/>
+        </w:rPr>
+      </w:pPr>
+      <w:r>
+        <w:rPr>
+          <w:rFonts w:ascii="Arial" w:hAnsi="Arial" w:cs="Arial"/>
+        </w:rPr>
+        <w:lastRenderedPageBreak/>
+        <w:t>These patterns address key architectural concerns in the system, including object creation, controlled access to shared services, and integration with external legacy systems. The Factory Method pattern improves flexibility and extensibility in user and staff creation. The Singleton pattern ensures a single, consistent instance of the AuditService for system-wide logging. The Adapter pattern enables seamless communication with multiple external systems without modifying their original implementations.</w:t>
+      </w:r>
+    </w:p>
+    <w:p>
+      <w:pPr>
+        <w:spacing w:after="0" w:line="360" w:lineRule="auto"/>
+        <w:ind w:left="284"/>
+        <w:contextualSpacing/>
+        <w:jc w:val="both"/>
+        <w:rPr>
+          <w:rFonts w:ascii="Arial" w:hAnsi="Arial" w:cs="Arial"/>
+        </w:rPr>
+      </w:pPr>
+      <w:r>
+        <w:rPr>
+          <w:rFonts w:ascii="Arial" w:hAnsi="Arial" w:cs="Arial"/>
+        </w:rPr>
+        <w:t>Together, these patterns improve the system architecture by reducing coupling, increasing modularity, and enhancing separation of concerns. This results in a more maintainable, scalable, and robust system that follows key object-oriented design principles.</w:t>
+      </w:r>
+    </w:p>
+    <w:p>
+      <w:pPr>
+        <w:keepNext/>
+        <w:spacing w:after="0" w:line="360" w:lineRule="auto"/>
+        <w:ind w:left="-1418"/>
+        <w:contextualSpacing/>
+        <w:jc w:val="both"/>
+      </w:pPr>
+      <w:r>
+        <w:rPr>
+          <w:rFonts w:ascii="Arial" w:hAnsi="Arial" w:cs="Arial"/>
+          <w:noProof/>
+        </w:rPr>
+        <w:drawing>
+          <wp:inline distT="0" distB="0" distL="0" distR="0" wp14:anchorId="467B97C1" wp14:editId="242B45C7">
+            <wp:extent cx="7697079" cy="4654430"/>
+            <wp:effectExtent l="19050" t="19050" r="18415" b="13335"/>
+            <wp:docPr id="338890152" name="Picture 8"/>
+            <wp:cNvGraphicFramePr>
+              <a:graphicFrameLocks xmlns:a="http://schemas.openxmlformats.org/drawingml/2006/main" noChangeAspect="1"/>
+            </wp:cNvGraphicFramePr>
+            <a:graphic xmlns:a="http://schemas.openxmlformats.org/drawingml/2006/main">
+              <a:graphicData uri="http://schemas.openxmlformats.org/drawingml/2006/picture">
+                <pic:pic xmlns:pic="http://schemas.openxmlformats.org/drawingml/2006/picture">
+                  <pic:nvPicPr>
+                    <pic:cNvPr id="0" name="Picture 8"/>
+                    <pic:cNvPicPr>
+                      <a:picLocks noChangeAspect="1" noChangeArrowheads="1"/>
+                    </pic:cNvPicPr>
+                  </pic:nvPicPr>
+                  <pic:blipFill>
+                    <a:blip r:embed="rId20">
+                      <a:extLst>
+                        <a:ext uri="{28A0092B-C50C-407E-A947-70E740481C1C}">
+                          <a14:useLocalDpi xmlns:a14="http://schemas.microsoft.com/office/drawing/2010/main" val="0"/>
+                        </a:ext>
+                      </a:extLst>
+                    </a:blip>
+                    <a:srcRect/>
+                    <a:stretch>
+                      <a:fillRect/>
+                    </a:stretch>
+                  </pic:blipFill>
+                  <pic:spPr bwMode="auto">
+                    <a:xfrm>
+                      <a:off x="0" y="0"/>
+                      <a:ext cx="7712655" cy="4663849"/>
+                    </a:xfrm>
+                    <a:prstGeom prst="rect">
+                      <a:avLst/>
+                    </a:prstGeom>
+                    <a:noFill/>
+                    <a:ln>
+                      <a:solidFill>
+                        <a:schemeClr val="bg1">
+                          <a:lumMod val="65000"/>
+                        </a:schemeClr>
+                      </a:solidFill>
+                    </a:ln>
+                  </pic:spPr>
+                </pic:pic>
+              </a:graphicData>
+            </a:graphic>
+          </wp:inline>
+        </w:drawing>
+      </w:r>
+    </w:p>
+    <w:p>
+      <w:pPr>
+        <w:pStyle w:val="Caption"/>
+        <w:ind w:left="284"/>
         <w:jc w:val="both"/>
         <w:rPr>
           <w:rFonts w:ascii="Arial" w:eastAsiaTheme="majorEastAsia" w:hAnsi="Arial" w:cs="Arial"/>
@@ -3440,8 +4307,107 @@
       <w:r>
         <w:rPr>
           <w:rFonts w:ascii="Arial" w:hAnsi="Arial" w:cs="Arial"/>
-        </w:rPr>
-        <w:t>.</w:t>
+          <w:b/>
+          <w:bCs/>
+          <w:i w:val="0"/>
+          <w:iCs w:val="0"/>
+          <w:color w:val="215E99" w:themeColor="text2" w:themeTint="BF"/>
+          <w:sz w:val="24"/>
+          <w:szCs w:val="24"/>
+        </w:rPr>
+        <w:t xml:space="preserve">Figure </w:t>
+      </w:r>
+      <w:r>
+        <w:rPr>
+          <w:rFonts w:ascii="Arial" w:hAnsi="Arial" w:cs="Arial"/>
+          <w:b/>
+          <w:bCs/>
+          <w:i w:val="0"/>
+          <w:iCs w:val="0"/>
+          <w:color w:val="215E99" w:themeColor="text2" w:themeTint="BF"/>
+          <w:sz w:val="24"/>
+          <w:szCs w:val="24"/>
+        </w:rPr>
+        <w:fldChar w:fldCharType="begin"/>
+      </w:r>
+      <w:r>
+        <w:rPr>
+          <w:rFonts w:ascii="Arial" w:hAnsi="Arial" w:cs="Arial"/>
+          <w:b/>
+          <w:bCs/>
+          <w:i w:val="0"/>
+          <w:iCs w:val="0"/>
+          <w:color w:val="215E99" w:themeColor="text2" w:themeTint="BF"/>
+          <w:sz w:val="24"/>
+          <w:szCs w:val="24"/>
+        </w:rPr>
+        <w:instrText xml:space="preserve"> SEQ Figure \* ARABIC </w:instrText>
+      </w:r>
+      <w:r>
+        <w:rPr>
+          <w:rFonts w:ascii="Arial" w:hAnsi="Arial" w:cs="Arial"/>
+          <w:b/>
+          <w:bCs/>
+          <w:i w:val="0"/>
+          <w:iCs w:val="0"/>
+          <w:color w:val="215E99" w:themeColor="text2" w:themeTint="BF"/>
+          <w:sz w:val="24"/>
+          <w:szCs w:val="24"/>
+        </w:rPr>
+        <w:fldChar w:fldCharType="separate"/>
+      </w:r>
+      <w:r>
+        <w:rPr>
+          <w:rFonts w:ascii="Arial" w:hAnsi="Arial" w:cs="Arial"/>
+          <w:b/>
+          <w:bCs/>
+          <w:i w:val="0"/>
+          <w:iCs w:val="0"/>
+          <w:noProof/>
+          <w:color w:val="215E99" w:themeColor="text2" w:themeTint="BF"/>
+          <w:sz w:val="24"/>
+          <w:szCs w:val="24"/>
+        </w:rPr>
+        <w:t>11</w:t>
+      </w:r>
+      <w:r>
+        <w:rPr>
+          <w:rFonts w:ascii="Arial" w:hAnsi="Arial" w:cs="Arial"/>
+          <w:b/>
+          <w:bCs/>
+          <w:i w:val="0"/>
+          <w:iCs w:val="0"/>
+          <w:color w:val="215E99" w:themeColor="text2" w:themeTint="BF"/>
+          <w:sz w:val="24"/>
+          <w:szCs w:val="24"/>
+        </w:rPr>
+        <w:fldChar w:fldCharType="end"/>
+      </w:r>
+      <w:r>
+        <w:rPr>
+          <w:rFonts w:ascii="Arial" w:hAnsi="Arial" w:cs="Arial"/>
+          <w:b/>
+          <w:bCs/>
+          <w:i w:val="0"/>
+          <w:iCs w:val="0"/>
+          <w:color w:val="215E99" w:themeColor="text2" w:themeTint="BF"/>
+          <w:sz w:val="24"/>
+          <w:szCs w:val="24"/>
+        </w:rPr>
+        <w:t xml:space="preserve">: </w:t>
+      </w:r>
+      <w:r>
+        <w:rPr>
+          <w:rFonts w:ascii="Arial" w:hAnsi="Arial" w:cs="Arial"/>
+          <w:b/>
+          <w:bCs/>
+          <w:i w:val="0"/>
+          <w:iCs w:val="0"/>
+          <w:color w:val="215E99" w:themeColor="text2" w:themeTint="BF"/>
+          <w:sz w:val="24"/>
+          <w:szCs w:val="24"/>
+        </w:rPr>
+        <w:t>Complete Course Enrolment Class Diagram after applying GoF Design Patterns</w:t>
       </w:r>
       <w:r>
         <w:rPr>
@@ -3470,7 +4436,7 @@
           <w:szCs w:val="32"/>
         </w:rPr>
       </w:pPr>
-      <w:bookmarkStart w:id="5" w:name="_Toc229061204"/>
+      <w:bookmarkStart w:id="8" w:name="_Toc231032925"/>
       <w:r>
         <w:rPr>
           <w:rFonts w:ascii="Arial" w:hAnsi="Arial" w:cs="Arial"/>
@@ -3483,7 +4449,7 @@
         <w:lastRenderedPageBreak/>
         <w:t>Comparative Design Analysis</w:t>
       </w:r>
-      <w:bookmarkEnd w:id="5"/>
+      <w:bookmarkEnd w:id="8"/>
     </w:p>
     <w:p>
       <w:pPr>
@@ -3530,7 +4496,7 @@
           <w:szCs w:val="32"/>
         </w:rPr>
       </w:pPr>
-      <w:bookmarkStart w:id="6" w:name="_Toc229061205"/>
+      <w:bookmarkStart w:id="9" w:name="_Toc231032926"/>
       <w:r>
         <w:rPr>
           <w:rFonts w:ascii="Arial" w:hAnsi="Arial" w:cs="Arial"/>
@@ -3543,7 +4509,7 @@
         <w:lastRenderedPageBreak/>
         <w:t>Conclusion</w:t>
       </w:r>
-      <w:bookmarkEnd w:id="6"/>
+      <w:bookmarkEnd w:id="9"/>
     </w:p>
     <w:p>
       <w:pPr>
@@ -3609,7 +4575,7 @@
           <w:szCs w:val="32"/>
         </w:rPr>
       </w:pPr>
-      <w:bookmarkStart w:id="7" w:name="_Toc229061206"/>
+      <w:bookmarkStart w:id="10" w:name="_Toc231032927"/>
       <w:r>
         <w:rPr>
           <w:rFonts w:ascii="Arial" w:hAnsi="Arial" w:cs="Arial"/>
@@ -3622,7 +4588,7 @@
         <w:lastRenderedPageBreak/>
         <w:t>References</w:t>
       </w:r>
-      <w:bookmarkEnd w:id="7"/>
+      <w:bookmarkEnd w:id="10"/>
     </w:p>
     <w:p>
       <w:pPr>
@@ -3660,7 +4626,7 @@
       </w:pPr>
     </w:p>
     <w:sectPr>
-      <w:footerReference w:type="default" r:id="rId17"/>
+      <w:footerReference w:type="default" r:id="rId21"/>
       <w:type w:val="continuous"/>
       <w:pgSz w:w="12240" w:h="15840"/>
       <w:pgMar w:top="1440" w:right="1440" w:bottom="1440" w:left="1440" w:header="708" w:footer="708" w:gutter="0"/>

</xml_diff>